<commit_message>
No equation-number references in text, notes or letters (sample style)
Co-Authored-By: Claude Opus 5.5 <noreply@anthropic.com>
Claude-Session: https://claude.ai/code/session_01Ny4MKFPCnQG8RbtvfHQ86Z
</commit_message>
<xml_diff>
--- a/SAJE_292892_revision/build_r4/02_Manuscript_Revised_Marked_blue.docx
+++ b/SAJE_292892_revision/build_r4/02_Manuscript_Revised_Marked_blue.docx
@@ -1881,7 +1881,7 @@
         <w:rPr>
           <w:color w:val="0000FF"/>
         </w:rPr>
-        <w:t>Assumption (2) concerns changes in outcomes, so level differences between scored and never-scored firms do not violate it, but a different growth path before coverage would.</w:t>
+        <w:t>This assumption concerns changes in outcomes, so level differences between scored and never-scored firms do not violate it, but a different growth path before coverage would.</w:t>
       </w:r>
     </w:p>
     <w:p>
@@ -1904,7 +1904,7 @@
         <w:rPr>
           <w:color w:val="0000FF"/>
         </w:rPr>
-        <w:t>Two arguments make assumption (2) plausible in parts of the sample, and one argues against it.</w:t>
+        <w:t>Two arguments make it plausible in parts of the sample, and one argues against it.</w:t>
       </w:r>
       <w:r>
         <w:rPr/>
@@ -1944,7 +1944,7 @@
         <w:rPr>
           <w:color w:val="0000FF"/>
         </w:rPr>
-        <w:t>We therefore treat the post-coverage estimates as conditional on assumption (2) and give most weight to evidence that does not depend on it: the ordering of growth and entry, and the contrast between waves with and without a run-up.</w:t>
+        <w:t>We therefore treat the post-coverage estimates as conditional on the parallel trends assumption and give most weight to evidence that does not depend on it: the ordering of growth and entry, and the contrast between waves with and without a run-up.</w:t>
       </w:r>
     </w:p>
     <w:p>
@@ -3153,7 +3153,7 @@
         <w:rPr>
           <w:color w:val="0000FF"/>
         </w:rPr>
-        <w:t>Because the pre-coverage estimates cast doubt on assumption (2), we add three exploratory checks.</w:t>
+        <w:t>Because the pre-coverage estimates cast doubt on the parallel trends assumption, we add three exploratory checks.</w:t>
       </w:r>
       <w:r>
         <w:rPr/>
@@ -3196,7 +3196,7 @@
         <w:rPr>
           <w:color w:val="0000FF"/>
         </w:rPr>
-        <w:t>Let δ(e) denote the post-coverage violation of assumption (2) in event year e; we assume</w:t>
+        <w:t>Let δ(e) denote the post-coverage violation of the parallel trends assumption in event year e; we assume</w:t>
       </w:r>
     </w:p>
     <w:p>
@@ -3812,7 +3812,7 @@
         <w:rPr>
           <w:color w:val="0000FF"/>
         </w:rPr>
-        <w:t>They add not-yet-scored firms to the controls (R1), drop the covariates (R2), exclude the 2020 and 2021 cohorts (R3), keep only control firms whose base-year log total assets reach the 10th percentile among scored firms of the same cohort (R4), date coverage three years early as a placebo (R5), and estimate Eq. (8) (R6).</w:t>
+        <w:t>They add not-yet-scored firms to the controls (R1), drop the covariates (R2), exclude the 2020 and 2021 cohorts (R3), keep only control firms whose base-year log total assets reach the 10th percentile among scored firms of the same cohort (R4), date coverage three years early as a placebo (R5), and estimate the TWFE regression (R6).</w:t>
       </w:r>
       <w:r>
         <w:rPr/>
@@ -4990,7 +4990,7 @@
         <w:rPr>
           <w:color w:val="0000FF"/>
         </w:rPr>
-        <w:t>Figure 1 plots the event-time estimates of Eq. (5).</w:t>
+        <w:t>Figure 1 plots the event-time estimates.</w:t>
       </w:r>
       <w:r>
         <w:rPr/>
@@ -5040,7 +5040,7 @@
         <w:rPr>
           <w:color w:val="0000FF"/>
         </w:rPr>
-        <w:t>After the first recorded score, the MTB estimates for event years 0 to 3 lie between −0.044 and 0.017, and none differs from zero at the 5% level; event year 4 rests on only 141 scored firms and is excluded from Eq. (6).</w:t>
+        <w:t>After the first recorded score, the MTB estimates for event years 0 to 3 lie between −0.044 and 0.017, and none differs from zero at the 5% level; event year 4 rests on only 141 scored firms and is excluded from the headline estimate.</w:t>
       </w:r>
       <w:r>
         <w:rPr/>
@@ -5060,7 +5060,7 @@
         <w:rPr>
           <w:color w:val="0000FF"/>
         </w:rPr>
-        <w:t>Only reading the post-coverage part as an effect of coverage depends on assumption (2).</w:t>
+        <w:t>Only reading the post-coverage part as an effect of coverage depends on the parallel trends assumption.</w:t>
       </w:r>
     </w:p>
     <w:p>
@@ -5279,7 +5279,7 @@
           <w:color w:val="0000FF"/>
           <w:sz w:val="24"/>
         </w:rPr>
-        <w:t>5.3 Average Change After Entry Under Assumption (2)</w:t>
+        <w:t>5.3 Average Change After Entry Under Parallel Trends</w:t>
       </w:r>
     </w:p>
     <w:p>
@@ -5289,8 +5289,14 @@
         <w:jc w:val="both"/>
       </w:pPr>
       <w:r>
+        <w:rPr>
+          <w:color w:val="0000FF"/>
+        </w:rPr>
+        <w:t>Table 2 reports the headline estimates.</w:t>
+      </w:r>
+      <w:r>
         <w:rPr/>
-        <w:t xml:space="preserve">Table 2 reports the headline estimates of Eq. (6). </w:t>
+        <w:t xml:space="preserve"> </w:t>
       </w:r>
       <w:r>
         <w:rPr>
@@ -5336,7 +5342,7 @@
           <w:color w:val="0000FF"/>
           <w:sz w:val="22"/>
         </w:rPr>
-        <w:t>Average change after the first recorded LSEG ESG score over event years 0 to 3, under assumption (2)</w:t>
+        <w:t>Average change after the first recorded LSEG ESG score over event years 0 to 3, under parallel trends</w:t>
       </w:r>
     </w:p>
     <w:tbl>
@@ -10425,7 +10431,7 @@
         <w:rPr>
           <w:color w:val="0000FF"/>
         </w:rPr>
-        <w:t>Under the bounds of Eq. (7) (Table S7), with M̄ = 0.25 the interval for the MTB effect is −0.071 to 0.073, and any departure with M̄ above 0.01 admits a 5% increase.</w:t>
+        <w:t>Under the relative-magnitude bounds (Table S7), with M̄ = 0.25 the interval for the MTB effect is −0.071 to 0.073, and any departure with M̄ above 0.01 admits a 5% increase.</w:t>
       </w:r>
       <w:r>
         <w:rPr/>
@@ -14227,7 +14233,7 @@
         <w:rPr>
           <w:color w:val="0000FF"/>
         </w:rPr>
-        <w:t>The pooled estimate weights cohorts and event years by the number of scored firms in each cell (Eq. 6).</w:t>
+        <w:t>The pooled estimate weights cohorts and event years by the number of scored firms in each cell.</w:t>
       </w:r>
       <w:r>
         <w:rPr/>
@@ -14257,7 +14263,7 @@
         <w:rPr>
           <w:color w:val="0000FF"/>
         </w:rPr>
-        <w:t>Under assumption (2), the largest increase compatible with the headline interval is of the same order as the announcement return of 4.86% that Demiroglu and Ryngaert (2010) report for the first analyst coverage of neglected stocks, and because annual ratios miss short-lived price pressure, our estimates concern lasting revaluation (Chen et al., 2004).</w:t>
+        <w:t>Under the parallel trends assumption, the largest increase compatible with the headline interval is of the same order as the announcement return of 4.86% that Demiroglu and Ryngaert (2010) report for the first analyst coverage of neglected stocks, and because annual ratios miss short-lived price pressure, our estimates concern lasting revaluation (Chen et al., 2004).</w:t>
       </w:r>
     </w:p>
     <w:p>
@@ -14324,7 +14330,7 @@
         <w:rPr>
           <w:color w:val="0000FF"/>
         </w:rPr>
-        <w:t>Either way, entry marks the end of a period of relative growth, not a random draw, and this finding does not rest on assumption (2) or on the dating of publication.</w:t>
+        <w:t>Either way, entry marks the end of a period of relative growth, not a random draw, and this finding does not rest on the parallel trends assumption or on the dating of publication.</w:t>
       </w:r>
     </w:p>
     <w:p>
@@ -14418,7 +14424,7 @@
         <w:rPr>
           <w:color w:val="0000FF"/>
         </w:rPr>
-        <w:t>Recognition predicts a lasting gain for every newly scored firm; we detect none under assumption (2), but without ownership, trading, or fund-holding data we cannot tell whether recognition did not increase or whether it increased without moving prices.</w:t>
+        <w:t>Recognition predicts a lasting gain for every newly scored firm; we detect none under parallel trends, but without ownership, trading, or fund-holding data we cannot tell whether recognition did not increase or whether it increased without moving prices.</w:t>
       </w:r>
       <w:r>
         <w:rPr/>

</xml_diff>

<commit_message>
Round-3 Seat 2 fixes: listed firm-years for missing shares, reference-year step wording, control-firm columns; deliverables_round3
Co-Authored-By: Claude Opus 5.5 <noreply@anthropic.com>
Claude-Session: https://claude.ai/code/session_01Ny4MKFPCnQG8RbtvfHQ86Z
</commit_message>
<xml_diff>
--- a/SAJE_292892_revision/build_r4/02_Manuscript_Revised_Marked_blue.docx
+++ b/SAJE_292892_revision/build_r4/02_Manuscript_Revised_Marked_blue.docx
@@ -78,7 +78,7 @@
         <w:rPr>
           <w:color w:val="0000FF"/>
         </w:rPr>
-        <w:t>Scored firms are larger, and on average their market-to-book ratio had grown 10.0% more than that of similar firms over the five years before the first recorded score, a run-up not detected in a broad Malaysian wave.</w:t>
+        <w:t>Scored firms are larger, and on average their market-to-book ratio had grown 10.0% more than that of similar firms in the years before their first recorded score, a run-up not detected in a broad Malaysian wave.</w:t>
       </w:r>
       <w:r>
         <w:rPr/>
@@ -357,7 +357,7 @@
         <w:rPr>
           <w:color w:val="0000FF"/>
         </w:rPr>
-        <w:t>Most of this difference arises because the later dating measures valuations from the first recorded year, the high point of the relative MTB path, and the decline appears only in the waves that had a run-up.</w:t>
+        <w:t>Most of this difference arises because the later dating measures valuations from the first recorded year, after the cohorts' own rise in that year, and the decline appears only in the waves that had a run-up.</w:t>
       </w:r>
       <w:r>
         <w:rPr/>
@@ -883,7 +883,7 @@
         <w:rPr>
           <w:color w:val="0000FF"/>
         </w:rPr>
-        <w:t>The data combine the annual LSEG ESG score (LSEG, 2025), not the controversy-adjusted combined score, with accounting and market data from Compustat Global (S&amp;P Global Market Intelligence, 2025) for 3,709 listed firms (40,799 firm-years from 2014 to 2024).</w:t>
+        <w:t>The data combine the annual LSEG ESG score (LSEG, 2025), not the controversy-adjusted combined score, with accounting and market data from Compustat Global (S&amp;P Global Market Intelligence, 2025) for 3,709 listed firms, each with a row for every year from 2014 to 2024; rows before a firm lists carry no data (3,647 rows).</w:t>
       </w:r>
       <w:r>
         <w:rPr/>
@@ -893,7 +893,7 @@
         <w:rPr>
           <w:color w:val="0000FF"/>
         </w:rPr>
-        <w:t>Firms enter the panel when they list, but every firm in the extract has data in 2024, so firms that delisted between 2014 and 2023 are absent from both the scored and the never-scored groups.</w:t>
+        <w:t>Every firm in the extract has data in 2024, so firms that delisted between 2014 and 2023 are absent from both the scored and the never-scored groups.</w:t>
       </w:r>
       <w:r>
         <w:rPr/>
@@ -940,13 +940,13 @@
       </w:r>
       <w:r>
         <w:rPr/>
-        <w:t xml:space="preserve"> Excluding the 135 firms scored in 2014, which have no pre-coverage year, leaves 3,288 firms and 36,168 firm-years: 675 firms first scored between 2015 and 2024 and 2,613 never-scored firms. </w:t>
+        <w:t xml:space="preserve"> </w:t>
       </w:r>
       <w:r>
         <w:rPr>
           <w:color w:val="0000FF"/>
         </w:rPr>
-        <w:t>A firm-year enters an estimate only if its outcome is observed in both the base year and the comparison year (Tables S2 and S3 of the supplementary material).</w:t>
+        <w:t>Excluding the 135 firms scored in 2014, which have no pre-coverage year, leaves 3,288 firms with 32,521 listed firm-years: 675 firms first scored between 2015 and 2024 and 2,613 never-scored firms.</w:t>
       </w:r>
       <w:r>
         <w:rPr/>
@@ -956,7 +956,7 @@
         <w:rPr>
           <w:color w:val="0000FF"/>
         </w:rPr>
-        <w:t>The source data contain no MTB ratio at or below zero, so firm-years with negative book equity appear as missing, like firm-years without market or accounting data.</w:t>
+        <w:t>A firm-year enters an estimate only if its outcome is observed in both the base year and the comparison year (Tables S2 and S3 of the supplementary material).</w:t>
       </w:r>
       <w:r>
         <w:rPr/>
@@ -966,7 +966,17 @@
         <w:rPr>
           <w:color w:val="0000FF"/>
         </w:rPr>
-        <w:t>Log MTB ratios are missing for 28.0% of never-scored and 12.7% of scored firm-years.</w:t>
+        <w:t>The source data contain no MTB ratio at or below zero, so firm-years with negative book equity appear as missing, like firm-years without market or accounting data.</w:t>
+      </w:r>
+      <w:r>
+        <w:rPr/>
+        <w:t xml:space="preserve"> </w:t>
+      </w:r>
+      <w:r>
+        <w:rPr>
+          <w:color w:val="0000FF"/>
+        </w:rPr>
+        <w:t>Log MTB ratios are missing for 18.5% of never-scored and 9.0% of scored listed firm-years.</w:t>
       </w:r>
     </w:p>
     <w:p>
@@ -9063,10 +9073,11 @@
         <w:tblLook w:firstColumn="1" w:firstRow="1" w:lastColumn="0" w:lastRow="0" w:noHBand="0" w:noVBand="1" w:val="04A0"/>
       </w:tblPr>
       <w:tblGrid>
-        <w:gridCol w:w="4752"/>
+        <w:gridCol w:w="3960"/>
+        <w:gridCol w:w="1512"/>
         <w:gridCol w:w="1655"/>
-        <w:gridCol w:w="1800"/>
         <w:gridCol w:w="1152"/>
+        <w:gridCol w:w="1080"/>
       </w:tblGrid>
       <w:tr>
         <w:trPr>
@@ -9075,7 +9086,7 @@
         </w:trPr>
         <w:tc>
           <w:tcPr>
-            <w:tcW w:type="dxa" w:w="4752"/>
+            <w:tcW w:type="dxa" w:w="3960"/>
             <w:tcBorders>
               <w:top w:val="single" w:sz="6" w:color="000000"/>
               <w:bottom w:val="single" w:sz="6" w:color="000000"/>
@@ -9094,6 +9105,31 @@
                 <w:sz w:val="18"/>
               </w:rPr>
               <w:t>Specification</w:t>
+            </w:r>
+          </w:p>
+        </w:tc>
+        <w:tc>
+          <w:tcPr>
+            <w:tcW w:type="dxa" w:w="1512"/>
+            <w:tcBorders>
+              <w:top w:val="single" w:sz="6" w:color="000000"/>
+              <w:bottom w:val="single" w:sz="6" w:color="000000"/>
+            </w:tcBorders>
+          </w:tcPr>
+          <w:p>
+            <w:pPr>
+              <w:keepNext/>
+              <w:spacing w:after="0" w:line="240" w:lineRule="auto"/>
+              <w:jc w:val="center"/>
+            </w:pPr>
+            <w:r/>
+            <w:r>
+              <w:rPr>
+                <w:b/>
+                <w:color w:val="0000FF"/>
+                <w:sz w:val="18"/>
+              </w:rPr>
+              <w:t>ln(MTB)</w:t>
             </w:r>
           </w:p>
         </w:tc>
@@ -9118,31 +9154,6 @@
                 <w:color w:val="0000FF"/>
                 <w:sz w:val="18"/>
               </w:rPr>
-              <w:t>ln(MTB)</w:t>
-            </w:r>
-          </w:p>
-        </w:tc>
-        <w:tc>
-          <w:tcPr>
-            <w:tcW w:type="dxa" w:w="1800"/>
-            <w:tcBorders>
-              <w:top w:val="single" w:sz="6" w:color="000000"/>
-              <w:bottom w:val="single" w:sz="6" w:color="000000"/>
-            </w:tcBorders>
-          </w:tcPr>
-          <w:p>
-            <w:pPr>
-              <w:keepNext/>
-              <w:spacing w:after="0" w:line="240" w:lineRule="auto"/>
-              <w:jc w:val="center"/>
-            </w:pPr>
-            <w:r/>
-            <w:r>
-              <w:rPr>
-                <w:b/>
-                <w:color w:val="0000FF"/>
-                <w:sz w:val="18"/>
-              </w:rPr>
               <w:t>ln(market cap)</w:t>
             </w:r>
           </w:p>
@@ -9172,6 +9183,31 @@
             </w:r>
           </w:p>
         </w:tc>
+        <w:tc>
+          <w:tcPr>
+            <w:tcW w:type="dxa" w:w="1080"/>
+            <w:tcBorders>
+              <w:top w:val="single" w:sz="6" w:color="000000"/>
+              <w:bottom w:val="single" w:sz="6" w:color="000000"/>
+            </w:tcBorders>
+          </w:tcPr>
+          <w:p>
+            <w:pPr>
+              <w:keepNext/>
+              <w:spacing w:after="0" w:line="240" w:lineRule="auto"/>
+              <w:jc w:val="center"/>
+            </w:pPr>
+            <w:r/>
+            <w:r>
+              <w:rPr>
+                <w:b/>
+                <w:color w:val="0000FF"/>
+                <w:sz w:val="18"/>
+              </w:rPr>
+              <w:t>Control firms</w:t>
+            </w:r>
+          </w:p>
+        </w:tc>
       </w:tr>
       <w:tr>
         <w:trPr>
@@ -9179,7 +9215,7 @@
         </w:trPr>
         <w:tc>
           <w:tcPr>
-            <w:tcW w:type="dxa" w:w="4752"/>
+            <w:tcW w:type="dxa" w:w="3960"/>
           </w:tcPr>
           <w:p>
             <w:pPr>
@@ -9194,6 +9230,36 @@
                 <w:sz w:val="18"/>
               </w:rPr>
               <w:t>(1) First recorded year g, reference g − 1, event years 0 to 3, all firms</w:t>
+            </w:r>
+          </w:p>
+        </w:tc>
+        <w:tc>
+          <w:tcPr>
+            <w:tcW w:type="dxa" w:w="1512"/>
+          </w:tcPr>
+          <w:p>
+            <w:pPr>
+              <w:keepNext/>
+              <w:spacing w:after="0" w:line="240" w:lineRule="auto"/>
+              <w:jc w:val="center"/>
+            </w:pPr>
+            <w:r/>
+            <w:r>
+              <w:rPr>
+                <w:color w:val="0000FF"/>
+                <w:sz w:val="18"/>
+              </w:rPr>
+              <w:t>0.002</w:t>
+            </w:r>
+            <w:r>
+              <w:br/>
+            </w:r>
+            <w:r>
+              <w:rPr>
+                <w:color w:val="0000FF"/>
+                <w:sz w:val="18"/>
+              </w:rPr>
+              <w:t>(0.024)</w:t>
             </w:r>
           </w:p>
         </w:tc>
@@ -9213,36 +9279,6 @@
                 <w:color w:val="0000FF"/>
                 <w:sz w:val="18"/>
               </w:rPr>
-              <w:t>0.002</w:t>
-            </w:r>
-            <w:r>
-              <w:br/>
-            </w:r>
-            <w:r>
-              <w:rPr>
-                <w:color w:val="0000FF"/>
-                <w:sz w:val="18"/>
-              </w:rPr>
-              <w:t>(0.024)</w:t>
-            </w:r>
-          </w:p>
-        </w:tc>
-        <w:tc>
-          <w:tcPr>
-            <w:tcW w:type="dxa" w:w="1800"/>
-          </w:tcPr>
-          <w:p>
-            <w:pPr>
-              <w:keepNext/>
-              <w:spacing w:after="0" w:line="240" w:lineRule="auto"/>
-              <w:jc w:val="center"/>
-            </w:pPr>
-            <w:r/>
-            <w:r>
-              <w:rPr>
-                <w:color w:val="0000FF"/>
-                <w:sz w:val="18"/>
-              </w:rPr>
               <w:t>−0.055*</w:t>
             </w:r>
             <w:r>
@@ -9277,6 +9313,26 @@
             </w:r>
           </w:p>
         </w:tc>
+        <w:tc>
+          <w:tcPr>
+            <w:tcW w:type="dxa" w:w="1080"/>
+          </w:tcPr>
+          <w:p>
+            <w:pPr>
+              <w:keepNext/>
+              <w:spacing w:after="0" w:line="240" w:lineRule="auto"/>
+              <w:jc w:val="center"/>
+            </w:pPr>
+            <w:r/>
+            <w:r>
+              <w:rPr>
+                <w:color w:val="0000FF"/>
+                <w:sz w:val="18"/>
+              </w:rPr>
+              <w:t>2,412</w:t>
+            </w:r>
+          </w:p>
+        </w:tc>
       </w:tr>
       <w:tr>
         <w:trPr>
@@ -9284,7 +9340,7 @@
         </w:trPr>
         <w:tc>
           <w:tcPr>
-            <w:tcW w:type="dxa" w:w="4752"/>
+            <w:tcW w:type="dxa" w:w="3960"/>
           </w:tcPr>
           <w:p>
             <w:pPr>
@@ -9299,6 +9355,36 @@
                 <w:sz w:val="18"/>
               </w:rPr>
               <w:t>(2) As (1), firms observed in both g − 1 and g</w:t>
+            </w:r>
+          </w:p>
+        </w:tc>
+        <w:tc>
+          <w:tcPr>
+            <w:tcW w:type="dxa" w:w="1512"/>
+          </w:tcPr>
+          <w:p>
+            <w:pPr>
+              <w:keepNext/>
+              <w:spacing w:after="0" w:line="240" w:lineRule="auto"/>
+              <w:jc w:val="center"/>
+            </w:pPr>
+            <w:r/>
+            <w:r>
+              <w:rPr>
+                <w:color w:val="0000FF"/>
+                <w:sz w:val="18"/>
+              </w:rPr>
+              <w:t>−0.003</w:t>
+            </w:r>
+            <w:r>
+              <w:br/>
+            </w:r>
+            <w:r>
+              <w:rPr>
+                <w:color w:val="0000FF"/>
+                <w:sz w:val="18"/>
+              </w:rPr>
+              <w:t>(0.024)</w:t>
             </w:r>
           </w:p>
         </w:tc>
@@ -9318,36 +9404,6 @@
                 <w:color w:val="0000FF"/>
                 <w:sz w:val="18"/>
               </w:rPr>
-              <w:t>−0.003</w:t>
-            </w:r>
-            <w:r>
-              <w:br/>
-            </w:r>
-            <w:r>
-              <w:rPr>
-                <w:color w:val="0000FF"/>
-                <w:sz w:val="18"/>
-              </w:rPr>
-              <w:t>(0.024)</w:t>
-            </w:r>
-          </w:p>
-        </w:tc>
-        <w:tc>
-          <w:tcPr>
-            <w:tcW w:type="dxa" w:w="1800"/>
-          </w:tcPr>
-          <w:p>
-            <w:pPr>
-              <w:keepNext/>
-              <w:spacing w:after="0" w:line="240" w:lineRule="auto"/>
-              <w:jc w:val="center"/>
-            </w:pPr>
-            <w:r/>
-            <w:r>
-              <w:rPr>
-                <w:color w:val="0000FF"/>
-                <w:sz w:val="18"/>
-              </w:rPr>
               <w:t>−0.055*</w:t>
             </w:r>
             <w:r>
@@ -9382,6 +9438,26 @@
             </w:r>
           </w:p>
         </w:tc>
+        <w:tc>
+          <w:tcPr>
+            <w:tcW w:type="dxa" w:w="1080"/>
+          </w:tcPr>
+          <w:p>
+            <w:pPr>
+              <w:keepNext/>
+              <w:spacing w:after="0" w:line="240" w:lineRule="auto"/>
+              <w:jc w:val="center"/>
+            </w:pPr>
+            <w:r/>
+            <w:r>
+              <w:rPr>
+                <w:color w:val="0000FF"/>
+                <w:sz w:val="18"/>
+              </w:rPr>
+              <w:t>2,405</w:t>
+            </w:r>
+          </w:p>
+        </w:tc>
       </w:tr>
       <w:tr>
         <w:trPr>
@@ -9389,7 +9465,7 @@
         </w:trPr>
         <w:tc>
           <w:tcPr>
-            <w:tcW w:type="dxa" w:w="4752"/>
+            <w:tcW w:type="dxa" w:w="3960"/>
           </w:tcPr>
           <w:p>
             <w:pPr>
@@ -9404,6 +9480,36 @@
                 <w:sz w:val="18"/>
               </w:rPr>
               <w:t>(3) As (2), event years 1 to 4</w:t>
+            </w:r>
+          </w:p>
+        </w:tc>
+        <w:tc>
+          <w:tcPr>
+            <w:tcW w:type="dxa" w:w="1512"/>
+          </w:tcPr>
+          <w:p>
+            <w:pPr>
+              <w:keepNext/>
+              <w:spacing w:after="0" w:line="240" w:lineRule="auto"/>
+              <w:jc w:val="center"/>
+            </w:pPr>
+            <w:r/>
+            <w:r>
+              <w:rPr>
+                <w:color w:val="0000FF"/>
+                <w:sz w:val="18"/>
+              </w:rPr>
+              <w:t>−0.019</w:t>
+            </w:r>
+            <w:r>
+              <w:br/>
+            </w:r>
+            <w:r>
+              <w:rPr>
+                <w:color w:val="0000FF"/>
+                <w:sz w:val="18"/>
+              </w:rPr>
+              <w:t>(0.030)</w:t>
             </w:r>
           </w:p>
         </w:tc>
@@ -9423,36 +9529,6 @@
                 <w:color w:val="0000FF"/>
                 <w:sz w:val="18"/>
               </w:rPr>
-              <w:t>−0.019</w:t>
-            </w:r>
-            <w:r>
-              <w:br/>
-            </w:r>
-            <w:r>
-              <w:rPr>
-                <w:color w:val="0000FF"/>
-                <w:sz w:val="18"/>
-              </w:rPr>
-              <w:t>(0.030)</w:t>
-            </w:r>
-          </w:p>
-        </w:tc>
-        <w:tc>
-          <w:tcPr>
-            <w:tcW w:type="dxa" w:w="1800"/>
-          </w:tcPr>
-          <w:p>
-            <w:pPr>
-              <w:keepNext/>
-              <w:spacing w:after="0" w:line="240" w:lineRule="auto"/>
-              <w:jc w:val="center"/>
-            </w:pPr>
-            <w:r/>
-            <w:r>
-              <w:rPr>
-                <w:color w:val="0000FF"/>
-                <w:sz w:val="18"/>
-              </w:rPr>
               <w:t>−0.053</w:t>
             </w:r>
             <w:r>
@@ -9487,6 +9563,26 @@
             </w:r>
           </w:p>
         </w:tc>
+        <w:tc>
+          <w:tcPr>
+            <w:tcW w:type="dxa" w:w="1080"/>
+          </w:tcPr>
+          <w:p>
+            <w:pPr>
+              <w:keepNext/>
+              <w:spacing w:after="0" w:line="240" w:lineRule="auto"/>
+              <w:jc w:val="center"/>
+            </w:pPr>
+            <w:r/>
+            <w:r>
+              <w:rPr>
+                <w:color w:val="0000FF"/>
+                <w:sz w:val="18"/>
+              </w:rPr>
+              <w:t>2,251</w:t>
+            </w:r>
+          </w:p>
+        </w:tc>
       </w:tr>
       <w:tr>
         <w:trPr>
@@ -9494,7 +9590,7 @@
         </w:trPr>
         <w:tc>
           <w:tcPr>
-            <w:tcW w:type="dxa" w:w="4752"/>
+            <w:tcW w:type="dxa" w:w="3960"/>
           </w:tcPr>
           <w:p>
             <w:pPr>
@@ -9509,6 +9605,36 @@
                 <w:sz w:val="18"/>
               </w:rPr>
               <w:t>(4) As (3), reference year g</w:t>
+            </w:r>
+          </w:p>
+        </w:tc>
+        <w:tc>
+          <w:tcPr>
+            <w:tcW w:type="dxa" w:w="1512"/>
+          </w:tcPr>
+          <w:p>
+            <w:pPr>
+              <w:keepNext/>
+              <w:spacing w:after="0" w:line="240" w:lineRule="auto"/>
+              <w:jc w:val="center"/>
+            </w:pPr>
+            <w:r/>
+            <w:r>
+              <w:rPr>
+                <w:color w:val="0000FF"/>
+                <w:sz w:val="18"/>
+              </w:rPr>
+              <w:t>−0.063***</w:t>
+            </w:r>
+            <w:r>
+              <w:br/>
+            </w:r>
+            <w:r>
+              <w:rPr>
+                <w:color w:val="0000FF"/>
+                <w:sz w:val="18"/>
+              </w:rPr>
+              <w:t>(0.024)</w:t>
             </w:r>
           </w:p>
         </w:tc>
@@ -9528,36 +9654,6 @@
                 <w:color w:val="0000FF"/>
                 <w:sz w:val="18"/>
               </w:rPr>
-              <w:t>−0.063***</w:t>
-            </w:r>
-            <w:r>
-              <w:br/>
-            </w:r>
-            <w:r>
-              <w:rPr>
-                <w:color w:val="0000FF"/>
-                <w:sz w:val="18"/>
-              </w:rPr>
-              <w:t>(0.024)</w:t>
-            </w:r>
-          </w:p>
-        </w:tc>
-        <w:tc>
-          <w:tcPr>
-            <w:tcW w:type="dxa" w:w="1800"/>
-          </w:tcPr>
-          <w:p>
-            <w:pPr>
-              <w:keepNext/>
-              <w:spacing w:after="0" w:line="240" w:lineRule="auto"/>
-              <w:jc w:val="center"/>
-            </w:pPr>
-            <w:r/>
-            <w:r>
-              <w:rPr>
-                <w:color w:val="0000FF"/>
-                <w:sz w:val="18"/>
-              </w:rPr>
               <w:t>−0.051*</w:t>
             </w:r>
             <w:r>
@@ -9592,6 +9688,26 @@
             </w:r>
           </w:p>
         </w:tc>
+        <w:tc>
+          <w:tcPr>
+            <w:tcW w:type="dxa" w:w="1080"/>
+          </w:tcPr>
+          <w:p>
+            <w:pPr>
+              <w:keepNext/>
+              <w:spacing w:after="0" w:line="240" w:lineRule="auto"/>
+              <w:jc w:val="center"/>
+            </w:pPr>
+            <w:r/>
+            <w:r>
+              <w:rPr>
+                <w:color w:val="0000FF"/>
+                <w:sz w:val="18"/>
+              </w:rPr>
+              <w:t>2,251</w:t>
+            </w:r>
+          </w:p>
+        </w:tc>
       </w:tr>
       <w:tr>
         <w:trPr>
@@ -9599,7 +9715,7 @@
         </w:trPr>
         <w:tc>
           <w:tcPr>
-            <w:tcW w:type="dxa" w:w="4752"/>
+            <w:tcW w:type="dxa" w:w="3960"/>
           </w:tcPr>
           <w:p>
             <w:pPr>
@@ -9614,6 +9730,36 @@
                 <w:sz w:val="18"/>
               </w:rPr>
               <w:t>(5) As (4), size measured in g</w:t>
+            </w:r>
+          </w:p>
+        </w:tc>
+        <w:tc>
+          <w:tcPr>
+            <w:tcW w:type="dxa" w:w="1512"/>
+          </w:tcPr>
+          <w:p>
+            <w:pPr>
+              <w:keepNext/>
+              <w:spacing w:after="0" w:line="240" w:lineRule="auto"/>
+              <w:jc w:val="center"/>
+            </w:pPr>
+            <w:r/>
+            <w:r>
+              <w:rPr>
+                <w:color w:val="0000FF"/>
+                <w:sz w:val="18"/>
+              </w:rPr>
+              <w:t>−0.060**</w:t>
+            </w:r>
+            <w:r>
+              <w:br/>
+            </w:r>
+            <w:r>
+              <w:rPr>
+                <w:color w:val="0000FF"/>
+                <w:sz w:val="18"/>
+              </w:rPr>
+              <w:t>(0.024)</w:t>
             </w:r>
           </w:p>
         </w:tc>
@@ -9633,36 +9779,6 @@
                 <w:color w:val="0000FF"/>
                 <w:sz w:val="18"/>
               </w:rPr>
-              <w:t>−0.060**</w:t>
-            </w:r>
-            <w:r>
-              <w:br/>
-            </w:r>
-            <w:r>
-              <w:rPr>
-                <w:color w:val="0000FF"/>
-                <w:sz w:val="18"/>
-              </w:rPr>
-              <w:t>(0.024)</w:t>
-            </w:r>
-          </w:p>
-        </w:tc>
-        <w:tc>
-          <w:tcPr>
-            <w:tcW w:type="dxa" w:w="1800"/>
-          </w:tcPr>
-          <w:p>
-            <w:pPr>
-              <w:keepNext/>
-              <w:spacing w:after="0" w:line="240" w:lineRule="auto"/>
-              <w:jc w:val="center"/>
-            </w:pPr>
-            <w:r/>
-            <w:r>
-              <w:rPr>
-                <w:color w:val="0000FF"/>
-                <w:sz w:val="18"/>
-              </w:rPr>
               <w:t>−0.063**</w:t>
             </w:r>
             <w:r>
@@ -9697,6 +9813,26 @@
             </w:r>
           </w:p>
         </w:tc>
+        <w:tc>
+          <w:tcPr>
+            <w:tcW w:type="dxa" w:w="1080"/>
+          </w:tcPr>
+          <w:p>
+            <w:pPr>
+              <w:keepNext/>
+              <w:spacing w:after="0" w:line="240" w:lineRule="auto"/>
+              <w:jc w:val="center"/>
+            </w:pPr>
+            <w:r/>
+            <w:r>
+              <w:rPr>
+                <w:color w:val="0000FF"/>
+                <w:sz w:val="18"/>
+              </w:rPr>
+              <w:t>2,252</w:t>
+            </w:r>
+          </w:p>
+        </w:tc>
       </w:tr>
       <w:tr>
         <w:trPr>
@@ -9704,7 +9840,7 @@
         </w:trPr>
         <w:tc>
           <w:tcPr>
-            <w:tcW w:type="dxa" w:w="4752"/>
+            <w:tcW w:type="dxa" w:w="3960"/>
           </w:tcPr>
           <w:p>
             <w:pPr>
@@ -9719,6 +9855,36 @@
                 <w:sz w:val="18"/>
               </w:rPr>
               <w:t>(6) One year later, all firms (R10)</w:t>
+            </w:r>
+          </w:p>
+        </w:tc>
+        <w:tc>
+          <w:tcPr>
+            <w:tcW w:type="dxa" w:w="1512"/>
+          </w:tcPr>
+          <w:p>
+            <w:pPr>
+              <w:keepNext/>
+              <w:spacing w:after="0" w:line="240" w:lineRule="auto"/>
+              <w:jc w:val="center"/>
+            </w:pPr>
+            <w:r/>
+            <w:r>
+              <w:rPr>
+                <w:color w:val="0000FF"/>
+                <w:sz w:val="18"/>
+              </w:rPr>
+              <w:t>−0.068***</w:t>
+            </w:r>
+            <w:r>
+              <w:br/>
+            </w:r>
+            <w:r>
+              <w:rPr>
+                <w:color w:val="0000FF"/>
+                <w:sz w:val="18"/>
+              </w:rPr>
+              <w:t>(0.024)</w:t>
             </w:r>
           </w:p>
         </w:tc>
@@ -9738,36 +9904,6 @@
                 <w:color w:val="0000FF"/>
                 <w:sz w:val="18"/>
               </w:rPr>
-              <w:t>−0.068***</w:t>
-            </w:r>
-            <w:r>
-              <w:br/>
-            </w:r>
-            <w:r>
-              <w:rPr>
-                <w:color w:val="0000FF"/>
-                <w:sz w:val="18"/>
-              </w:rPr>
-              <w:t>(0.024)</w:t>
-            </w:r>
-          </w:p>
-        </w:tc>
-        <w:tc>
-          <w:tcPr>
-            <w:tcW w:type="dxa" w:w="1800"/>
-          </w:tcPr>
-          <w:p>
-            <w:pPr>
-              <w:keepNext/>
-              <w:spacing w:after="0" w:line="240" w:lineRule="auto"/>
-              <w:jc w:val="center"/>
-            </w:pPr>
-            <w:r/>
-            <w:r>
-              <w:rPr>
-                <w:color w:val="0000FF"/>
-                <w:sz w:val="18"/>
-              </w:rPr>
               <w:t>−0.073**</w:t>
             </w:r>
             <w:r>
@@ -9802,6 +9938,26 @@
             </w:r>
           </w:p>
         </w:tc>
+        <w:tc>
+          <w:tcPr>
+            <w:tcW w:type="dxa" w:w="1080"/>
+          </w:tcPr>
+          <w:p>
+            <w:pPr>
+              <w:keepNext/>
+              <w:spacing w:after="0" w:line="240" w:lineRule="auto"/>
+              <w:jc w:val="center"/>
+            </w:pPr>
+            <w:r/>
+            <w:r>
+              <w:rPr>
+                <w:color w:val="0000FF"/>
+                <w:sz w:val="18"/>
+              </w:rPr>
+              <w:t>2,407</w:t>
+            </w:r>
+          </w:p>
+        </w:tc>
       </w:tr>
       <w:tr>
         <w:trPr>
@@ -9809,7 +9965,7 @@
         </w:trPr>
         <w:tc>
           <w:tcPr>
-            <w:tcW w:type="dxa" w:w="4752"/>
+            <w:tcW w:type="dxa" w:w="3960"/>
           </w:tcPr>
           <w:p>
             <w:pPr>
@@ -9824,6 +9980,36 @@
                 <w:sz w:val="18"/>
               </w:rPr>
               <w:t>(7) As (2), cohorts first recorded 2015 to 2020</w:t>
+            </w:r>
+          </w:p>
+        </w:tc>
+        <w:tc>
+          <w:tcPr>
+            <w:tcW w:type="dxa" w:w="1512"/>
+          </w:tcPr>
+          <w:p>
+            <w:pPr>
+              <w:keepNext/>
+              <w:spacing w:after="0" w:line="240" w:lineRule="auto"/>
+              <w:jc w:val="center"/>
+            </w:pPr>
+            <w:r/>
+            <w:r>
+              <w:rPr>
+                <w:color w:val="0000FF"/>
+                <w:sz w:val="18"/>
+              </w:rPr>
+              <w:t>0.017</w:t>
+            </w:r>
+            <w:r>
+              <w:br/>
+            </w:r>
+            <w:r>
+              <w:rPr>
+                <w:color w:val="0000FF"/>
+                <w:sz w:val="18"/>
+              </w:rPr>
+              <w:t>(0.040)</w:t>
             </w:r>
           </w:p>
         </w:tc>
@@ -9843,36 +10029,6 @@
                 <w:color w:val="0000FF"/>
                 <w:sz w:val="18"/>
               </w:rPr>
-              <w:t>0.017</w:t>
-            </w:r>
-            <w:r>
-              <w:br/>
-            </w:r>
-            <w:r>
-              <w:rPr>
-                <w:color w:val="0000FF"/>
-                <w:sz w:val="18"/>
-              </w:rPr>
-              <w:t>(0.040)</w:t>
-            </w:r>
-          </w:p>
-        </w:tc>
-        <w:tc>
-          <w:tcPr>
-            <w:tcW w:type="dxa" w:w="1800"/>
-          </w:tcPr>
-          <w:p>
-            <w:pPr>
-              <w:keepNext/>
-              <w:spacing w:after="0" w:line="240" w:lineRule="auto"/>
-              <w:jc w:val="center"/>
-            </w:pPr>
-            <w:r/>
-            <w:r>
-              <w:rPr>
-                <w:color w:val="0000FF"/>
-                <w:sz w:val="18"/>
-              </w:rPr>
               <w:t>0.076*</w:t>
             </w:r>
             <w:r>
@@ -9907,6 +10063,26 @@
             </w:r>
           </w:p>
         </w:tc>
+        <w:tc>
+          <w:tcPr>
+            <w:tcW w:type="dxa" w:w="1080"/>
+          </w:tcPr>
+          <w:p>
+            <w:pPr>
+              <w:keepNext/>
+              <w:spacing w:after="0" w:line="240" w:lineRule="auto"/>
+              <w:jc w:val="center"/>
+            </w:pPr>
+            <w:r/>
+            <w:r>
+              <w:rPr>
+                <w:color w:val="0000FF"/>
+                <w:sz w:val="18"/>
+              </w:rPr>
+              <w:t>1,952</w:t>
+            </w:r>
+          </w:p>
+        </w:tc>
       </w:tr>
       <w:tr>
         <w:trPr>
@@ -9914,7 +10090,7 @@
         </w:trPr>
         <w:tc>
           <w:tcPr>
-            <w:tcW w:type="dxa" w:w="4752"/>
+            <w:tcW w:type="dxa" w:w="3960"/>
           </w:tcPr>
           <w:p>
             <w:pPr>
@@ -9929,6 +10105,36 @@
                 <w:sz w:val="18"/>
               </w:rPr>
               <w:t>(8) As (3), cohorts first recorded 2015 to 2020</w:t>
+            </w:r>
+          </w:p>
+        </w:tc>
+        <w:tc>
+          <w:tcPr>
+            <w:tcW w:type="dxa" w:w="1512"/>
+          </w:tcPr>
+          <w:p>
+            <w:pPr>
+              <w:keepNext/>
+              <w:spacing w:after="0" w:line="240" w:lineRule="auto"/>
+              <w:jc w:val="center"/>
+            </w:pPr>
+            <w:r/>
+            <w:r>
+              <w:rPr>
+                <w:color w:val="0000FF"/>
+                <w:sz w:val="18"/>
+              </w:rPr>
+              <w:t>−0.026</w:t>
+            </w:r>
+            <w:r>
+              <w:br/>
+            </w:r>
+            <w:r>
+              <w:rPr>
+                <w:color w:val="0000FF"/>
+                <w:sz w:val="18"/>
+              </w:rPr>
+              <w:t>(0.047)</w:t>
             </w:r>
           </w:p>
         </w:tc>
@@ -9948,36 +10154,6 @@
                 <w:color w:val="0000FF"/>
                 <w:sz w:val="18"/>
               </w:rPr>
-              <w:t>−0.026</w:t>
-            </w:r>
-            <w:r>
-              <w:br/>
-            </w:r>
-            <w:r>
-              <w:rPr>
-                <w:color w:val="0000FF"/>
-                <w:sz w:val="18"/>
-              </w:rPr>
-              <w:t>(0.047)</w:t>
-            </w:r>
-          </w:p>
-        </w:tc>
-        <w:tc>
-          <w:tcPr>
-            <w:tcW w:type="dxa" w:w="1800"/>
-          </w:tcPr>
-          <w:p>
-            <w:pPr>
-              <w:keepNext/>
-              <w:spacing w:after="0" w:line="240" w:lineRule="auto"/>
-              <w:jc w:val="center"/>
-            </w:pPr>
-            <w:r/>
-            <w:r>
-              <w:rPr>
-                <w:color w:val="0000FF"/>
-                <w:sz w:val="18"/>
-              </w:rPr>
               <w:t>0.077</w:t>
             </w:r>
             <w:r>
@@ -10012,6 +10188,26 @@
             </w:r>
           </w:p>
         </w:tc>
+        <w:tc>
+          <w:tcPr>
+            <w:tcW w:type="dxa" w:w="1080"/>
+          </w:tcPr>
+          <w:p>
+            <w:pPr>
+              <w:keepNext/>
+              <w:spacing w:after="0" w:line="240" w:lineRule="auto"/>
+              <w:jc w:val="center"/>
+            </w:pPr>
+            <w:r/>
+            <w:r>
+              <w:rPr>
+                <w:color w:val="0000FF"/>
+                <w:sz w:val="18"/>
+              </w:rPr>
+              <w:t>1,938</w:t>
+            </w:r>
+          </w:p>
+        </w:tc>
       </w:tr>
       <w:tr>
         <w:trPr>
@@ -10019,7 +10215,7 @@
         </w:trPr>
         <w:tc>
           <w:tcPr>
-            <w:tcW w:type="dxa" w:w="4752"/>
+            <w:tcW w:type="dxa" w:w="3960"/>
           </w:tcPr>
           <w:p>
             <w:pPr>
@@ -10034,6 +10230,36 @@
                 <w:sz w:val="18"/>
               </w:rPr>
               <w:t>(9) As (4), cohorts first recorded 2015 to 2020</w:t>
+            </w:r>
+          </w:p>
+        </w:tc>
+        <w:tc>
+          <w:tcPr>
+            <w:tcW w:type="dxa" w:w="1512"/>
+          </w:tcPr>
+          <w:p>
+            <w:pPr>
+              <w:keepNext/>
+              <w:spacing w:after="0" w:line="240" w:lineRule="auto"/>
+              <w:jc w:val="center"/>
+            </w:pPr>
+            <w:r/>
+            <w:r>
+              <w:rPr>
+                <w:color w:val="0000FF"/>
+                <w:sz w:val="18"/>
+              </w:rPr>
+              <w:t>−0.124***</w:t>
+            </w:r>
+            <w:r>
+              <w:br/>
+            </w:r>
+            <w:r>
+              <w:rPr>
+                <w:color w:val="0000FF"/>
+                <w:sz w:val="18"/>
+              </w:rPr>
+              <w:t>(0.038)</w:t>
             </w:r>
           </w:p>
         </w:tc>
@@ -10053,36 +10279,6 @@
                 <w:color w:val="0000FF"/>
                 <w:sz w:val="18"/>
               </w:rPr>
-              <w:t>−0.124***</w:t>
-            </w:r>
-            <w:r>
-              <w:br/>
-            </w:r>
-            <w:r>
-              <w:rPr>
-                <w:color w:val="0000FF"/>
-                <w:sz w:val="18"/>
-              </w:rPr>
-              <w:t>(0.038)</w:t>
-            </w:r>
-          </w:p>
-        </w:tc>
-        <w:tc>
-          <w:tcPr>
-            <w:tcW w:type="dxa" w:w="1800"/>
-          </w:tcPr>
-          <w:p>
-            <w:pPr>
-              <w:keepNext/>
-              <w:spacing w:after="0" w:line="240" w:lineRule="auto"/>
-              <w:jc w:val="center"/>
-            </w:pPr>
-            <w:r/>
-            <w:r>
-              <w:rPr>
-                <w:color w:val="0000FF"/>
-                <w:sz w:val="18"/>
-              </w:rPr>
               <w:t>−0.006</w:t>
             </w:r>
             <w:r>
@@ -10117,6 +10313,26 @@
             </w:r>
           </w:p>
         </w:tc>
+        <w:tc>
+          <w:tcPr>
+            <w:tcW w:type="dxa" w:w="1080"/>
+          </w:tcPr>
+          <w:p>
+            <w:pPr>
+              <w:keepNext/>
+              <w:spacing w:after="0" w:line="240" w:lineRule="auto"/>
+              <w:jc w:val="center"/>
+            </w:pPr>
+            <w:r/>
+            <w:r>
+              <w:rPr>
+                <w:color w:val="0000FF"/>
+                <w:sz w:val="18"/>
+              </w:rPr>
+              <w:t>1,938</w:t>
+            </w:r>
+          </w:p>
+        </w:tc>
       </w:tr>
       <w:tr>
         <w:trPr>
@@ -10124,7 +10340,7 @@
         </w:trPr>
         <w:tc>
           <w:tcPr>
-            <w:tcW w:type="dxa" w:w="4752"/>
+            <w:tcW w:type="dxa" w:w="3960"/>
             <w:tcBorders>
               <w:bottom w:val="single" w:sz="6" w:color="000000"/>
             </w:tcBorders>
@@ -10141,6 +10357,38 @@
                 <w:sz w:val="18"/>
               </w:rPr>
               <w:t>(10) As (5), cohorts first recorded 2015 to 2020</w:t>
+            </w:r>
+          </w:p>
+        </w:tc>
+        <w:tc>
+          <w:tcPr>
+            <w:tcW w:type="dxa" w:w="1512"/>
+            <w:tcBorders>
+              <w:bottom w:val="single" w:sz="6" w:color="000000"/>
+            </w:tcBorders>
+          </w:tcPr>
+          <w:p>
+            <w:pPr>
+              <w:spacing w:after="0" w:line="240" w:lineRule="auto"/>
+              <w:jc w:val="center"/>
+            </w:pPr>
+            <w:r/>
+            <w:r>
+              <w:rPr>
+                <w:color w:val="0000FF"/>
+                <w:sz w:val="18"/>
+              </w:rPr>
+              <w:t>−0.121***</w:t>
+            </w:r>
+            <w:r>
+              <w:br/>
+            </w:r>
+            <w:r>
+              <w:rPr>
+                <w:color w:val="0000FF"/>
+                <w:sz w:val="18"/>
+              </w:rPr>
+              <w:t>(0.038)</w:t>
             </w:r>
           </w:p>
         </w:tc>
@@ -10162,38 +10410,6 @@
                 <w:color w:val="0000FF"/>
                 <w:sz w:val="18"/>
               </w:rPr>
-              <w:t>−0.121***</w:t>
-            </w:r>
-            <w:r>
-              <w:br/>
-            </w:r>
-            <w:r>
-              <w:rPr>
-                <w:color w:val="0000FF"/>
-                <w:sz w:val="18"/>
-              </w:rPr>
-              <w:t>(0.038)</w:t>
-            </w:r>
-          </w:p>
-        </w:tc>
-        <w:tc>
-          <w:tcPr>
-            <w:tcW w:type="dxa" w:w="1800"/>
-            <w:tcBorders>
-              <w:bottom w:val="single" w:sz="6" w:color="000000"/>
-            </w:tcBorders>
-          </w:tcPr>
-          <w:p>
-            <w:pPr>
-              <w:spacing w:after="0" w:line="240" w:lineRule="auto"/>
-              <w:jc w:val="center"/>
-            </w:pPr>
-            <w:r/>
-            <w:r>
-              <w:rPr>
-                <w:color w:val="0000FF"/>
-                <w:sz w:val="18"/>
-              </w:rPr>
               <w:t>−0.018</w:t>
             </w:r>
             <w:r>
@@ -10230,6 +10446,28 @@
             </w:r>
           </w:p>
         </w:tc>
+        <w:tc>
+          <w:tcPr>
+            <w:tcW w:type="dxa" w:w="1080"/>
+            <w:tcBorders>
+              <w:bottom w:val="single" w:sz="6" w:color="000000"/>
+            </w:tcBorders>
+          </w:tcPr>
+          <w:p>
+            <w:pPr>
+              <w:spacing w:after="0" w:line="240" w:lineRule="auto"/>
+              <w:jc w:val="center"/>
+            </w:pPr>
+            <w:r/>
+            <w:r>
+              <w:rPr>
+                <w:color w:val="0000FF"/>
+                <w:sz w:val="18"/>
+              </w:rPr>
+              <w:t>1,938</w:t>
+            </w:r>
+          </w:p>
+        </w:tc>
       </w:tr>
     </w:tbl>
     <w:p>
@@ -10275,7 +10513,7 @@
         <w:rPr>
           <w:color w:val="0000FF"/>
         </w:rPr>
-        <w:t>The row 4 step is therefore this event-year-0 change, 0.044, averaged with the weights of event years 1 to 4; it is an accounting identity, not a separate estimate.</w:t>
+        <w:t>The row 4 step, 0.044, is therefore each cohort's own change between g − 1 and g averaged with the weights of event years 1 to 4, which fall most on the early cohorts observed longest after entry; it is an accounting identity, not a separate estimate, and it is larger than the pooled event-year-0 estimate in Figure 1.</w:t>
       </w:r>
       <w:r>
         <w:rPr/>
@@ -10285,7 +10523,7 @@
         <w:rPr>
           <w:color w:val="0000FF"/>
         </w:rPr>
-        <w:t>A later dating starts from the high point of the relative MTB path, and part of the decline it reports is the rise in the first recorded year itself.</w:t>
+        <w:t>Part of the decline under the later dating is thus the rise these cohorts had in the first recorded year itself.</w:t>
       </w:r>
       <w:r>
         <w:rPr/>
@@ -10552,10 +10790,11 @@
         <w:tblLook w:firstColumn="1" w:firstRow="1" w:lastColumn="0" w:lastRow="0" w:noHBand="0" w:noVBand="1" w:val="04A0"/>
       </w:tblPr>
       <w:tblGrid>
-        <w:gridCol w:w="4320"/>
-        <w:gridCol w:w="1800"/>
-        <w:gridCol w:w="1872"/>
-        <w:gridCol w:w="1296"/>
+        <w:gridCol w:w="3744"/>
+        <w:gridCol w:w="1584"/>
+        <w:gridCol w:w="1655"/>
+        <w:gridCol w:w="1224"/>
+        <w:gridCol w:w="1152"/>
       </w:tblGrid>
       <w:tr>
         <w:trPr>
@@ -10564,7 +10803,7 @@
         </w:trPr>
         <w:tc>
           <w:tcPr>
-            <w:tcW w:type="dxa" w:w="4320"/>
+            <w:tcW w:type="dxa" w:w="3744"/>
             <w:tcBorders>
               <w:top w:val="single" w:sz="6" w:color="000000"/>
               <w:bottom w:val="single" w:sz="6" w:color="000000"/>
@@ -10588,7 +10827,7 @@
         </w:tc>
         <w:tc>
           <w:tcPr>
-            <w:tcW w:type="dxa" w:w="1800"/>
+            <w:tcW w:type="dxa" w:w="1584"/>
             <w:tcBorders>
               <w:top w:val="single" w:sz="6" w:color="000000"/>
               <w:bottom w:val="single" w:sz="6" w:color="000000"/>
@@ -10613,7 +10852,7 @@
         </w:tc>
         <w:tc>
           <w:tcPr>
-            <w:tcW w:type="dxa" w:w="1872"/>
+            <w:tcW w:type="dxa" w:w="1656"/>
             <w:tcBorders>
               <w:top w:val="single" w:sz="6" w:color="000000"/>
               <w:bottom w:val="single" w:sz="6" w:color="000000"/>
@@ -10638,7 +10877,7 @@
         </w:tc>
         <w:tc>
           <w:tcPr>
-            <w:tcW w:type="dxa" w:w="1296"/>
+            <w:tcW w:type="dxa" w:w="1224"/>
             <w:tcBorders>
               <w:top w:val="single" w:sz="6" w:color="000000"/>
               <w:bottom w:val="single" w:sz="6" w:color="000000"/>
@@ -10661,34 +10900,13 @@
             </w:r>
           </w:p>
         </w:tc>
-      </w:tr>
-      <w:tr>
-        <w:trPr>
-          <w:cantSplit/>
-        </w:trPr>
         <w:tc>
           <w:tcPr>
-            <w:tcW w:type="dxa" w:w="4320"/>
-          </w:tcPr>
-          <w:p>
-            <w:pPr>
-              <w:keepNext/>
-              <w:spacing w:after="0" w:line="240" w:lineRule="auto"/>
-            </w:pPr>
-            <w:r/>
-            <w:r>
-              <w:rPr>
-                <w:b/>
-                <w:color w:val="0000FF"/>
-                <w:sz w:val="18"/>
-              </w:rPr>
-              <w:t>Baseline: quadratic in log total assets at g − 1</w:t>
-            </w:r>
-          </w:p>
-        </w:tc>
-        <w:tc>
-          <w:tcPr>
-            <w:tcW w:type="dxa" w:w="1800"/>
+            <w:tcW w:type="dxa" w:w="1152"/>
+            <w:tcBorders>
+              <w:top w:val="single" w:sz="6" w:color="000000"/>
+              <w:bottom w:val="single" w:sz="6" w:color="000000"/>
+            </w:tcBorders>
           </w:tcPr>
           <w:p>
             <w:pPr>
@@ -10699,70 +10917,11 @@
             <w:r/>
             <w:r>
               <w:rPr>
+                <w:b/>
                 <w:color w:val="0000FF"/>
                 <w:sz w:val="18"/>
               </w:rPr>
-              <w:t>0.002</w:t>
-            </w:r>
-            <w:r>
-              <w:br/>
-            </w:r>
-            <w:r>
-              <w:rPr>
-                <w:color w:val="0000FF"/>
-                <w:sz w:val="18"/>
-              </w:rPr>
-              <w:t>(0.024)</w:t>
-            </w:r>
-          </w:p>
-        </w:tc>
-        <w:tc>
-          <w:tcPr>
-            <w:tcW w:type="dxa" w:w="1872"/>
-          </w:tcPr>
-          <w:p>
-            <w:pPr>
-              <w:keepNext/>
-              <w:spacing w:after="0" w:line="240" w:lineRule="auto"/>
-              <w:jc w:val="center"/>
-            </w:pPr>
-            <w:r/>
-            <w:r>
-              <w:rPr>
-                <w:color w:val="0000FF"/>
-                <w:sz w:val="18"/>
-              </w:rPr>
-              <w:t>−0.055*</w:t>
-            </w:r>
-            <w:r>
-              <w:br/>
-            </w:r>
-            <w:r>
-              <w:rPr>
-                <w:color w:val="0000FF"/>
-                <w:sz w:val="18"/>
-              </w:rPr>
-              <w:t>(0.030)</w:t>
-            </w:r>
-          </w:p>
-        </w:tc>
-        <w:tc>
-          <w:tcPr>
-            <w:tcW w:type="dxa" w:w="1296"/>
-          </w:tcPr>
-          <w:p>
-            <w:pPr>
-              <w:keepNext/>
-              <w:spacing w:after="0" w:line="240" w:lineRule="auto"/>
-              <w:jc w:val="center"/>
-            </w:pPr>
-            <w:r/>
-            <w:r>
-              <w:rPr>
-                <w:color w:val="0000FF"/>
-                <w:sz w:val="18"/>
-              </w:rPr>
-              <w:t>625</w:t>
+              <w:t>Control firms</w:t>
             </w:r>
           </w:p>
         </w:tc>
@@ -10773,7 +10932,7 @@
         </w:trPr>
         <w:tc>
           <w:tcPr>
-            <w:tcW w:type="dxa" w:w="4320"/>
+            <w:tcW w:type="dxa" w:w="3744"/>
           </w:tcPr>
           <w:p>
             <w:pPr>
@@ -10787,13 +10946,13 @@
                 <w:color w:val="0000FF"/>
                 <w:sz w:val="18"/>
               </w:rPr>
-              <w:t>No covariates</w:t>
+              <w:t>Baseline: quadratic in log total assets at g − 1</w:t>
             </w:r>
           </w:p>
         </w:tc>
         <w:tc>
           <w:tcPr>
-            <w:tcW w:type="dxa" w:w="1800"/>
+            <w:tcW w:type="dxa" w:w="1584"/>
           </w:tcPr>
           <w:p>
             <w:pPr>
@@ -10807,7 +10966,7 @@
                 <w:color w:val="0000FF"/>
                 <w:sz w:val="18"/>
               </w:rPr>
-              <w:t>0.025</w:t>
+              <w:t>0.002</w:t>
             </w:r>
             <w:r>
               <w:br/>
@@ -10817,13 +10976,13 @@
                 <w:color w:val="0000FF"/>
                 <w:sz w:val="18"/>
               </w:rPr>
-              <w:t>(0.022)</w:t>
+              <w:t>(0.024)</w:t>
             </w:r>
           </w:p>
         </w:tc>
         <w:tc>
           <w:tcPr>
-            <w:tcW w:type="dxa" w:w="1872"/>
+            <w:tcW w:type="dxa" w:w="1656"/>
           </w:tcPr>
           <w:p>
             <w:pPr>
@@ -10837,7 +10996,7 @@
                 <w:color w:val="0000FF"/>
                 <w:sz w:val="18"/>
               </w:rPr>
-              <w:t>0.016</w:t>
+              <w:t>−0.055*</w:t>
             </w:r>
             <w:r>
               <w:br/>
@@ -10847,13 +11006,13 @@
                 <w:color w:val="0000FF"/>
                 <w:sz w:val="18"/>
               </w:rPr>
-              <w:t>(0.025)</w:t>
+              <w:t>(0.030)</w:t>
             </w:r>
           </w:p>
         </w:tc>
         <w:tc>
           <w:tcPr>
-            <w:tcW w:type="dxa" w:w="1296"/>
+            <w:tcW w:type="dxa" w:w="1224"/>
           </w:tcPr>
           <w:p>
             <w:pPr>
@@ -10868,6 +11027,26 @@
                 <w:sz w:val="18"/>
               </w:rPr>
               <w:t>625</w:t>
+            </w:r>
+          </w:p>
+        </w:tc>
+        <w:tc>
+          <w:tcPr>
+            <w:tcW w:type="dxa" w:w="1152"/>
+          </w:tcPr>
+          <w:p>
+            <w:pPr>
+              <w:keepNext/>
+              <w:spacing w:after="0" w:line="240" w:lineRule="auto"/>
+              <w:jc w:val="center"/>
+            </w:pPr>
+            <w:r/>
+            <w:r>
+              <w:rPr>
+                <w:color w:val="0000FF"/>
+                <w:sz w:val="18"/>
+              </w:rPr>
+              <w:t>2,412</w:t>
             </w:r>
           </w:p>
         </w:tc>
@@ -10878,7 +11057,7 @@
         </w:trPr>
         <w:tc>
           <w:tcPr>
-            <w:tcW w:type="dxa" w:w="4320"/>
+            <w:tcW w:type="dxa" w:w="3744"/>
           </w:tcPr>
           <w:p>
             <w:pPr>
@@ -10892,13 +11071,13 @@
                 <w:color w:val="0000FF"/>
                 <w:sz w:val="18"/>
               </w:rPr>
-              <w:t>Linear in log total assets</w:t>
+              <w:t>No covariates</w:t>
             </w:r>
           </w:p>
         </w:tc>
         <w:tc>
           <w:tcPr>
-            <w:tcW w:type="dxa" w:w="1800"/>
+            <w:tcW w:type="dxa" w:w="1584"/>
           </w:tcPr>
           <w:p>
             <w:pPr>
@@ -10912,7 +11091,7 @@
                 <w:color w:val="0000FF"/>
                 <w:sz w:val="18"/>
               </w:rPr>
-              <w:t>−0.003</w:t>
+              <w:t>0.025</w:t>
             </w:r>
             <w:r>
               <w:br/>
@@ -10922,13 +11101,13 @@
                 <w:color w:val="0000FF"/>
                 <w:sz w:val="18"/>
               </w:rPr>
-              <w:t>(0.023)</w:t>
+              <w:t>(0.022)</w:t>
             </w:r>
           </w:p>
         </w:tc>
         <w:tc>
           <w:tcPr>
-            <w:tcW w:type="dxa" w:w="1872"/>
+            <w:tcW w:type="dxa" w:w="1656"/>
           </w:tcPr>
           <w:p>
             <w:pPr>
@@ -10942,7 +11121,7 @@
                 <w:color w:val="0000FF"/>
                 <w:sz w:val="18"/>
               </w:rPr>
-              <w:t>−0.033</w:t>
+              <w:t>0.016</w:t>
             </w:r>
             <w:r>
               <w:br/>
@@ -10952,13 +11131,13 @@
                 <w:color w:val="0000FF"/>
                 <w:sz w:val="18"/>
               </w:rPr>
-              <w:t>(0.029)</w:t>
+              <w:t>(0.025)</w:t>
             </w:r>
           </w:p>
         </w:tc>
         <w:tc>
           <w:tcPr>
-            <w:tcW w:type="dxa" w:w="1296"/>
+            <w:tcW w:type="dxa" w:w="1224"/>
           </w:tcPr>
           <w:p>
             <w:pPr>
@@ -10973,6 +11152,26 @@
                 <w:sz w:val="18"/>
               </w:rPr>
               <w:t>625</w:t>
+            </w:r>
+          </w:p>
+        </w:tc>
+        <w:tc>
+          <w:tcPr>
+            <w:tcW w:type="dxa" w:w="1152"/>
+          </w:tcPr>
+          <w:p>
+            <w:pPr>
+              <w:keepNext/>
+              <w:spacing w:after="0" w:line="240" w:lineRule="auto"/>
+              <w:jc w:val="center"/>
+            </w:pPr>
+            <w:r/>
+            <w:r>
+              <w:rPr>
+                <w:color w:val="0000FF"/>
+                <w:sz w:val="18"/>
+              </w:rPr>
+              <w:t>2,412</w:t>
             </w:r>
           </w:p>
         </w:tc>
@@ -10983,7 +11182,7 @@
         </w:trPr>
         <w:tc>
           <w:tcPr>
-            <w:tcW w:type="dxa" w:w="4320"/>
+            <w:tcW w:type="dxa" w:w="3744"/>
           </w:tcPr>
           <w:p>
             <w:pPr>
@@ -10997,13 +11196,13 @@
                 <w:color w:val="0000FF"/>
                 <w:sz w:val="18"/>
               </w:rPr>
-              <w:t>Cubic in log total assets</w:t>
+              <w:t>Linear in log total assets</w:t>
             </w:r>
           </w:p>
         </w:tc>
         <w:tc>
           <w:tcPr>
-            <w:tcW w:type="dxa" w:w="1800"/>
+            <w:tcW w:type="dxa" w:w="1584"/>
           </w:tcPr>
           <w:p>
             <w:pPr>
@@ -11017,7 +11216,7 @@
                 <w:color w:val="0000FF"/>
                 <w:sz w:val="18"/>
               </w:rPr>
-              <w:t>−0.009</w:t>
+              <w:t>−0.003</w:t>
             </w:r>
             <w:r>
               <w:br/>
@@ -11027,13 +11226,13 @@
                 <w:color w:val="0000FF"/>
                 <w:sz w:val="18"/>
               </w:rPr>
-              <w:t>(0.024)</w:t>
+              <w:t>(0.023)</w:t>
             </w:r>
           </w:p>
         </w:tc>
         <w:tc>
           <w:tcPr>
-            <w:tcW w:type="dxa" w:w="1872"/>
+            <w:tcW w:type="dxa" w:w="1656"/>
           </w:tcPr>
           <w:p>
             <w:pPr>
@@ -11047,7 +11246,7 @@
                 <w:color w:val="0000FF"/>
                 <w:sz w:val="18"/>
               </w:rPr>
-              <w:t>−0.055*</w:t>
+              <w:t>−0.033</w:t>
             </w:r>
             <w:r>
               <w:br/>
@@ -11057,13 +11256,13 @@
                 <w:color w:val="0000FF"/>
                 <w:sz w:val="18"/>
               </w:rPr>
-              <w:t>(0.030)</w:t>
+              <w:t>(0.029)</w:t>
             </w:r>
           </w:p>
         </w:tc>
         <w:tc>
           <w:tcPr>
-            <w:tcW w:type="dxa" w:w="1296"/>
+            <w:tcW w:type="dxa" w:w="1224"/>
           </w:tcPr>
           <w:p>
             <w:pPr>
@@ -11078,6 +11277,26 @@
                 <w:sz w:val="18"/>
               </w:rPr>
               <w:t>625</w:t>
+            </w:r>
+          </w:p>
+        </w:tc>
+        <w:tc>
+          <w:tcPr>
+            <w:tcW w:type="dxa" w:w="1152"/>
+          </w:tcPr>
+          <w:p>
+            <w:pPr>
+              <w:keepNext/>
+              <w:spacing w:after="0" w:line="240" w:lineRule="auto"/>
+              <w:jc w:val="center"/>
+            </w:pPr>
+            <w:r/>
+            <w:r>
+              <w:rPr>
+                <w:color w:val="0000FF"/>
+                <w:sz w:val="18"/>
+              </w:rPr>
+              <w:t>2,412</w:t>
             </w:r>
           </w:p>
         </w:tc>
@@ -11088,7 +11307,7 @@
         </w:trPr>
         <w:tc>
           <w:tcPr>
-            <w:tcW w:type="dxa" w:w="4320"/>
+            <w:tcW w:type="dxa" w:w="3744"/>
           </w:tcPr>
           <w:p>
             <w:pPr>
@@ -11102,13 +11321,13 @@
                 <w:color w:val="0000FF"/>
                 <w:sz w:val="18"/>
               </w:rPr>
-              <w:t>Size quintile indicators</w:t>
+              <w:t>Cubic in log total assets</w:t>
             </w:r>
           </w:p>
         </w:tc>
         <w:tc>
           <w:tcPr>
-            <w:tcW w:type="dxa" w:w="1800"/>
+            <w:tcW w:type="dxa" w:w="1584"/>
           </w:tcPr>
           <w:p>
             <w:pPr>
@@ -11122,7 +11341,7 @@
                 <w:color w:val="0000FF"/>
                 <w:sz w:val="18"/>
               </w:rPr>
-              <w:t>−0.010</w:t>
+              <w:t>−0.009</w:t>
             </w:r>
             <w:r>
               <w:br/>
@@ -11132,13 +11351,13 @@
                 <w:color w:val="0000FF"/>
                 <w:sz w:val="18"/>
               </w:rPr>
-              <w:t>(0.023)</w:t>
+              <w:t>(0.024)</w:t>
             </w:r>
           </w:p>
         </w:tc>
         <w:tc>
           <w:tcPr>
-            <w:tcW w:type="dxa" w:w="1872"/>
+            <w:tcW w:type="dxa" w:w="1656"/>
           </w:tcPr>
           <w:p>
             <w:pPr>
@@ -11152,7 +11371,7 @@
                 <w:color w:val="0000FF"/>
                 <w:sz w:val="18"/>
               </w:rPr>
-              <w:t>−0.053*</w:t>
+              <w:t>−0.055*</w:t>
             </w:r>
             <w:r>
               <w:br/>
@@ -11162,13 +11381,13 @@
                 <w:color w:val="0000FF"/>
                 <w:sz w:val="18"/>
               </w:rPr>
-              <w:t>(0.029)</w:t>
+              <w:t>(0.030)</w:t>
             </w:r>
           </w:p>
         </w:tc>
         <w:tc>
           <w:tcPr>
-            <w:tcW w:type="dxa" w:w="1296"/>
+            <w:tcW w:type="dxa" w:w="1224"/>
           </w:tcPr>
           <w:p>
             <w:pPr>
@@ -11183,6 +11402,26 @@
                 <w:sz w:val="18"/>
               </w:rPr>
               <w:t>625</w:t>
+            </w:r>
+          </w:p>
+        </w:tc>
+        <w:tc>
+          <w:tcPr>
+            <w:tcW w:type="dxa" w:w="1152"/>
+          </w:tcPr>
+          <w:p>
+            <w:pPr>
+              <w:keepNext/>
+              <w:spacing w:after="0" w:line="240" w:lineRule="auto"/>
+              <w:jc w:val="center"/>
+            </w:pPr>
+            <w:r/>
+            <w:r>
+              <w:rPr>
+                <w:color w:val="0000FF"/>
+                <w:sz w:val="18"/>
+              </w:rPr>
+              <w:t>2,412</w:t>
             </w:r>
           </w:p>
         </w:tc>
@@ -11193,7 +11432,7 @@
         </w:trPr>
         <w:tc>
           <w:tcPr>
-            <w:tcW w:type="dxa" w:w="4320"/>
+            <w:tcW w:type="dxa" w:w="3744"/>
           </w:tcPr>
           <w:p>
             <w:pPr>
@@ -11207,13 +11446,13 @@
                 <w:color w:val="0000FF"/>
                 <w:sz w:val="18"/>
               </w:rPr>
-              <w:t>Quadratic, total assets at g − 3</w:t>
+              <w:t>Size quintile indicators</w:t>
             </w:r>
           </w:p>
         </w:tc>
         <w:tc>
           <w:tcPr>
-            <w:tcW w:type="dxa" w:w="1800"/>
+            <w:tcW w:type="dxa" w:w="1584"/>
           </w:tcPr>
           <w:p>
             <w:pPr>
@@ -11227,7 +11466,7 @@
                 <w:color w:val="0000FF"/>
                 <w:sz w:val="18"/>
               </w:rPr>
-              <w:t>−0.008</w:t>
+              <w:t>−0.010</w:t>
             </w:r>
             <w:r>
               <w:br/>
@@ -11237,13 +11476,13 @@
                 <w:color w:val="0000FF"/>
                 <w:sz w:val="18"/>
               </w:rPr>
-              <w:t>(0.025)</w:t>
+              <w:t>(0.023)</w:t>
             </w:r>
           </w:p>
         </w:tc>
         <w:tc>
           <w:tcPr>
-            <w:tcW w:type="dxa" w:w="1872"/>
+            <w:tcW w:type="dxa" w:w="1656"/>
           </w:tcPr>
           <w:p>
             <w:pPr>
@@ -11257,7 +11496,7 @@
                 <w:color w:val="0000FF"/>
                 <w:sz w:val="18"/>
               </w:rPr>
-              <w:t>−0.059*</w:t>
+              <w:t>−0.053*</w:t>
             </w:r>
             <w:r>
               <w:br/>
@@ -11267,13 +11506,13 @@
                 <w:color w:val="0000FF"/>
                 <w:sz w:val="18"/>
               </w:rPr>
-              <w:t>(0.032)</w:t>
+              <w:t>(0.029)</w:t>
             </w:r>
           </w:p>
         </w:tc>
         <w:tc>
           <w:tcPr>
-            <w:tcW w:type="dxa" w:w="1296"/>
+            <w:tcW w:type="dxa" w:w="1224"/>
           </w:tcPr>
           <w:p>
             <w:pPr>
@@ -11287,7 +11526,27 @@
                 <w:color w:val="0000FF"/>
                 <w:sz w:val="18"/>
               </w:rPr>
-              <w:t>592</w:t>
+              <w:t>625</w:t>
+            </w:r>
+          </w:p>
+        </w:tc>
+        <w:tc>
+          <w:tcPr>
+            <w:tcW w:type="dxa" w:w="1152"/>
+          </w:tcPr>
+          <w:p>
+            <w:pPr>
+              <w:keepNext/>
+              <w:spacing w:after="0" w:line="240" w:lineRule="auto"/>
+              <w:jc w:val="center"/>
+            </w:pPr>
+            <w:r/>
+            <w:r>
+              <w:rPr>
+                <w:color w:val="0000FF"/>
+                <w:sz w:val="18"/>
+              </w:rPr>
+              <w:t>2,412</w:t>
             </w:r>
           </w:p>
         </w:tc>
@@ -11298,7 +11557,7 @@
         </w:trPr>
         <w:tc>
           <w:tcPr>
-            <w:tcW w:type="dxa" w:w="4320"/>
+            <w:tcW w:type="dxa" w:w="3744"/>
           </w:tcPr>
           <w:p>
             <w:pPr>
@@ -11312,13 +11571,13 @@
                 <w:color w:val="0000FF"/>
                 <w:sz w:val="18"/>
               </w:rPr>
-              <w:t>Scored firms ≤ 99th percentile of controls</w:t>
+              <w:t>Quadratic, total assets at g − 3</w:t>
             </w:r>
           </w:p>
         </w:tc>
         <w:tc>
           <w:tcPr>
-            <w:tcW w:type="dxa" w:w="1800"/>
+            <w:tcW w:type="dxa" w:w="1584"/>
           </w:tcPr>
           <w:p>
             <w:pPr>
@@ -11332,7 +11591,7 @@
                 <w:color w:val="0000FF"/>
                 <w:sz w:val="18"/>
               </w:rPr>
-              <w:t>−0.006</w:t>
+              <w:t>−0.008</w:t>
             </w:r>
             <w:r>
               <w:br/>
@@ -11342,13 +11601,13 @@
                 <w:color w:val="0000FF"/>
                 <w:sz w:val="18"/>
               </w:rPr>
-              <w:t>(0.024)</w:t>
+              <w:t>(0.025)</w:t>
             </w:r>
           </w:p>
         </w:tc>
         <w:tc>
           <w:tcPr>
-            <w:tcW w:type="dxa" w:w="1872"/>
+            <w:tcW w:type="dxa" w:w="1656"/>
           </w:tcPr>
           <w:p>
             <w:pPr>
@@ -11362,7 +11621,7 @@
                 <w:color w:val="0000FF"/>
                 <w:sz w:val="18"/>
               </w:rPr>
-              <w:t>−0.061**</w:t>
+              <w:t>−0.059*</w:t>
             </w:r>
             <w:r>
               <w:br/>
@@ -11372,13 +11631,13 @@
                 <w:color w:val="0000FF"/>
                 <w:sz w:val="18"/>
               </w:rPr>
-              <w:t>(0.031)</w:t>
+              <w:t>(0.032)</w:t>
             </w:r>
           </w:p>
         </w:tc>
         <w:tc>
           <w:tcPr>
-            <w:tcW w:type="dxa" w:w="1296"/>
+            <w:tcW w:type="dxa" w:w="1224"/>
           </w:tcPr>
           <w:p>
             <w:pPr>
@@ -11392,7 +11651,27 @@
                 <w:color w:val="0000FF"/>
                 <w:sz w:val="18"/>
               </w:rPr>
-              <w:t>586</w:t>
+              <w:t>592</w:t>
+            </w:r>
+          </w:p>
+        </w:tc>
+        <w:tc>
+          <w:tcPr>
+            <w:tcW w:type="dxa" w:w="1152"/>
+          </w:tcPr>
+          <w:p>
+            <w:pPr>
+              <w:keepNext/>
+              <w:spacing w:after="0" w:line="240" w:lineRule="auto"/>
+              <w:jc w:val="center"/>
+            </w:pPr>
+            <w:r/>
+            <w:r>
+              <w:rPr>
+                <w:color w:val="0000FF"/>
+                <w:sz w:val="18"/>
+              </w:rPr>
+              <w:t>2,396</w:t>
             </w:r>
           </w:p>
         </w:tc>
@@ -11403,7 +11682,7 @@
         </w:trPr>
         <w:tc>
           <w:tcPr>
-            <w:tcW w:type="dxa" w:w="4320"/>
+            <w:tcW w:type="dxa" w:w="3744"/>
           </w:tcPr>
           <w:p>
             <w:pPr>
@@ -11417,13 +11696,13 @@
                 <w:color w:val="0000FF"/>
                 <w:sz w:val="18"/>
               </w:rPr>
-              <w:t>Scored firms ≤ 95th percentile of controls</w:t>
+              <w:t>Scored firms ≤ 99th percentile of controls</w:t>
             </w:r>
           </w:p>
         </w:tc>
         <w:tc>
           <w:tcPr>
-            <w:tcW w:type="dxa" w:w="1800"/>
+            <w:tcW w:type="dxa" w:w="1584"/>
           </w:tcPr>
           <w:p>
             <w:pPr>
@@ -11437,7 +11716,7 @@
                 <w:color w:val="0000FF"/>
                 <w:sz w:val="18"/>
               </w:rPr>
-              <w:t>−0.021</w:t>
+              <w:t>−0.006</w:t>
             </w:r>
             <w:r>
               <w:br/>
@@ -11447,13 +11726,13 @@
                 <w:color w:val="0000FF"/>
                 <w:sz w:val="18"/>
               </w:rPr>
-              <w:t>(0.026)</w:t>
+              <w:t>(0.024)</w:t>
             </w:r>
           </w:p>
         </w:tc>
         <w:tc>
           <w:tcPr>
-            <w:tcW w:type="dxa" w:w="1872"/>
+            <w:tcW w:type="dxa" w:w="1656"/>
           </w:tcPr>
           <w:p>
             <w:pPr>
@@ -11467,7 +11746,7 @@
                 <w:color w:val="0000FF"/>
                 <w:sz w:val="18"/>
               </w:rPr>
-              <w:t>−0.096***</w:t>
+              <w:t>−0.061**</w:t>
             </w:r>
             <w:r>
               <w:br/>
@@ -11477,13 +11756,13 @@
                 <w:color w:val="0000FF"/>
                 <w:sz w:val="18"/>
               </w:rPr>
-              <w:t>(0.035)</w:t>
+              <w:t>(0.031)</w:t>
             </w:r>
           </w:p>
         </w:tc>
         <w:tc>
           <w:tcPr>
-            <w:tcW w:type="dxa" w:w="1296"/>
+            <w:tcW w:type="dxa" w:w="1224"/>
           </w:tcPr>
           <w:p>
             <w:pPr>
@@ -11497,7 +11776,27 @@
                 <w:color w:val="0000FF"/>
                 <w:sz w:val="18"/>
               </w:rPr>
-              <w:t>487</w:t>
+              <w:t>586</w:t>
+            </w:r>
+          </w:p>
+        </w:tc>
+        <w:tc>
+          <w:tcPr>
+            <w:tcW w:type="dxa" w:w="1152"/>
+          </w:tcPr>
+          <w:p>
+            <w:pPr>
+              <w:keepNext/>
+              <w:spacing w:after="0" w:line="240" w:lineRule="auto"/>
+              <w:jc w:val="center"/>
+            </w:pPr>
+            <w:r/>
+            <w:r>
+              <w:rPr>
+                <w:color w:val="0000FF"/>
+                <w:sz w:val="18"/>
+              </w:rPr>
+              <w:t>2,412</w:t>
             </w:r>
           </w:p>
         </w:tc>
@@ -11508,7 +11807,7 @@
         </w:trPr>
         <w:tc>
           <w:tcPr>
-            <w:tcW w:type="dxa" w:w="4320"/>
+            <w:tcW w:type="dxa" w:w="3744"/>
           </w:tcPr>
           <w:p>
             <w:pPr>
@@ -11522,13 +11821,13 @@
                 <w:color w:val="0000FF"/>
                 <w:sz w:val="18"/>
               </w:rPr>
-              <w:t>Scored firms ≤ 90th percentile of controls</w:t>
+              <w:t>Scored firms ≤ 95th percentile of controls</w:t>
             </w:r>
           </w:p>
         </w:tc>
         <w:tc>
           <w:tcPr>
-            <w:tcW w:type="dxa" w:w="1800"/>
+            <w:tcW w:type="dxa" w:w="1584"/>
           </w:tcPr>
           <w:p>
             <w:pPr>
@@ -11542,7 +11841,7 @@
                 <w:color w:val="0000FF"/>
                 <w:sz w:val="18"/>
               </w:rPr>
-              <w:t>−0.013</w:t>
+              <w:t>−0.021</w:t>
             </w:r>
             <w:r>
               <w:br/>
@@ -11552,13 +11851,13 @@
                 <w:color w:val="0000FF"/>
                 <w:sz w:val="18"/>
               </w:rPr>
-              <w:t>(0.028)</w:t>
+              <w:t>(0.026)</w:t>
             </w:r>
           </w:p>
         </w:tc>
         <w:tc>
           <w:tcPr>
-            <w:tcW w:type="dxa" w:w="1872"/>
+            <w:tcW w:type="dxa" w:w="1656"/>
           </w:tcPr>
           <w:p>
             <w:pPr>
@@ -11572,7 +11871,7 @@
                 <w:color w:val="0000FF"/>
                 <w:sz w:val="18"/>
               </w:rPr>
-              <w:t>−0.093**</w:t>
+              <w:t>−0.096***</w:t>
             </w:r>
             <w:r>
               <w:br/>
@@ -11582,13 +11881,13 @@
                 <w:color w:val="0000FF"/>
                 <w:sz w:val="18"/>
               </w:rPr>
-              <w:t>(0.039)</w:t>
+              <w:t>(0.035)</w:t>
             </w:r>
           </w:p>
         </w:tc>
         <w:tc>
           <w:tcPr>
-            <w:tcW w:type="dxa" w:w="1296"/>
+            <w:tcW w:type="dxa" w:w="1224"/>
           </w:tcPr>
           <w:p>
             <w:pPr>
@@ -11602,7 +11901,27 @@
                 <w:color w:val="0000FF"/>
                 <w:sz w:val="18"/>
               </w:rPr>
-              <w:t>420</w:t>
+              <w:t>487</w:t>
+            </w:r>
+          </w:p>
+        </w:tc>
+        <w:tc>
+          <w:tcPr>
+            <w:tcW w:type="dxa" w:w="1152"/>
+          </w:tcPr>
+          <w:p>
+            <w:pPr>
+              <w:keepNext/>
+              <w:spacing w:after="0" w:line="240" w:lineRule="auto"/>
+              <w:jc w:val="center"/>
+            </w:pPr>
+            <w:r/>
+            <w:r>
+              <w:rPr>
+                <w:color w:val="0000FF"/>
+                <w:sz w:val="18"/>
+              </w:rPr>
+              <w:t>2,412</w:t>
             </w:r>
           </w:p>
         </w:tc>
@@ -11613,7 +11932,7 @@
         </w:trPr>
         <w:tc>
           <w:tcPr>
-            <w:tcW w:type="dxa" w:w="4320"/>
+            <w:tcW w:type="dxa" w:w="3744"/>
           </w:tcPr>
           <w:p>
             <w:pPr>
@@ -11627,13 +11946,13 @@
                 <w:color w:val="0000FF"/>
                 <w:sz w:val="18"/>
               </w:rPr>
-              <w:t>Doubly robust, ≤ 95th percentile</w:t>
+              <w:t>Scored firms ≤ 90th percentile of controls</w:t>
             </w:r>
           </w:p>
         </w:tc>
         <w:tc>
           <w:tcPr>
-            <w:tcW w:type="dxa" w:w="1800"/>
+            <w:tcW w:type="dxa" w:w="1584"/>
           </w:tcPr>
           <w:p>
             <w:pPr>
@@ -11647,7 +11966,7 @@
                 <w:color w:val="0000FF"/>
                 <w:sz w:val="18"/>
               </w:rPr>
-              <w:t>−0.010</w:t>
+              <w:t>−0.013</w:t>
             </w:r>
             <w:r>
               <w:br/>
@@ -11657,13 +11976,13 @@
                 <w:color w:val="0000FF"/>
                 <w:sz w:val="18"/>
               </w:rPr>
-              <w:t>(0.027)</w:t>
+              <w:t>(0.028)</w:t>
             </w:r>
           </w:p>
         </w:tc>
         <w:tc>
           <w:tcPr>
-            <w:tcW w:type="dxa" w:w="1872"/>
+            <w:tcW w:type="dxa" w:w="1656"/>
           </w:tcPr>
           <w:p>
             <w:pPr>
@@ -11677,7 +11996,7 @@
                 <w:color w:val="0000FF"/>
                 <w:sz w:val="18"/>
               </w:rPr>
-              <w:t>−0.064*</w:t>
+              <w:t>−0.093**</w:t>
             </w:r>
             <w:r>
               <w:br/>
@@ -11687,13 +12006,13 @@
                 <w:color w:val="0000FF"/>
                 <w:sz w:val="18"/>
               </w:rPr>
-              <w:t>(0.034)</w:t>
+              <w:t>(0.039)</w:t>
             </w:r>
           </w:p>
         </w:tc>
         <w:tc>
           <w:tcPr>
-            <w:tcW w:type="dxa" w:w="1296"/>
+            <w:tcW w:type="dxa" w:w="1224"/>
           </w:tcPr>
           <w:p>
             <w:pPr>
@@ -11707,7 +12026,27 @@
                 <w:color w:val="0000FF"/>
                 <w:sz w:val="18"/>
               </w:rPr>
-              <w:t>487</w:t>
+              <w:t>420</w:t>
+            </w:r>
+          </w:p>
+        </w:tc>
+        <w:tc>
+          <w:tcPr>
+            <w:tcW w:type="dxa" w:w="1152"/>
+          </w:tcPr>
+          <w:p>
+            <w:pPr>
+              <w:keepNext/>
+              <w:spacing w:after="0" w:line="240" w:lineRule="auto"/>
+              <w:jc w:val="center"/>
+            </w:pPr>
+            <w:r/>
+            <w:r>
+              <w:rPr>
+                <w:color w:val="0000FF"/>
+                <w:sz w:val="18"/>
+              </w:rPr>
+              <w:t>2,407</w:t>
             </w:r>
           </w:p>
         </w:tc>
@@ -11718,7 +12057,132 @@
         </w:trPr>
         <w:tc>
           <w:tcPr>
-            <w:tcW w:type="dxa" w:w="4320"/>
+            <w:tcW w:type="dxa" w:w="3744"/>
+          </w:tcPr>
+          <w:p>
+            <w:pPr>
+              <w:keepNext/>
+              <w:spacing w:after="0" w:line="240" w:lineRule="auto"/>
+            </w:pPr>
+            <w:r/>
+            <w:r>
+              <w:rPr>
+                <w:b/>
+                <w:color w:val="0000FF"/>
+                <w:sz w:val="18"/>
+              </w:rPr>
+              <w:t>Doubly robust, ≤ 95th percentile</w:t>
+            </w:r>
+          </w:p>
+        </w:tc>
+        <w:tc>
+          <w:tcPr>
+            <w:tcW w:type="dxa" w:w="1584"/>
+          </w:tcPr>
+          <w:p>
+            <w:pPr>
+              <w:keepNext/>
+              <w:spacing w:after="0" w:line="240" w:lineRule="auto"/>
+              <w:jc w:val="center"/>
+            </w:pPr>
+            <w:r/>
+            <w:r>
+              <w:rPr>
+                <w:color w:val="0000FF"/>
+                <w:sz w:val="18"/>
+              </w:rPr>
+              <w:t>−0.010</w:t>
+            </w:r>
+            <w:r>
+              <w:br/>
+            </w:r>
+            <w:r>
+              <w:rPr>
+                <w:color w:val="0000FF"/>
+                <w:sz w:val="18"/>
+              </w:rPr>
+              <w:t>(0.027)</w:t>
+            </w:r>
+          </w:p>
+        </w:tc>
+        <w:tc>
+          <w:tcPr>
+            <w:tcW w:type="dxa" w:w="1656"/>
+          </w:tcPr>
+          <w:p>
+            <w:pPr>
+              <w:keepNext/>
+              <w:spacing w:after="0" w:line="240" w:lineRule="auto"/>
+              <w:jc w:val="center"/>
+            </w:pPr>
+            <w:r/>
+            <w:r>
+              <w:rPr>
+                <w:color w:val="0000FF"/>
+                <w:sz w:val="18"/>
+              </w:rPr>
+              <w:t>−0.064*</w:t>
+            </w:r>
+            <w:r>
+              <w:br/>
+            </w:r>
+            <w:r>
+              <w:rPr>
+                <w:color w:val="0000FF"/>
+                <w:sz w:val="18"/>
+              </w:rPr>
+              <w:t>(0.034)</w:t>
+            </w:r>
+          </w:p>
+        </w:tc>
+        <w:tc>
+          <w:tcPr>
+            <w:tcW w:type="dxa" w:w="1224"/>
+          </w:tcPr>
+          <w:p>
+            <w:pPr>
+              <w:keepNext/>
+              <w:spacing w:after="0" w:line="240" w:lineRule="auto"/>
+              <w:jc w:val="center"/>
+            </w:pPr>
+            <w:r/>
+            <w:r>
+              <w:rPr>
+                <w:color w:val="0000FF"/>
+                <w:sz w:val="18"/>
+              </w:rPr>
+              <w:t>487</w:t>
+            </w:r>
+          </w:p>
+        </w:tc>
+        <w:tc>
+          <w:tcPr>
+            <w:tcW w:type="dxa" w:w="1152"/>
+          </w:tcPr>
+          <w:p>
+            <w:pPr>
+              <w:keepNext/>
+              <w:spacing w:after="0" w:line="240" w:lineRule="auto"/>
+              <w:jc w:val="center"/>
+            </w:pPr>
+            <w:r/>
+            <w:r>
+              <w:rPr>
+                <w:color w:val="0000FF"/>
+                <w:sz w:val="18"/>
+              </w:rPr>
+              <w:t>2,412</w:t>
+            </w:r>
+          </w:p>
+        </w:tc>
+      </w:tr>
+      <w:tr>
+        <w:trPr>
+          <w:cantSplit/>
+        </w:trPr>
+        <w:tc>
+          <w:tcPr>
+            <w:tcW w:type="dxa" w:w="3744"/>
             <w:tcBorders>
               <w:bottom w:val="single" w:sz="6" w:color="000000"/>
             </w:tcBorders>
@@ -11740,7 +12204,7 @@
         </w:tc>
         <w:tc>
           <w:tcPr>
-            <w:tcW w:type="dxa" w:w="1800"/>
+            <w:tcW w:type="dxa" w:w="1584"/>
             <w:tcBorders>
               <w:bottom w:val="single" w:sz="6" w:color="000000"/>
             </w:tcBorders>
@@ -11772,7 +12236,7 @@
         </w:tc>
         <w:tc>
           <w:tcPr>
-            <w:tcW w:type="dxa" w:w="1872"/>
+            <w:tcW w:type="dxa" w:w="1656"/>
             <w:tcBorders>
               <w:bottom w:val="single" w:sz="6" w:color="000000"/>
             </w:tcBorders>
@@ -11804,7 +12268,7 @@
         </w:tc>
         <w:tc>
           <w:tcPr>
-            <w:tcW w:type="dxa" w:w="1296"/>
+            <w:tcW w:type="dxa" w:w="1224"/>
             <w:tcBorders>
               <w:bottom w:val="single" w:sz="6" w:color="000000"/>
             </w:tcBorders>
@@ -11821,6 +12285,28 @@
                 <w:sz w:val="18"/>
               </w:rPr>
               <w:t>420</w:t>
+            </w:r>
+          </w:p>
+        </w:tc>
+        <w:tc>
+          <w:tcPr>
+            <w:tcW w:type="dxa" w:w="1152"/>
+            <w:tcBorders>
+              <w:bottom w:val="single" w:sz="6" w:color="000000"/>
+            </w:tcBorders>
+          </w:tcPr>
+          <w:p>
+            <w:pPr>
+              <w:spacing w:after="0" w:line="240" w:lineRule="auto"/>
+              <w:jc w:val="center"/>
+            </w:pPr>
+            <w:r/>
+            <w:r>
+              <w:rPr>
+                <w:color w:val="0000FF"/>
+                <w:sz w:val="18"/>
+              </w:rPr>
+              <w:t>2,407</w:t>
             </w:r>
           </w:p>
         </w:tc>
@@ -13061,7 +13547,7 @@
         <w:rPr>
           <w:color w:val="0000FF"/>
         </w:rPr>
-        <w:t>Firm-years without one are more often highly levered (book leverage above 0.5 in 25.4% of never-scored firm-years without an MTB ratio, against 8.4% with one) and more often Indonesian (38.9% against 24.1%; Table S8 of the supplementary material).</w:t>
+        <w:t>Firm-years without one are more often highly levered (book leverage above 0.5 in 25.4% of never-scored firm-years without an MTB ratio, against 8.4% with one) and more often Indonesian (36.2% against 24.1%; Table S8 of the supplementary material).</w:t>
       </w:r>
       <w:r>
         <w:rPr/>
@@ -13071,7 +13557,7 @@
         <w:rPr>
           <w:color w:val="0000FF"/>
         </w:rPr>
-        <w:t>Only 21.5% of never-scored and 24.8% of scored firm-years without an MTB ratio have a market capitalization, so most gaps are missing market data, not negative book equity alone.</w:t>
+        <w:t>Only 36.7% of never-scored and 36.6% of scored firm-years without an MTB ratio have a market capitalization, so most gaps are missing market data, not negative book equity alone.</w:t>
       </w:r>
       <w:r>
         <w:rPr/>
@@ -13165,10 +13651,11 @@
         <w:tblLook w:firstColumn="1" w:firstRow="1" w:lastColumn="0" w:lastRow="0" w:noHBand="0" w:noVBand="1" w:val="04A0"/>
       </w:tblPr>
       <w:tblGrid>
-        <w:gridCol w:w="4608"/>
-        <w:gridCol w:w="1728"/>
-        <w:gridCol w:w="1800"/>
+        <w:gridCol w:w="3888"/>
+        <w:gridCol w:w="1584"/>
+        <w:gridCol w:w="1655"/>
         <w:gridCol w:w="1152"/>
+        <w:gridCol w:w="1080"/>
       </w:tblGrid>
       <w:tr>
         <w:trPr>
@@ -13177,7 +13664,7 @@
         </w:trPr>
         <w:tc>
           <w:tcPr>
-            <w:tcW w:type="dxa" w:w="4608"/>
+            <w:tcW w:type="dxa" w:w="3888"/>
             <w:tcBorders>
               <w:top w:val="single" w:sz="6" w:color="000000"/>
               <w:bottom w:val="single" w:sz="6" w:color="000000"/>
@@ -13201,7 +13688,7 @@
         </w:tc>
         <w:tc>
           <w:tcPr>
-            <w:tcW w:type="dxa" w:w="1728"/>
+            <w:tcW w:type="dxa" w:w="1584"/>
             <w:tcBorders>
               <w:top w:val="single" w:sz="6" w:color="000000"/>
               <w:bottom w:val="single" w:sz="6" w:color="000000"/>
@@ -13226,7 +13713,7 @@
         </w:tc>
         <w:tc>
           <w:tcPr>
-            <w:tcW w:type="dxa" w:w="1800"/>
+            <w:tcW w:type="dxa" w:w="1656"/>
             <w:tcBorders>
               <w:top w:val="single" w:sz="6" w:color="000000"/>
               <w:bottom w:val="single" w:sz="6" w:color="000000"/>
@@ -13274,34 +13761,13 @@
             </w:r>
           </w:p>
         </w:tc>
-      </w:tr>
-      <w:tr>
-        <w:trPr>
-          <w:cantSplit/>
-        </w:trPr>
         <w:tc>
           <w:tcPr>
-            <w:tcW w:type="dxa" w:w="4608"/>
-          </w:tcPr>
-          <w:p>
-            <w:pPr>
-              <w:keepNext/>
-              <w:spacing w:after="0" w:line="240" w:lineRule="auto"/>
-            </w:pPr>
-            <w:r/>
-            <w:r>
-              <w:rPr>
-                <w:b/>
-                <w:color w:val="0000FF"/>
-                <w:sz w:val="18"/>
-              </w:rPr>
-              <w:t>Baseline</w:t>
-            </w:r>
-          </w:p>
-        </w:tc>
-        <w:tc>
-          <w:tcPr>
-            <w:tcW w:type="dxa" w:w="1728"/>
+            <w:tcW w:type="dxa" w:w="1080"/>
+            <w:tcBorders>
+              <w:top w:val="single" w:sz="6" w:color="000000"/>
+              <w:bottom w:val="single" w:sz="6" w:color="000000"/>
+            </w:tcBorders>
           </w:tcPr>
           <w:p>
             <w:pPr>
@@ -13312,26 +13778,72 @@
             <w:r/>
             <w:r>
               <w:rPr>
+                <w:b/>
                 <w:color w:val="0000FF"/>
                 <w:sz w:val="18"/>
               </w:rPr>
-              <w:t>0.002</w:t>
-            </w:r>
-            <w:r>
-              <w:br/>
-            </w:r>
-            <w:r>
-              <w:rPr>
+              <w:t>Control firms</w:t>
+            </w:r>
+          </w:p>
+        </w:tc>
+      </w:tr>
+      <w:tr>
+        <w:trPr>
+          <w:cantSplit/>
+        </w:trPr>
+        <w:tc>
+          <w:tcPr>
+            <w:tcW w:type="dxa" w:w="3888"/>
+          </w:tcPr>
+          <w:p>
+            <w:pPr>
+              <w:keepNext/>
+              <w:spacing w:after="0" w:line="240" w:lineRule="auto"/>
+            </w:pPr>
+            <w:r/>
+            <w:r>
+              <w:rPr>
+                <w:b/>
                 <w:color w:val="0000FF"/>
                 <w:sz w:val="18"/>
               </w:rPr>
-              <w:t>(0.024)</w:t>
+              <w:t>Baseline</w:t>
             </w:r>
           </w:p>
         </w:tc>
         <w:tc>
           <w:tcPr>
-            <w:tcW w:type="dxa" w:w="1800"/>
+            <w:tcW w:type="dxa" w:w="1584"/>
+          </w:tcPr>
+          <w:p>
+            <w:pPr>
+              <w:keepNext/>
+              <w:spacing w:after="0" w:line="240" w:lineRule="auto"/>
+              <w:jc w:val="center"/>
+            </w:pPr>
+            <w:r/>
+            <w:r>
+              <w:rPr>
+                <w:color w:val="0000FF"/>
+                <w:sz w:val="18"/>
+              </w:rPr>
+              <w:t>0.002</w:t>
+            </w:r>
+            <w:r>
+              <w:br/>
+            </w:r>
+            <w:r>
+              <w:rPr>
+                <w:color w:val="0000FF"/>
+                <w:sz w:val="18"/>
+              </w:rPr>
+              <w:t>(0.024)</w:t>
+            </w:r>
+          </w:p>
+        </w:tc>
+        <w:tc>
+          <w:tcPr>
+            <w:tcW w:type="dxa" w:w="1656"/>
           </w:tcPr>
           <w:p>
             <w:pPr>
@@ -13379,6 +13891,26 @@
             </w:r>
           </w:p>
         </w:tc>
+        <w:tc>
+          <w:tcPr>
+            <w:tcW w:type="dxa" w:w="1080"/>
+          </w:tcPr>
+          <w:p>
+            <w:pPr>
+              <w:keepNext/>
+              <w:spacing w:after="0" w:line="240" w:lineRule="auto"/>
+              <w:jc w:val="center"/>
+            </w:pPr>
+            <w:r/>
+            <w:r>
+              <w:rPr>
+                <w:color w:val="0000FF"/>
+                <w:sz w:val="18"/>
+              </w:rPr>
+              <w:t>2,412</w:t>
+            </w:r>
+          </w:p>
+        </w:tc>
       </w:tr>
       <w:tr>
         <w:trPr>
@@ -13386,7 +13918,7 @@
         </w:trPr>
         <w:tc>
           <w:tcPr>
-            <w:tcW w:type="dxa" w:w="4608"/>
+            <w:tcW w:type="dxa" w:w="3888"/>
           </w:tcPr>
           <w:p>
             <w:pPr>
@@ -13406,7 +13938,7 @@
         </w:tc>
         <w:tc>
           <w:tcPr>
-            <w:tcW w:type="dxa" w:w="1728"/>
+            <w:tcW w:type="dxa" w:w="1584"/>
           </w:tcPr>
           <w:p>
             <w:pPr>
@@ -13419,7 +13951,7 @@
         </w:tc>
         <w:tc>
           <w:tcPr>
-            <w:tcW w:type="dxa" w:w="1800"/>
+            <w:tcW w:type="dxa" w:w="1656"/>
           </w:tcPr>
           <w:p>
             <w:pPr>
@@ -13467,34 +13999,9 @@
             </w:r>
           </w:p>
         </w:tc>
-      </w:tr>
-      <w:tr>
-        <w:trPr>
-          <w:cantSplit/>
-        </w:trPr>
         <w:tc>
           <w:tcPr>
-            <w:tcW w:type="dxa" w:w="4608"/>
-          </w:tcPr>
-          <w:p>
-            <w:pPr>
-              <w:keepNext/>
-              <w:spacing w:after="0" w:line="240" w:lineRule="auto"/>
-            </w:pPr>
-            <w:r/>
-            <w:r>
-              <w:rPr>
-                <w:b/>
-                <w:color w:val="0000FF"/>
-                <w:sz w:val="18"/>
-              </w:rPr>
-              <w:t>Complete MTB series, scored and control firms</w:t>
-            </w:r>
-          </w:p>
-        </w:tc>
-        <w:tc>
-          <w:tcPr>
-            <w:tcW w:type="dxa" w:w="1728"/>
+            <w:tcW w:type="dxa" w:w="1080"/>
           </w:tcPr>
           <w:p>
             <w:pPr>
@@ -13508,23 +14015,68 @@
                 <w:color w:val="0000FF"/>
                 <w:sz w:val="18"/>
               </w:rPr>
-              <w:t>0.008</w:t>
-            </w:r>
-            <w:r>
-              <w:br/>
-            </w:r>
-            <w:r>
-              <w:rPr>
+              <w:t>2,409</w:t>
+            </w:r>
+          </w:p>
+        </w:tc>
+      </w:tr>
+      <w:tr>
+        <w:trPr>
+          <w:cantSplit/>
+        </w:trPr>
+        <w:tc>
+          <w:tcPr>
+            <w:tcW w:type="dxa" w:w="3888"/>
+          </w:tcPr>
+          <w:p>
+            <w:pPr>
+              <w:keepNext/>
+              <w:spacing w:after="0" w:line="240" w:lineRule="auto"/>
+            </w:pPr>
+            <w:r/>
+            <w:r>
+              <w:rPr>
+                <w:b/>
                 <w:color w:val="0000FF"/>
                 <w:sz w:val="18"/>
               </w:rPr>
-              <w:t>(0.025)</w:t>
+              <w:t>Complete MTB series, scored and control firms</w:t>
             </w:r>
           </w:p>
         </w:tc>
         <w:tc>
           <w:tcPr>
-            <w:tcW w:type="dxa" w:w="1800"/>
+            <w:tcW w:type="dxa" w:w="1584"/>
+          </w:tcPr>
+          <w:p>
+            <w:pPr>
+              <w:keepNext/>
+              <w:spacing w:after="0" w:line="240" w:lineRule="auto"/>
+              <w:jc w:val="center"/>
+            </w:pPr>
+            <w:r/>
+            <w:r>
+              <w:rPr>
+                <w:color w:val="0000FF"/>
+                <w:sz w:val="18"/>
+              </w:rPr>
+              <w:t>0.008</w:t>
+            </w:r>
+            <w:r>
+              <w:br/>
+            </w:r>
+            <w:r>
+              <w:rPr>
+                <w:color w:val="0000FF"/>
+                <w:sz w:val="18"/>
+              </w:rPr>
+              <w:t>(0.025)</w:t>
+            </w:r>
+          </w:p>
+        </w:tc>
+        <w:tc>
+          <w:tcPr>
+            <w:tcW w:type="dxa" w:w="1656"/>
           </w:tcPr>
           <w:p>
             <w:pPr>
@@ -13555,34 +14107,9 @@
             </w:r>
           </w:p>
         </w:tc>
-      </w:tr>
-      <w:tr>
-        <w:trPr>
-          <w:cantSplit/>
-        </w:trPr>
         <w:tc>
           <w:tcPr>
-            <w:tcW w:type="dxa" w:w="4608"/>
-          </w:tcPr>
-          <w:p>
-            <w:pPr>
-              <w:keepNext/>
-              <w:spacing w:after="0" w:line="240" w:lineRule="auto"/>
-            </w:pPr>
-            <w:r/>
-            <w:r>
-              <w:rPr>
-                <w:b/>
-                <w:color w:val="0000FF"/>
-                <w:sz w:val="18"/>
-              </w:rPr>
-              <w:t>Complete MTB series, scored firms only</w:t>
-            </w:r>
-          </w:p>
-        </w:tc>
-        <w:tc>
-          <w:tcPr>
-            <w:tcW w:type="dxa" w:w="1728"/>
+            <w:tcW w:type="dxa" w:w="1080"/>
           </w:tcPr>
           <w:p>
             <w:pPr>
@@ -13596,23 +14123,68 @@
                 <w:color w:val="0000FF"/>
                 <w:sz w:val="18"/>
               </w:rPr>
-              <w:t>0.006</w:t>
-            </w:r>
-            <w:r>
-              <w:br/>
-            </w:r>
-            <w:r>
-              <w:rPr>
+              <w:t>1,152</w:t>
+            </w:r>
+          </w:p>
+        </w:tc>
+      </w:tr>
+      <w:tr>
+        <w:trPr>
+          <w:cantSplit/>
+        </w:trPr>
+        <w:tc>
+          <w:tcPr>
+            <w:tcW w:type="dxa" w:w="3888"/>
+          </w:tcPr>
+          <w:p>
+            <w:pPr>
+              <w:keepNext/>
+              <w:spacing w:after="0" w:line="240" w:lineRule="auto"/>
+            </w:pPr>
+            <w:r/>
+            <w:r>
+              <w:rPr>
+                <w:b/>
                 <w:color w:val="0000FF"/>
                 <w:sz w:val="18"/>
               </w:rPr>
-              <w:t>(0.024)</w:t>
+              <w:t>Complete MTB series, scored firms only</w:t>
             </w:r>
           </w:p>
         </w:tc>
         <w:tc>
           <w:tcPr>
-            <w:tcW w:type="dxa" w:w="1800"/>
+            <w:tcW w:type="dxa" w:w="1584"/>
+          </w:tcPr>
+          <w:p>
+            <w:pPr>
+              <w:keepNext/>
+              <w:spacing w:after="0" w:line="240" w:lineRule="auto"/>
+              <w:jc w:val="center"/>
+            </w:pPr>
+            <w:r/>
+            <w:r>
+              <w:rPr>
+                <w:color w:val="0000FF"/>
+                <w:sz w:val="18"/>
+              </w:rPr>
+              <w:t>0.006</w:t>
+            </w:r>
+            <w:r>
+              <w:br/>
+            </w:r>
+            <w:r>
+              <w:rPr>
+                <w:color w:val="0000FF"/>
+                <w:sz w:val="18"/>
+              </w:rPr>
+              <w:t>(0.024)</w:t>
+            </w:r>
+          </w:p>
+        </w:tc>
+        <w:tc>
+          <w:tcPr>
+            <w:tcW w:type="dxa" w:w="1656"/>
           </w:tcPr>
           <w:p>
             <w:pPr>
@@ -13643,34 +14215,9 @@
             </w:r>
           </w:p>
         </w:tc>
-      </w:tr>
-      <w:tr>
-        <w:trPr>
-          <w:cantSplit/>
-        </w:trPr>
         <w:tc>
           <w:tcPr>
-            <w:tcW w:type="dxa" w:w="4608"/>
-          </w:tcPr>
-          <w:p>
-            <w:pPr>
-              <w:keepNext/>
-              <w:spacing w:after="0" w:line="240" w:lineRule="auto"/>
-            </w:pPr>
-            <w:r/>
-            <w:r>
-              <w:rPr>
-                <w:b/>
-                <w:color w:val="0000FF"/>
-                <w:sz w:val="18"/>
-              </w:rPr>
-              <w:t>Flagged firm-years removed</w:t>
-            </w:r>
-          </w:p>
-        </w:tc>
-        <w:tc>
-          <w:tcPr>
-            <w:tcW w:type="dxa" w:w="1728"/>
+            <w:tcW w:type="dxa" w:w="1080"/>
           </w:tcPr>
           <w:p>
             <w:pPr>
@@ -13684,23 +14231,68 @@
                 <w:color w:val="0000FF"/>
                 <w:sz w:val="18"/>
               </w:rPr>
-              <w:t>−0.007</w:t>
-            </w:r>
-            <w:r>
-              <w:br/>
-            </w:r>
-            <w:r>
-              <w:rPr>
+              <w:t>2,412</w:t>
+            </w:r>
+          </w:p>
+        </w:tc>
+      </w:tr>
+      <w:tr>
+        <w:trPr>
+          <w:cantSplit/>
+        </w:trPr>
+        <w:tc>
+          <w:tcPr>
+            <w:tcW w:type="dxa" w:w="3888"/>
+          </w:tcPr>
+          <w:p>
+            <w:pPr>
+              <w:keepNext/>
+              <w:spacing w:after="0" w:line="240" w:lineRule="auto"/>
+            </w:pPr>
+            <w:r/>
+            <w:r>
+              <w:rPr>
+                <w:b/>
                 <w:color w:val="0000FF"/>
                 <w:sz w:val="18"/>
               </w:rPr>
-              <w:t>(0.024)</w:t>
+              <w:t>Flagged firm-years removed</w:t>
             </w:r>
           </w:p>
         </w:tc>
         <w:tc>
           <w:tcPr>
-            <w:tcW w:type="dxa" w:w="1800"/>
+            <w:tcW w:type="dxa" w:w="1584"/>
+          </w:tcPr>
+          <w:p>
+            <w:pPr>
+              <w:keepNext/>
+              <w:spacing w:after="0" w:line="240" w:lineRule="auto"/>
+              <w:jc w:val="center"/>
+            </w:pPr>
+            <w:r/>
+            <w:r>
+              <w:rPr>
+                <w:color w:val="0000FF"/>
+                <w:sz w:val="18"/>
+              </w:rPr>
+              <w:t>−0.007</w:t>
+            </w:r>
+            <w:r>
+              <w:br/>
+            </w:r>
+            <w:r>
+              <w:rPr>
+                <w:color w:val="0000FF"/>
+                <w:sz w:val="18"/>
+              </w:rPr>
+              <w:t>(0.024)</w:t>
+            </w:r>
+          </w:p>
+        </w:tc>
+        <w:tc>
+          <w:tcPr>
+            <w:tcW w:type="dxa" w:w="1656"/>
           </w:tcPr>
           <w:p>
             <w:pPr>
@@ -13748,34 +14340,9 @@
             </w:r>
           </w:p>
         </w:tc>
-      </w:tr>
-      <w:tr>
-        <w:trPr>
-          <w:cantSplit/>
-        </w:trPr>
         <w:tc>
           <w:tcPr>
-            <w:tcW w:type="dxa" w:w="4608"/>
-          </w:tcPr>
-          <w:p>
-            <w:pPr>
-              <w:keepNext/>
-              <w:spacing w:after="0" w:line="240" w:lineRule="auto"/>
-            </w:pPr>
-            <w:r/>
-            <w:r>
-              <w:rPr>
-                <w:b/>
-                <w:color w:val="0000FF"/>
-                <w:sz w:val="18"/>
-              </w:rPr>
-              <w:t>Firms with any flagged year removed</w:t>
-            </w:r>
-          </w:p>
-        </w:tc>
-        <w:tc>
-          <w:tcPr>
-            <w:tcW w:type="dxa" w:w="1728"/>
+            <w:tcW w:type="dxa" w:w="1080"/>
           </w:tcPr>
           <w:p>
             <w:pPr>
@@ -13789,23 +14356,68 @@
                 <w:color w:val="0000FF"/>
                 <w:sz w:val="18"/>
               </w:rPr>
-              <w:t>−0.008</w:t>
-            </w:r>
-            <w:r>
-              <w:br/>
-            </w:r>
-            <w:r>
-              <w:rPr>
+              <w:t>2,408</w:t>
+            </w:r>
+          </w:p>
+        </w:tc>
+      </w:tr>
+      <w:tr>
+        <w:trPr>
+          <w:cantSplit/>
+        </w:trPr>
+        <w:tc>
+          <w:tcPr>
+            <w:tcW w:type="dxa" w:w="3888"/>
+          </w:tcPr>
+          <w:p>
+            <w:pPr>
+              <w:keepNext/>
+              <w:spacing w:after="0" w:line="240" w:lineRule="auto"/>
+            </w:pPr>
+            <w:r/>
+            <w:r>
+              <w:rPr>
+                <w:b/>
                 <w:color w:val="0000FF"/>
                 <w:sz w:val="18"/>
               </w:rPr>
-              <w:t>(0.024)</w:t>
+              <w:t>Firms with any flagged year removed</w:t>
             </w:r>
           </w:p>
         </w:tc>
         <w:tc>
           <w:tcPr>
-            <w:tcW w:type="dxa" w:w="1800"/>
+            <w:tcW w:type="dxa" w:w="1584"/>
+          </w:tcPr>
+          <w:p>
+            <w:pPr>
+              <w:keepNext/>
+              <w:spacing w:after="0" w:line="240" w:lineRule="auto"/>
+              <w:jc w:val="center"/>
+            </w:pPr>
+            <w:r/>
+            <w:r>
+              <w:rPr>
+                <w:color w:val="0000FF"/>
+                <w:sz w:val="18"/>
+              </w:rPr>
+              <w:t>−0.008</w:t>
+            </w:r>
+            <w:r>
+              <w:br/>
+            </w:r>
+            <w:r>
+              <w:rPr>
+                <w:color w:val="0000FF"/>
+                <w:sz w:val="18"/>
+              </w:rPr>
+              <w:t>(0.024)</w:t>
+            </w:r>
+          </w:p>
+        </w:tc>
+        <w:tc>
+          <w:tcPr>
+            <w:tcW w:type="dxa" w:w="1656"/>
           </w:tcPr>
           <w:p>
             <w:pPr>
@@ -13853,34 +14465,9 @@
             </w:r>
           </w:p>
         </w:tc>
-      </w:tr>
-      <w:tr>
-        <w:trPr>
-          <w:cantSplit/>
-        </w:trPr>
         <w:tc>
           <w:tcPr>
-            <w:tcW w:type="dxa" w:w="4608"/>
-          </w:tcPr>
-          <w:p>
-            <w:pPr>
-              <w:keepNext/>
-              <w:spacing w:after="0" w:line="240" w:lineRule="auto"/>
-            </w:pPr>
-            <w:r/>
-            <w:r>
-              <w:rPr>
-                <w:b/>
-                <w:color w:val="0000FF"/>
-                <w:sz w:val="18"/>
-              </w:rPr>
-              <w:t>Firm-years with implied book equity above twice total assets removed</w:t>
-            </w:r>
-          </w:p>
-        </w:tc>
-        <w:tc>
-          <w:tcPr>
-            <w:tcW w:type="dxa" w:w="1728"/>
+            <w:tcW w:type="dxa" w:w="1080"/>
           </w:tcPr>
           <w:p>
             <w:pPr>
@@ -13894,23 +14481,68 @@
                 <w:color w:val="0000FF"/>
                 <w:sz w:val="18"/>
               </w:rPr>
-              <w:t>−0.019</w:t>
-            </w:r>
-            <w:r>
-              <w:br/>
-            </w:r>
-            <w:r>
-              <w:rPr>
+              <w:t>2,385</w:t>
+            </w:r>
+          </w:p>
+        </w:tc>
+      </w:tr>
+      <w:tr>
+        <w:trPr>
+          <w:cantSplit/>
+        </w:trPr>
+        <w:tc>
+          <w:tcPr>
+            <w:tcW w:type="dxa" w:w="3888"/>
+          </w:tcPr>
+          <w:p>
+            <w:pPr>
+              <w:keepNext/>
+              <w:spacing w:after="0" w:line="240" w:lineRule="auto"/>
+            </w:pPr>
+            <w:r/>
+            <w:r>
+              <w:rPr>
+                <w:b/>
                 <w:color w:val="0000FF"/>
                 <w:sz w:val="18"/>
               </w:rPr>
-              <w:t>(0.023)</w:t>
+              <w:t>Firm-years with implied book equity above twice total assets removed</w:t>
             </w:r>
           </w:p>
         </w:tc>
         <w:tc>
           <w:tcPr>
-            <w:tcW w:type="dxa" w:w="1800"/>
+            <w:tcW w:type="dxa" w:w="1584"/>
+          </w:tcPr>
+          <w:p>
+            <w:pPr>
+              <w:keepNext/>
+              <w:spacing w:after="0" w:line="240" w:lineRule="auto"/>
+              <w:jc w:val="center"/>
+            </w:pPr>
+            <w:r/>
+            <w:r>
+              <w:rPr>
+                <w:color w:val="0000FF"/>
+                <w:sz w:val="18"/>
+              </w:rPr>
+              <w:t>−0.019</w:t>
+            </w:r>
+            <w:r>
+              <w:br/>
+            </w:r>
+            <w:r>
+              <w:rPr>
+                <w:color w:val="0000FF"/>
+                <w:sz w:val="18"/>
+              </w:rPr>
+              <w:t>(0.023)</w:t>
+            </w:r>
+          </w:p>
+        </w:tc>
+        <w:tc>
+          <w:tcPr>
+            <w:tcW w:type="dxa" w:w="1656"/>
           </w:tcPr>
           <w:p>
             <w:pPr>
@@ -13958,6 +14590,26 @@
             </w:r>
           </w:p>
         </w:tc>
+        <w:tc>
+          <w:tcPr>
+            <w:tcW w:type="dxa" w:w="1080"/>
+          </w:tcPr>
+          <w:p>
+            <w:pPr>
+              <w:keepNext/>
+              <w:spacing w:after="0" w:line="240" w:lineRule="auto"/>
+              <w:jc w:val="center"/>
+            </w:pPr>
+            <w:r/>
+            <w:r>
+              <w:rPr>
+                <w:color w:val="0000FF"/>
+                <w:sz w:val="18"/>
+              </w:rPr>
+              <w:t>2,393</w:t>
+            </w:r>
+          </w:p>
+        </w:tc>
       </w:tr>
       <w:tr>
         <w:trPr>
@@ -13965,7 +14617,7 @@
         </w:trPr>
         <w:tc>
           <w:tcPr>
-            <w:tcW w:type="dxa" w:w="4608"/>
+            <w:tcW w:type="dxa" w:w="3888"/>
             <w:tcBorders>
               <w:bottom w:val="single" w:sz="6" w:color="000000"/>
             </w:tcBorders>
@@ -13987,7 +14639,7 @@
         </w:tc>
         <w:tc>
           <w:tcPr>
-            <w:tcW w:type="dxa" w:w="1728"/>
+            <w:tcW w:type="dxa" w:w="1584"/>
             <w:tcBorders>
               <w:bottom w:val="single" w:sz="6" w:color="000000"/>
             </w:tcBorders>
@@ -14019,7 +14671,7 @@
         </w:tc>
         <w:tc>
           <w:tcPr>
-            <w:tcW w:type="dxa" w:w="1800"/>
+            <w:tcW w:type="dxa" w:w="1656"/>
             <w:tcBorders>
               <w:bottom w:val="single" w:sz="6" w:color="000000"/>
             </w:tcBorders>
@@ -14071,6 +14723,28 @@
             </w:r>
           </w:p>
         </w:tc>
+        <w:tc>
+          <w:tcPr>
+            <w:tcW w:type="dxa" w:w="1080"/>
+            <w:tcBorders>
+              <w:bottom w:val="single" w:sz="6" w:color="000000"/>
+            </w:tcBorders>
+          </w:tcPr>
+          <w:p>
+            <w:pPr>
+              <w:spacing w:after="0" w:line="240" w:lineRule="auto"/>
+              <w:jc w:val="center"/>
+            </w:pPr>
+            <w:r/>
+            <w:r>
+              <w:rPr>
+                <w:color w:val="0000FF"/>
+                <w:sz w:val="18"/>
+              </w:rPr>
+              <w:t>2,412</w:t>
+            </w:r>
+          </w:p>
+        </w:tc>
       </w:tr>
     </w:tbl>
     <w:p>
@@ -14631,7 +15305,7 @@
         <w:rPr>
           <w:color w:val="0000FF"/>
         </w:rPr>
-        <w:t>Fifth, MTB ratios are missing for about a quarter of firm-years, more often for distressed and Indonesian firms, and some market capitalization records contain scale errors.</w:t>
+        <w:t>Fifth, MTB ratios are missing for 18.5% of never-scored and 9.0% of scored listed firm-years, more often for distressed and Indonesian firms, and some market capitalization records contain scale errors.</w:t>
       </w:r>
       <w:r>
         <w:rPr/>
@@ -14701,7 +15375,7 @@
         <w:rPr>
           <w:color w:val="0000FF"/>
         </w:rPr>
-        <w:t>The firms that received a first recorded score were larger than never-scored firms, and on average their market-to-book ratio had grown 10.0% more than that of similar firms over the five years before entry.</w:t>
+        <w:t>The firms that received a first recorded score were larger than never-scored firms, and on average their market-to-book ratio had grown 10.0% more than that of similar firms from five years to one year before entry.</w:t>
       </w:r>
       <w:r>
         <w:rPr/>

</xml_diff>

<commit_message>
Literature works cited again where findings are discussed; no forward section references (user rules)
Co-Authored-By: Claude Opus 5.5 <noreply@anthropic.com>
Claude-Session: https://claude.ai/code/session_01Ny4MKFPCnQG8RbtvfHQ86Z
</commit_message>
<xml_diff>
--- a/SAJE_292892_revision/build_r4/02_Manuscript_Revised_Marked_blue.docx
+++ b/SAJE_292892_revision/build_r4/02_Manuscript_Revised_Marked_blue.docx
@@ -274,7 +274,7 @@
         <w:rPr>
           <w:color w:val="0000FF"/>
         </w:rPr>
-        <w:t>The first recorded score is not necessarily the date on which investors could first see the score (Section 3.3).</w:t>
+        <w:t>The first recorded score is not necessarily the date on which investors could first see the score.</w:t>
       </w:r>
       <w:r>
         <w:rPr/>
@@ -1904,7 +1904,7 @@
         <w:rPr>
           <w:color w:val="0000FF"/>
         </w:rPr>
-        <w:t>The pooled sample violates the analogous condition before the base year (Section 5.2).</w:t>
+        <w:t>In the pooled sample, however, scored firms grew faster than comparable never-scored firms before the base year.</w:t>
       </w:r>
       <w:r>
         <w:rPr/>
@@ -2205,7 +2205,7 @@
         <w:rPr>
           <w:color w:val="0000FF"/>
         </w:rPr>
-        <w:t>Outcome regression does not remove this support problem; it extrapolates the relation estimated among controls to scored firms larger than most controls, so Section 5.6 restricts scored firms to the size range of the controls, in the spirit of the overlap trimming of Crump et al. (2009).</w:t>
+        <w:t>Outcome regression does not remove this support problem; it extrapolates the relation estimated among controls to scored firms larger than most controls, so we also restrict scored firms to the size range of the controls, in the spirit of the overlap trimming of Crump et al. (2009).</w:t>
       </w:r>
       <w:r>
         <w:rPr/>
@@ -3063,7 +3063,7 @@
         <w:rPr>
           <w:color w:val="0000FF"/>
         </w:rPr>
-        <w:t>Because we measure the covariates in the base year, at the end of any run-up, conditioning on base-year total assets can absorb part of the run-up; Section 5.6 varies this choice.</w:t>
+        <w:t>Because we measure the covariates in the base year, at the end of any run-up, conditioning on base-year total assets can absorb part of the run-up, so we also measure size three years before the base year.</w:t>
       </w:r>
     </w:p>
     <w:p>
@@ -5316,7 +5316,17 @@
       </w:r>
       <w:r>
         <w:rPr/>
-        <w:t xml:space="preserve"> With the cluster bootstrap, the interval is −0.050 to 0.053. </w:t>
+        <w:t xml:space="preserve"> </w:t>
+      </w:r>
+      <w:r>
+        <w:rPr>
+          <w:color w:val="0000FF"/>
+        </w:rPr>
+        <w:t>With the cluster bootstrap, which allows for market-wide shocks such as the political uncertainty that moves Thai stock prices (Prukumpai et al., 2022), the interval is −0.050 to 0.053.</w:t>
+      </w:r>
+      <w:r>
+        <w:rPr/>
+        <w:t xml:space="preserve"> </w:t>
       </w:r>
       <w:r>
         <w:rPr>
@@ -14937,7 +14947,17 @@
         <w:rPr>
           <w:color w:val="0000FF"/>
         </w:rPr>
-        <w:t>Under the parallel trends assumption, the largest increase compatible with the headline interval is of the same order as the announcement return of 4.86% that Demiroglu and Ryngaert (2010) report for the first analyst coverage of neglected stocks, and because annual ratios miss short-lived price pressure, our estimates concern lasting revaluation (Chen et al., 2004).</w:t>
+        <w:t>Under the parallel trends assumption, the largest increase compatible with the headline interval is of the same order as the announcement return of 4.86% that Demiroglu and Ryngaert (2010) report for the first analyst coverage of neglected stocks, and because annual ratios miss short-lived price pressure, such as the partly reversed price rise at S&amp;P 500 inclusion (Harris &amp; Gurel, 1986; Shleifer, 1986), our estimates concern lasting revaluation (Chen et al., 2004).</w:t>
+      </w:r>
+      <w:r>
+        <w:rPr/>
+        <w:t xml:space="preserve"> </w:t>
+      </w:r>
+      <w:r>
+        <w:rPr>
+          <w:color w:val="0000FF"/>
+        </w:rPr>
+        <w:t>A first score also differs from the loss of analyst coverage, which lowers prices (Kelly &amp; Ljungqvist, 2012): we find no comparable valuation response to gaining coverage.</w:t>
       </w:r>
     </w:p>
     <w:p>
@@ -14994,7 +15014,7 @@
         <w:rPr>
           <w:color w:val="0000FF"/>
         </w:rPr>
-        <w:t>The provider may have added firms once they were large and visible enough to matter to its clients, or firms may have become scoreable by reporting, joining an index, or issuing equity; the fall in leverage toward the base year fits equity issuance.</w:t>
+        <w:t>The provider may have added firms once they were large and visible enough to matter to its clients, or firms may have become scoreable by reporting, which mandatory disclosure rules make more likely (Krueger et al., 2024), by joining an index, or by issuing equity; the fall in leverage toward the base year fits equity issuance.</w:t>
       </w:r>
       <w:r>
         <w:rPr/>
@@ -15118,7 +15138,7 @@
         <w:rPr>
           <w:color w:val="0000FF"/>
         </w:rPr>
-        <w:t>The absence of a detected gain fits the evidence on certification by sustainability indices (Durand et al., 2019; Hawn et al., 2018) and contrasts with the price effects of MSCI downgrades (Berg, Heeb, et al., 2022).</w:t>
+        <w:t>The absence of a detected gain fits the evidence on certification by sustainability indices (Durand et al., 2019; Hawn et al., 2018) and contrasts with the price effects of MSCI rating changes (Berg, Heeb, et al., 2022; Shanaev &amp; Ghimire, 2022).</w:t>
       </w:r>
       <w:r>
         <w:rPr/>
@@ -15148,7 +15168,7 @@
         <w:rPr>
           <w:color w:val="0000FF"/>
         </w:rPr>
-        <w:t>Unlike U.S. evidence that coverage changes firm conduct and payout (Bikmetova &amp; Pirinsky, 2026; Tsang et al., 2024, 2025), we find no stable change in leverage or total assets.</w:t>
+        <w:t>Ratings that investors see directly, such as Morningstar's fund sustainability ratings, redirect flows (Hartzmark &amp; Sussman, 2019), whereas we cannot observe whether investors in these markets see LSEG scores at all.</w:t>
       </w:r>
       <w:r>
         <w:rPr/>
@@ -15158,7 +15178,37 @@
         <w:rPr>
           <w:color w:val="0000FF"/>
         </w:rPr>
+        <w:t>Because providers disagree about the same firm and the disagreement is priced (Avramov et al., 2022; Christensen et al., 2022; Gibson Brandon et al., 2021), entry into one provider's coverage need not change how investors who rely on other ratings value a firm.</w:t>
+      </w:r>
+      <w:r>
+        <w:rPr/>
+        <w:t xml:space="preserve"> </w:t>
+      </w:r>
+      <w:r>
+        <w:rPr>
+          <w:color w:val="0000FF"/>
+        </w:rPr>
+        <w:t>Unlike U.S. evidence that coverage changes firm conduct and payout (Bikmetova &amp; Pirinsky, 2026; Tsang et al., 2024, 2025), we find no stable change in leverage or total assets.</w:t>
+      </w:r>
+      <w:r>
+        <w:rPr/>
+        <w:t xml:space="preserve"> </w:t>
+      </w:r>
+      <w:r>
+        <w:rPr>
+          <w:color w:val="0000FF"/>
+        </w:rPr>
         <w:t>The run-up also fits evidence that realized green returns reflect unexpected shifts in ESG demand (Pástor et al., 2022), but without ownership data we cannot tell whether ESG investors bought these firms before or after coverage.</w:t>
+      </w:r>
+      <w:r>
+        <w:rPr/>
+        <w:t xml:space="preserve"> </w:t>
+      </w:r>
+      <w:r>
+        <w:rPr>
+          <w:color w:val="0000FF"/>
+        </w:rPr>
+        <w:t>Ownership shapes corporate social responsibility performance in the region (Nguyen, 2025), and Thai institutional, foreign, and retail investors adjust their trading on different horizons (Sudsawasd &amp; Sakdapat, 2026), so trading and ownership data by investor group are the natural next step.</w:t>
       </w:r>
     </w:p>
     <w:p>

</xml_diff>

<commit_message>
Five IMRAD sections with at most four subsections; no row codes in text or table labels; section references remapped
Co-Authored-By: Claude Opus 5.5 <noreply@anthropic.com>
Claude-Session: https://claude.ai/code/session_01Ny4MKFPCnQG8RbtvfHQ86Z
</commit_message>
<xml_diff>
--- a/SAJE_292892_revision/build_r4/02_Manuscript_Revised_Marked_blue.docx
+++ b/SAJE_292892_revision/build_r4/02_Manuscript_Revised_Marked_blue.docx
@@ -748,7 +748,17 @@
           <w:color w:val="000000"/>
           <w:sz w:val="26"/>
         </w:rPr>
-        <w:t>3. Institutional Setting and Data</w:t>
+        <w:t xml:space="preserve">3. </w:t>
+      </w:r>
+      <w:r>
+        <w:rPr>
+          <w:rFonts w:ascii="Times New Roman" w:hAnsi="Times New Roman" w:eastAsia="Times New Roman"/>
+          <w:b/>
+          <w:i w:val="0"/>
+          <w:color w:val="0000FF"/>
+          <w:sz w:val="26"/>
+        </w:rPr>
+        <w:t>Data and Methods</w:t>
       </w:r>
     </w:p>
     <w:p>
@@ -765,7 +775,7 @@
           <w:color w:val="0000FF"/>
           <w:sz w:val="24"/>
         </w:rPr>
-        <w:t>3.1 ESG Disclosure and Rating Coverage in the Five Markets</w:t>
+        <w:t>3.1 Institutional Setting and Sample</w:t>
       </w:r>
     </w:p>
     <w:p>
@@ -858,19 +868,35 @@
     </w:p>
     <w:p>
       <w:pPr>
-        <w:pStyle w:val="Heading2"/>
-        <w:keepNext/>
-        <w:spacing w:line="360" w:lineRule="auto" w:after="120" w:before="160"/>
+        <w:spacing w:line="360" w:lineRule="auto" w:after="120" w:before="0"/>
+        <w:ind w:firstLine="720"/>
+        <w:jc w:val="both"/>
       </w:pPr>
       <w:r>
         <w:rPr>
-          <w:rFonts w:ascii="Times New Roman" w:hAnsi="Times New Roman" w:eastAsia="Times New Roman"/>
-          <w:b/>
-          <w:i w:val="0"/>
           <w:color w:val="0000FF"/>
-          <w:sz w:val="24"/>
-        </w:rPr>
-        <w:t>3.2 Sample</w:t>
+        </w:rPr>
+        <w:t>The data combine the annual LSEG ESG score (LSEG, 2025), not the controversy-adjusted combined score, with accounting and market data from Compustat Global (S&amp;P Global Market Intelligence, 2025) for 3,709 listed firms, each with a row for every year from 2014 to 2024; rows before a firm lists carry no data (3,647 rows).</w:t>
+      </w:r>
+      <w:r>
+        <w:rPr/>
+        <w:t xml:space="preserve"> </w:t>
+      </w:r>
+      <w:r>
+        <w:rPr>
+          <w:color w:val="0000FF"/>
+        </w:rPr>
+        <w:t>Every firm in the extract has data in 2024, so firms that delisted between 2014 and 2023 are absent from both the scored and the never-scored groups.</w:t>
+      </w:r>
+      <w:r>
+        <w:rPr/>
+        <w:t xml:space="preserve"> </w:t>
+      </w:r>
+      <w:r>
+        <w:rPr>
+          <w:color w:val="0000FF"/>
+        </w:rPr>
+        <w:t>The sample therefore conditions on survival to 2024, and without delisting data we cannot sign the resulting bias.</w:t>
       </w:r>
     </w:p>
     <w:p>
@@ -883,7 +909,17 @@
         <w:rPr>
           <w:color w:val="0000FF"/>
         </w:rPr>
-        <w:t>The data combine the annual LSEG ESG score (LSEG, 2025), not the controversy-adjusted combined score, with accounting and market data from Compustat Global (S&amp;P Global Market Intelligence, 2025) for 3,709 listed firms, each with a row for every year from 2014 to 2024; rows before a firm lists carry no data (3,647 rows).</w:t>
+        <w:t>Firms that never receive a score in our sample are never-scored and form the comparison group.</w:t>
+      </w:r>
+      <w:r>
+        <w:rPr/>
+        <w:t xml:space="preserve"> Dropping financial firms leaves 3,423 firms. </w:t>
+      </w:r>
+      <w:r>
+        <w:rPr>
+          <w:color w:val="0000FF"/>
+        </w:rPr>
+        <w:t>A firm's first recorded score year, g, is its first fiscal year with an LSEG ESG score, and its base year is g − 1.</w:t>
       </w:r>
       <w:r>
         <w:rPr/>
@@ -893,7 +929,7 @@
         <w:rPr>
           <w:color w:val="0000FF"/>
         </w:rPr>
-        <w:t>Every firm in the extract has data in 2024, so firms that delisted between 2014 and 2023 are absent from both the scored and the never-scored groups.</w:t>
+        <w:t>Only 17 of the 675 scored firms have a later year without a score, so we treat coverage as permanent, the staggered-adoption setting of Callaway and Sant'Anna (2021).</w:t>
       </w:r>
       <w:r>
         <w:rPr/>
@@ -903,7 +939,54 @@
         <w:rPr>
           <w:color w:val="0000FF"/>
         </w:rPr>
-        <w:t>The sample therefore conditions on survival to 2024, and without delisting data we cannot sign the resulting bias.</w:t>
+        <w:t>Excluding the 135 firms scored in 2014, which have no pre-coverage year, leaves 3,288 firms with 32,521 listed firm-years: 675 firms first scored between 2015 and 2024 and 2,613 never-scored firms.</w:t>
+      </w:r>
+      <w:r>
+        <w:rPr/>
+        <w:t xml:space="preserve"> </w:t>
+      </w:r>
+      <w:r>
+        <w:rPr>
+          <w:color w:val="0000FF"/>
+        </w:rPr>
+        <w:t>A firm-year enters an estimate only if its outcome is observed in both the base year and the comparison year (Tables S2 and S3 of the supplementary material).</w:t>
+      </w:r>
+      <w:r>
+        <w:rPr/>
+        <w:t xml:space="preserve"> </w:t>
+      </w:r>
+      <w:r>
+        <w:rPr>
+          <w:color w:val="0000FF"/>
+        </w:rPr>
+        <w:t>The source data contain no MTB ratio at or below zero, so firm-years with negative book equity appear as missing, like firm-years without market or accounting data.</w:t>
+      </w:r>
+      <w:r>
+        <w:rPr/>
+        <w:t xml:space="preserve"> </w:t>
+      </w:r>
+      <w:r>
+        <w:rPr>
+          <w:color w:val="0000FF"/>
+        </w:rPr>
+        <w:t>Log MTB ratios are missing for 18.5% of never-scored and 9.0% of scored listed firm-years.</w:t>
+      </w:r>
+    </w:p>
+    <w:p>
+      <w:pPr>
+        <w:pStyle w:val="Heading2"/>
+        <w:keepNext/>
+        <w:spacing w:line="360" w:lineRule="auto" w:after="120" w:before="160"/>
+      </w:pPr>
+      <w:r>
+        <w:rPr>
+          <w:rFonts w:ascii="Times New Roman" w:hAnsi="Times New Roman" w:eastAsia="Times New Roman"/>
+          <w:b/>
+          <w:i w:val="0"/>
+          <w:color w:val="0000FF"/>
+          <w:sz w:val="24"/>
+        </w:rPr>
+        <w:t>3.2 Event Dating, Outcomes, and Recording Errors</w:t>
       </w:r>
     </w:p>
     <w:p>
@@ -916,17 +999,7 @@
         <w:rPr>
           <w:color w:val="0000FF"/>
         </w:rPr>
-        <w:t>Firms that never receive a score in our sample are never-scored and form the comparison group.</w:t>
-      </w:r>
-      <w:r>
-        <w:rPr/>
-        <w:t xml:space="preserve"> Dropping financial firms leaves 3,423 firms. </w:t>
-      </w:r>
-      <w:r>
-        <w:rPr>
-          <w:color w:val="0000FF"/>
-        </w:rPr>
-        <w:t>A firm's first recorded score year, g, is its first fiscal year with an LSEG ESG score, and its base year is g − 1.</w:t>
+        <w:t>The event in this paper is the first recorded score: the first fiscal year for which our extract of the LSEG database holds a score.</w:t>
       </w:r>
       <w:r>
         <w:rPr/>
@@ -936,7 +1009,7 @@
         <w:rPr>
           <w:color w:val="0000FF"/>
         </w:rPr>
-        <w:t>Only 17 of the 675 scored firms have a later year without a score, so we treat coverage as permanent, the staggered-adoption setting of Callaway and Sant'Anna (2021).</w:t>
+        <w:t>It may precede the year in which investors first see a score for three reasons.</w:t>
       </w:r>
       <w:r>
         <w:rPr/>
@@ -946,7 +1019,7 @@
         <w:rPr>
           <w:color w:val="0000FF"/>
         </w:rPr>
-        <w:t>Excluding the 135 firms scored in 2014, which have no pre-coverage year, leaves 3,288 firms with 32,521 listed firm-years: 675 firms first scored between 2015 and 2024 and 2,613 never-scored firms.</w:t>
+        <w:t>First, the score for fiscal year g draws on reports published after that fiscal year ends, so it reaches investors in year g + 1 or later.</w:t>
       </w:r>
       <w:r>
         <w:rPr/>
@@ -956,7 +1029,7 @@
         <w:rPr>
           <w:color w:val="0000FF"/>
         </w:rPr>
-        <w:t>A firm-year enters an estimate only if its outcome is observed in both the base year and the comparison year (Tables S2 and S3 of the supplementary material).</w:t>
+        <w:t>Second, the provider has rewritten historical scores on a large scale (Berg et al., 2020), and scores for the five most recent fiscal years can change after publication (Sahin et al., 2023).</w:t>
       </w:r>
       <w:r>
         <w:rPr/>
@@ -966,7 +1039,7 @@
         <w:rPr>
           <w:color w:val="0000FF"/>
         </w:rPr>
-        <w:t>The source data contain no MTB ratio at or below zero, so firm-years with negative book equity appear as missing, like firm-years without market or accounting data.</w:t>
+        <w:t>Third, if the provider backfilled a firm's history at entry, the gap exceeds one year.</w:t>
       </w:r>
       <w:r>
         <w:rPr/>
@@ -976,7 +1049,160 @@
         <w:rPr>
           <w:color w:val="0000FF"/>
         </w:rPr>
-        <w:t>Log MTB ratios are missing for 18.5% of never-scored and 9.0% of scored listed firm-years.</w:t>
+        <w:t>The first recorded score can therefore date entry too early but, unless the provider deleted an earlier score, not too late.</w:t>
+      </w:r>
+    </w:p>
+    <w:p>
+      <w:pPr>
+        <w:spacing w:line="360" w:lineRule="auto" w:after="120" w:before="0"/>
+        <w:ind w:firstLine="720"/>
+        <w:jc w:val="both"/>
+      </w:pPr>
+      <w:r>
+        <w:rPr>
+          <w:color w:val="0000FF"/>
+        </w:rPr>
+        <w:t>We could not recover the publication dates.</w:t>
+      </w:r>
+      <w:r>
+        <w:rPr/>
+        <w:t xml:space="preserve"> </w:t>
+      </w:r>
+      <w:r>
+        <w:rPr>
+          <w:color w:val="0000FF"/>
+        </w:rPr>
+        <w:t>Our extract contains each score by fiscal year, with no publication or update date, and holds the scores in the database at download, after any revision; that every scored firm still has a score in 2024 fits a download of the provider's current universe.</w:t>
+      </w:r>
+      <w:r>
+        <w:rPr/>
+        <w:t xml:space="preserve"> </w:t>
+      </w:r>
+      <w:r>
+        <w:rPr>
+          <w:color w:val="0000FF"/>
+        </w:rPr>
+        <w:t>LSEG distributes a point-in-time version of its ESG data that keeps values as they were published (LSEG, 2023), but our extract does not contain it.</w:t>
+      </w:r>
+      <w:r>
+        <w:rPr/>
+        <w:t xml:space="preserve"> </w:t>
+      </w:r>
+      <w:r>
+        <w:rPr>
+          <w:color w:val="0000FF"/>
+        </w:rPr>
+        <w:t>We therefore keep two concepts apart.</w:t>
+      </w:r>
+      <w:r>
+        <w:rPr/>
+        <w:t xml:space="preserve"> </w:t>
+      </w:r>
+      <w:r>
+        <w:rPr>
+          <w:color w:val="0000FF"/>
+        </w:rPr>
+        <w:t>The first recorded score is what we observe; publicly observable coverage begins at an unknown date from g + 1 onward.</w:t>
+      </w:r>
+      <w:r>
+        <w:rPr/>
+        <w:t xml:space="preserve"> </w:t>
+      </w:r>
+      <w:r>
+        <w:rPr>
+          <w:color w:val="0000FF"/>
+        </w:rPr>
+        <w:t>We report the valuation path with coverage dated at g, at g + 1, and at g + 2, and draw conclusions only where they hold across these datings.</w:t>
+      </w:r>
+      <w:r>
+        <w:rPr/>
+        <w:t xml:space="preserve"> </w:t>
+      </w:r>
+      <w:r>
+        <w:rPr>
+          <w:color w:val="0000FF"/>
+        </w:rPr>
+        <w:t>Late dating cannot create the pre-coverage growth we report, because that growth occurs before g, but it can place pre-publication years in the post-coverage window of the baseline estimate.</w:t>
+      </w:r>
+    </w:p>
+    <w:p>
+      <w:pPr>
+        <w:spacing w:line="360" w:lineRule="auto" w:after="120" w:before="0"/>
+        <w:ind w:firstLine="720"/>
+        <w:jc w:val="both"/>
+      </w:pPr>
+      <w:r>
+        <w:rPr/>
+        <w:t xml:space="preserve">The primary outcome is the natural logarithm of the MTB ratio, the market value of equity divided by its book value. The secondary outcomes are log market capitalization, log total assets, and book leverage, total debt divided by total assets. </w:t>
+      </w:r>
+      <w:r>
+        <w:rPr>
+          <w:color w:val="0000FF"/>
+        </w:rPr>
+        <w:t>Without stock returns or shares outstanding, we use MTB for valuation and treat market capitalization and total assets as measures of scale.</w:t>
+      </w:r>
+      <w:r>
+        <w:rPr/>
+        <w:t xml:space="preserve"> </w:t>
+      </w:r>
+      <w:r>
+        <w:rPr>
+          <w:color w:val="0000FF"/>
+        </w:rPr>
+        <w:t>Amounts are in U.S. dollars, and we winsorize all four variables at the 1st and 99th percentiles of the pooled sample before taking logarithms.</w:t>
+      </w:r>
+    </w:p>
+    <w:p>
+      <w:pPr>
+        <w:spacing w:line="360" w:lineRule="auto" w:after="120" w:before="0"/>
+        <w:ind w:firstLine="720"/>
+        <w:jc w:val="both"/>
+      </w:pPr>
+      <w:r>
+        <w:rPr>
+          <w:color w:val="0000FF"/>
+        </w:rPr>
+        <w:t>A few market capitalization records are implausibly large; one Indonesian firm is recorded at 1,138.8 billion U.S. dollars.</w:t>
+      </w:r>
+      <w:r>
+        <w:rPr/>
+        <w:t xml:space="preserve"> </w:t>
+      </w:r>
+      <w:r>
+        <w:rPr>
+          <w:color w:val="0000FF"/>
+        </w:rPr>
+        <w:t>Market capitalization divided by the MTB ratio gives the implied book equity, which cannot exceed total assets.</w:t>
+      </w:r>
+      <w:r>
+        <w:rPr/>
+        <w:t xml:space="preserve"> </w:t>
+      </w:r>
+      <w:r>
+        <w:rPr>
+          <w:color w:val="0000FF"/>
+        </w:rPr>
+        <w:t>Of the 27,127 firm-years with all three items, 1,030 have ratios between one and two, which can arise when the items are measured on different dates, and 540 have ratios between two and ten.</w:t>
+      </w:r>
+      <w:r>
+        <w:rPr/>
+        <w:t xml:space="preserve"> </w:t>
+      </w:r>
+      <w:r>
+        <w:rPr>
+          <w:color w:val="0000FF"/>
+        </w:rPr>
+        <w:t>We flag firm-years in which the implied book equity exceeds ten times total assets, an error of an order of magnitude: 209 firm-years (0.77%), 73 of them for scored firms.</w:t>
+      </w:r>
+      <w:r>
+        <w:rPr/>
+        <w:t xml:space="preserve"> </w:t>
+      </w:r>
+      <w:r>
+        <w:rPr>
+          <w:color w:val="0000FF"/>
+        </w:rPr>
+        <w:t>A lower threshold, a ratio above two, flags 749 firm-years.</w:t>
       </w:r>
     </w:p>
     <w:p>
@@ -993,274 +1219,7 @@
           <w:color w:val="0000FF"/>
           <w:sz w:val="24"/>
         </w:rPr>
-        <w:t>3.3 What the First Recorded Score Dates</w:t>
-      </w:r>
-    </w:p>
-    <w:p>
-      <w:pPr>
-        <w:spacing w:line="360" w:lineRule="auto" w:after="120" w:before="0"/>
-        <w:ind w:firstLine="720"/>
-        <w:jc w:val="both"/>
-      </w:pPr>
-      <w:r>
-        <w:rPr>
-          <w:color w:val="0000FF"/>
-        </w:rPr>
-        <w:t>The event in this paper is the first recorded score: the first fiscal year for which our extract of the LSEG database holds a score.</w:t>
-      </w:r>
-      <w:r>
-        <w:rPr/>
-        <w:t xml:space="preserve"> </w:t>
-      </w:r>
-      <w:r>
-        <w:rPr>
-          <w:color w:val="0000FF"/>
-        </w:rPr>
-        <w:t>It may precede the year in which investors first see a score for three reasons.</w:t>
-      </w:r>
-      <w:r>
-        <w:rPr/>
-        <w:t xml:space="preserve"> </w:t>
-      </w:r>
-      <w:r>
-        <w:rPr>
-          <w:color w:val="0000FF"/>
-        </w:rPr>
-        <w:t>First, the score for fiscal year g draws on reports published after that fiscal year ends, so it reaches investors in year g + 1 or later.</w:t>
-      </w:r>
-      <w:r>
-        <w:rPr/>
-        <w:t xml:space="preserve"> </w:t>
-      </w:r>
-      <w:r>
-        <w:rPr>
-          <w:color w:val="0000FF"/>
-        </w:rPr>
-        <w:t>Second, the provider has rewritten historical scores on a large scale (Berg et al., 2020), and scores for the five most recent fiscal years can change after publication (Sahin et al., 2023).</w:t>
-      </w:r>
-      <w:r>
-        <w:rPr/>
-        <w:t xml:space="preserve"> </w:t>
-      </w:r>
-      <w:r>
-        <w:rPr>
-          <w:color w:val="0000FF"/>
-        </w:rPr>
-        <w:t>Third, if the provider backfilled a firm's history at entry, the gap exceeds one year.</w:t>
-      </w:r>
-      <w:r>
-        <w:rPr/>
-        <w:t xml:space="preserve"> </w:t>
-      </w:r>
-      <w:r>
-        <w:rPr>
-          <w:color w:val="0000FF"/>
-        </w:rPr>
-        <w:t>The first recorded score can therefore date entry too early but, unless the provider deleted an earlier score, not too late.</w:t>
-      </w:r>
-    </w:p>
-    <w:p>
-      <w:pPr>
-        <w:spacing w:line="360" w:lineRule="auto" w:after="120" w:before="0"/>
-        <w:ind w:firstLine="720"/>
-        <w:jc w:val="both"/>
-      </w:pPr>
-      <w:r>
-        <w:rPr>
-          <w:color w:val="0000FF"/>
-        </w:rPr>
-        <w:t>We could not recover the publication dates.</w:t>
-      </w:r>
-      <w:r>
-        <w:rPr/>
-        <w:t xml:space="preserve"> </w:t>
-      </w:r>
-      <w:r>
-        <w:rPr>
-          <w:color w:val="0000FF"/>
-        </w:rPr>
-        <w:t>Our extract contains each score by fiscal year, with no publication or update date, and holds the scores in the database at download, after any revision; that every scored firm still has a score in 2024 fits a download of the provider's current universe.</w:t>
-      </w:r>
-      <w:r>
-        <w:rPr/>
-        <w:t xml:space="preserve"> </w:t>
-      </w:r>
-      <w:r>
-        <w:rPr>
-          <w:color w:val="0000FF"/>
-        </w:rPr>
-        <w:t>LSEG distributes a point-in-time version of its ESG data that keeps values as they were published (LSEG, 2023), but our extract does not contain it.</w:t>
-      </w:r>
-      <w:r>
-        <w:rPr/>
-        <w:t xml:space="preserve"> </w:t>
-      </w:r>
-      <w:r>
-        <w:rPr>
-          <w:color w:val="0000FF"/>
-        </w:rPr>
-        <w:t>We therefore keep two concepts apart.</w:t>
-      </w:r>
-      <w:r>
-        <w:rPr/>
-        <w:t xml:space="preserve"> </w:t>
-      </w:r>
-      <w:r>
-        <w:rPr>
-          <w:color w:val="0000FF"/>
-        </w:rPr>
-        <w:t>The first recorded score is what we observe; publicly observable coverage begins at an unknown date from g + 1 onward.</w:t>
-      </w:r>
-      <w:r>
-        <w:rPr/>
-        <w:t xml:space="preserve"> </w:t>
-      </w:r>
-      <w:r>
-        <w:rPr>
-          <w:color w:val="0000FF"/>
-        </w:rPr>
-        <w:t>We report the valuation path with coverage dated at g, at g + 1, and at g + 2, and draw conclusions only where they hold across these datings.</w:t>
-      </w:r>
-      <w:r>
-        <w:rPr/>
-        <w:t xml:space="preserve"> </w:t>
-      </w:r>
-      <w:r>
-        <w:rPr>
-          <w:color w:val="0000FF"/>
-        </w:rPr>
-        <w:t>Late dating cannot create the pre-coverage growth we report, because that growth occurs before g, but it can place pre-publication years in the post-coverage window of the baseline estimate.</w:t>
-      </w:r>
-    </w:p>
-    <w:p>
-      <w:pPr>
-        <w:pStyle w:val="Heading2"/>
-        <w:keepNext/>
-        <w:spacing w:line="360" w:lineRule="auto" w:after="120" w:before="160"/>
-      </w:pPr>
-      <w:r>
-        <w:rPr>
-          <w:rFonts w:ascii="Times New Roman" w:hAnsi="Times New Roman" w:eastAsia="Times New Roman"/>
-          <w:b/>
-          <w:i w:val="0"/>
-          <w:color w:val="0000FF"/>
-          <w:sz w:val="24"/>
-        </w:rPr>
-        <w:t>3.4 Outcomes and Recording Errors</w:t>
-      </w:r>
-    </w:p>
-    <w:p>
-      <w:pPr>
-        <w:spacing w:line="360" w:lineRule="auto" w:after="120" w:before="0"/>
-        <w:ind w:firstLine="720"/>
-        <w:jc w:val="both"/>
-      </w:pPr>
-      <w:r>
-        <w:rPr/>
-        <w:t xml:space="preserve">The primary outcome is the natural logarithm of the MTB ratio, the market value of equity divided by its book value. The secondary outcomes are log market capitalization, log total assets, and book leverage, total debt divided by total assets. </w:t>
-      </w:r>
-      <w:r>
-        <w:rPr>
-          <w:color w:val="0000FF"/>
-        </w:rPr>
-        <w:t>Without stock returns or shares outstanding, we use MTB for valuation and treat market capitalization and total assets as measures of scale.</w:t>
-      </w:r>
-      <w:r>
-        <w:rPr/>
-        <w:t xml:space="preserve"> </w:t>
-      </w:r>
-      <w:r>
-        <w:rPr>
-          <w:color w:val="0000FF"/>
-        </w:rPr>
-        <w:t>Amounts are in U.S. dollars, and we winsorize all four variables at the 1st and 99th percentiles of the pooled sample before taking logarithms.</w:t>
-      </w:r>
-    </w:p>
-    <w:p>
-      <w:pPr>
-        <w:spacing w:line="360" w:lineRule="auto" w:after="120" w:before="0"/>
-        <w:ind w:firstLine="720"/>
-        <w:jc w:val="both"/>
-      </w:pPr>
-      <w:r>
-        <w:rPr>
-          <w:color w:val="0000FF"/>
-        </w:rPr>
-        <w:t>A few market capitalization records are implausibly large; one Indonesian firm is recorded at 1,138.8 billion U.S. dollars.</w:t>
-      </w:r>
-      <w:r>
-        <w:rPr/>
-        <w:t xml:space="preserve"> </w:t>
-      </w:r>
-      <w:r>
-        <w:rPr>
-          <w:color w:val="0000FF"/>
-        </w:rPr>
-        <w:t>Market capitalization divided by the MTB ratio gives the implied book equity, which cannot exceed total assets.</w:t>
-      </w:r>
-      <w:r>
-        <w:rPr/>
-        <w:t xml:space="preserve"> </w:t>
-      </w:r>
-      <w:r>
-        <w:rPr>
-          <w:color w:val="0000FF"/>
-        </w:rPr>
-        <w:t>Of the 27,127 firm-years with all three items, 1,030 have ratios between one and two, which can arise when the items are measured on different dates, and 540 have ratios between two and ten.</w:t>
-      </w:r>
-      <w:r>
-        <w:rPr/>
-        <w:t xml:space="preserve"> </w:t>
-      </w:r>
-      <w:r>
-        <w:rPr>
-          <w:color w:val="0000FF"/>
-        </w:rPr>
-        <w:t>We flag firm-years in which the implied book equity exceeds ten times total assets, an error of an order of magnitude: 209 firm-years (0.77%), 73 of them for scored firms.</w:t>
-      </w:r>
-      <w:r>
-        <w:rPr/>
-        <w:t xml:space="preserve"> </w:t>
-      </w:r>
-      <w:r>
-        <w:rPr>
-          <w:color w:val="0000FF"/>
-        </w:rPr>
-        <w:t>A lower threshold, a ratio above two, flags 749 firm-years.</w:t>
-      </w:r>
-    </w:p>
-    <w:p>
-      <w:pPr>
-        <w:pStyle w:val="Heading1"/>
-        <w:keepNext/>
-        <w:spacing w:line="360" w:lineRule="auto" w:after="120" w:before="360"/>
-      </w:pPr>
-      <w:r>
-        <w:rPr>
-          <w:rFonts w:ascii="Times New Roman" w:hAnsi="Times New Roman" w:eastAsia="Times New Roman"/>
-          <w:b/>
-          <w:i w:val="0"/>
-          <w:color w:val="000000"/>
-          <w:sz w:val="26"/>
-        </w:rPr>
-        <w:t>4. Methods</w:t>
-      </w:r>
-    </w:p>
-    <w:p>
-      <w:pPr>
-        <w:pStyle w:val="Heading2"/>
-        <w:keepNext/>
-        <w:spacing w:line="360" w:lineRule="auto" w:after="120" w:before="160"/>
-      </w:pPr>
-      <w:r>
-        <w:rPr>
-          <w:rFonts w:ascii="Times New Roman" w:hAnsi="Times New Roman" w:eastAsia="Times New Roman"/>
-          <w:b/>
-          <w:i w:val="0"/>
-          <w:color w:val="0000FF"/>
-          <w:sz w:val="24"/>
-        </w:rPr>
-        <w:t>4.1 Target Parameter and Identification</w:t>
+        <w:t>3.3 Identification and Estimation</w:t>
       </w:r>
     </w:p>
     <w:p>
@@ -1959,23 +1918,6 @@
     </w:p>
     <w:p>
       <w:pPr>
-        <w:pStyle w:val="Heading2"/>
-        <w:keepNext/>
-        <w:spacing w:line="360" w:lineRule="auto" w:after="120" w:before="160"/>
-      </w:pPr>
-      <w:r>
-        <w:rPr>
-          <w:rFonts w:ascii="Times New Roman" w:hAnsi="Times New Roman" w:eastAsia="Times New Roman"/>
-          <w:b/>
-          <w:i w:val="0"/>
-          <w:color w:val="000000"/>
-          <w:sz w:val="24"/>
-        </w:rPr>
-        <w:t>4.2 Estimation</w:t>
-      </w:r>
-    </w:p>
-    <w:p>
-      <w:pPr>
         <w:spacing w:line="360" w:lineRule="auto" w:after="120" w:before="0"/>
         <w:ind w:firstLine="720"/>
         <w:jc w:val="both"/>
@@ -3043,7 +2985,7 @@
         <w:rPr>
           <w:color w:val="0000FF"/>
         </w:rPr>
-        <w:t>Baseline controls are never-scored firms; later-scored firms join them only in check R1.</w:t>
+        <w:t>Baseline controls are never-scored firms; later-scored firms join them only in one robustness check.</w:t>
       </w:r>
       <w:r>
         <w:rPr/>
@@ -3077,10 +3019,10 @@
           <w:rFonts w:ascii="Times New Roman" w:hAnsi="Times New Roman" w:eastAsia="Times New Roman"/>
           <w:b/>
           <w:i w:val="0"/>
-          <w:color w:val="000000"/>
+          <w:color w:val="0000FF"/>
           <w:sz w:val="24"/>
         </w:rPr>
-        <w:t>4.3 Inference</w:t>
+        <w:t>3.4 Inference, Sensitivity, and Robustness Checks</w:t>
       </w:r>
     </w:p>
     <w:p>
@@ -3138,23 +3080,6 @@
     </w:p>
     <w:p>
       <w:pPr>
-        <w:pStyle w:val="Heading2"/>
-        <w:keepNext/>
-        <w:spacing w:line="360" w:lineRule="auto" w:after="120" w:before="160"/>
-      </w:pPr>
-      <w:r>
-        <w:rPr>
-          <w:rFonts w:ascii="Times New Roman" w:hAnsi="Times New Roman" w:eastAsia="Times New Roman"/>
-          <w:b/>
-          <w:i w:val="0"/>
-          <w:color w:val="0000FF"/>
-          <w:sz w:val="24"/>
-        </w:rPr>
-        <w:t>4.4 Sensitivity to Departures from Parallel Trends</w:t>
-      </w:r>
-    </w:p>
-    <w:p>
-      <w:pPr>
         <w:spacing w:line="360" w:lineRule="auto" w:after="120" w:before="0"/>
         <w:ind w:firstLine="720"/>
         <w:jc w:val="both"/>
@@ -3173,7 +3098,7 @@
         <w:rPr>
           <w:color w:val="0000FF"/>
         </w:rPr>
-        <w:t>The first removes a linear pre-coverage trend that passes through zero in the base year (row R7); the second adds the growth of log market capitalization from year g − 3 to the base year to X</w:t>
+        <w:t>The first removes a linear pre-coverage trend that passes through zero in the base year ; the second adds the growth of log market capitalization from year g − 3 to the base year to X</w:t>
       </w:r>
       <w:r>
         <w:rPr>
@@ -3186,7 +3111,7 @@
         <w:rPr>
           <w:color w:val="0000FF"/>
         </w:rPr>
-        <w:t xml:space="preserve"> (row R8).</w:t>
+        <w:t>.</w:t>
       </w:r>
       <w:r>
         <w:rPr/>
@@ -3494,23 +3419,6 @@
     </w:p>
     <w:p>
       <w:pPr>
-        <w:pStyle w:val="Heading2"/>
-        <w:keepNext/>
-        <w:spacing w:line="360" w:lineRule="auto" w:after="120" w:before="160"/>
-      </w:pPr>
-      <w:r>
-        <w:rPr>
-          <w:rFonts w:ascii="Times New Roman" w:hAnsi="Times New Roman" w:eastAsia="Times New Roman"/>
-          <w:b/>
-          <w:i w:val="0"/>
-          <w:color w:val="0000FF"/>
-          <w:sz w:val="24"/>
-        </w:rPr>
-        <w:t>4.5 Benchmark Regression and Robustness Checks</w:t>
-      </w:r>
-    </w:p>
-    <w:p>
-      <w:pPr>
         <w:spacing w:line="360" w:lineRule="auto" w:after="120" w:before="0"/>
         <w:ind w:firstLine="720"/>
         <w:jc w:val="both"/>
@@ -3812,17 +3720,7 @@
         <w:rPr>
           <w:color w:val="0000FF"/>
         </w:rPr>
-        <w:t>The pre-analysis plan fixed six checks, labeled R1 to R6 in the results.</w:t>
-      </w:r>
-      <w:r>
-        <w:rPr/>
-        <w:t xml:space="preserve"> </w:t>
-      </w:r>
-      <w:r>
-        <w:rPr>
-          <w:color w:val="0000FF"/>
-        </w:rPr>
-        <w:t>They add not-yet-scored firms to the controls (R1), drop the covariates (R2), exclude the 2020 and 2021 cohorts (R3), keep only control firms whose base-year log total assets reach the 10th percentile among scored firms of the same cohort (R4), date coverage three years early as a placebo (R5), and estimate the TWFE regression (R6).</w:t>
+        <w:t>The pre-analysis plan fixed six checks: adding not-yet-scored firms to the controls, dropping the covariates, excluding the 2020 and 2021 cohorts, keeping only control firms whose base-year log total assets reach the 10th percentile among scored firms of the same cohort, dating coverage three years early as a placebo, and estimating the TWFE regression.</w:t>
       </w:r>
       <w:r>
         <w:rPr/>
@@ -3849,7 +3747,7 @@
           <w:color w:val="000000"/>
           <w:sz w:val="26"/>
         </w:rPr>
-        <w:t>5. Results</w:t>
+        <w:t>4. Results</w:t>
       </w:r>
     </w:p>
     <w:p>
@@ -3866,7 +3764,7 @@
           <w:color w:val="0000FF"/>
           <w:sz w:val="24"/>
         </w:rPr>
-        <w:t>5.1 Which Firms Get Scored</w:t>
+        <w:t>4.1 Who Gets Scored and the Valuation Path Around Entry</w:t>
       </w:r>
     </w:p>
     <w:p>
@@ -4975,23 +4873,6 @@
     </w:p>
     <w:p>
       <w:pPr>
-        <w:pStyle w:val="Heading2"/>
-        <w:keepNext/>
-        <w:spacing w:line="360" w:lineRule="auto" w:after="120" w:before="160"/>
-      </w:pPr>
-      <w:r>
-        <w:rPr>
-          <w:rFonts w:ascii="Times New Roman" w:hAnsi="Times New Roman" w:eastAsia="Times New Roman"/>
-          <w:b/>
-          <w:i w:val="0"/>
-          <w:color w:val="0000FF"/>
-          <w:sz w:val="24"/>
-        </w:rPr>
-        <w:t>5.2 The Valuation Path Before and After the First Recorded Score</w:t>
-      </w:r>
-    </w:p>
-    <w:p>
-      <w:pPr>
         <w:spacing w:line="360" w:lineRule="auto" w:after="120" w:before="0"/>
         <w:ind w:firstLine="720"/>
         <w:jc w:val="both"/>
@@ -5289,7 +5170,7 @@
           <w:color w:val="0000FF"/>
           <w:sz w:val="24"/>
         </w:rPr>
-        <w:t>5.3 Average Change After Entry Under Parallel Trends</w:t>
+        <w:t>4.2 Average Change After Entry and the Two Datings</w:t>
       </w:r>
     </w:p>
     <w:p>
@@ -6379,7 +6260,7 @@
         <w:rPr>
           <w:color w:val="0000FF"/>
         </w:rPr>
-        <w:t>Table 3 presents the robustness checks; rows R1 to R6 were pre-specified, and rows R7 to R11 are exploratory.</w:t>
+        <w:t>Table 3 presents the robustness checks; the first six were pre-specified, and the rest are exploratory.</w:t>
       </w:r>
       <w:r>
         <w:rPr/>
@@ -6389,17 +6270,7 @@
         <w:rPr>
           <w:color w:val="0000FF"/>
         </w:rPr>
-        <w:t>Row R10 dates coverage one year after the first recorded score, the earliest year in which a score could have been public.</w:t>
-      </w:r>
-      <w:r>
-        <w:rPr/>
-        <w:t xml:space="preserve"> </w:t>
-      </w:r>
-      <w:r>
-        <w:rPr>
-          <w:color w:val="0000FF"/>
-        </w:rPr>
-        <w:t>Its MTB change is −0.068, about −6.6% (95% interval −0.116 to −0.020; p = 0.004), with a joint pre-trend p = 0.072.</w:t>
+        <w:t>Dating coverage one year after the first recorded score, the earliest year in which a score could have been public, gives an MTB change of −0.068, about −6.6% (95% interval −0.116 to −0.020; p = 0.004), with a joint pre-trend p = 0.072.</w:t>
       </w:r>
       <w:r>
         <w:rPr/>
@@ -6779,9 +6650,10 @@
             <w:r>
               <w:rPr>
                 <w:b/>
-                <w:sz w:val="18"/>
-              </w:rPr>
-              <w:t>R1 Not-yet-scored in controls</w:t>
+                <w:color w:val="0000FF"/>
+                <w:sz w:val="18"/>
+              </w:rPr>
+              <w:t>Not-yet-scored firms in controls</w:t>
             </w:r>
           </w:p>
         </w:tc>
@@ -6937,7 +6809,7 @@
                 <w:b/>
                 <w:sz w:val="18"/>
               </w:rPr>
-              <w:t>R2 No covariates</w:t>
+              <w:t>No covariates</w:t>
             </w:r>
           </w:p>
         </w:tc>
@@ -7091,9 +6963,10 @@
             <w:r>
               <w:rPr>
                 <w:b/>
-                <w:sz w:val="18"/>
-              </w:rPr>
-              <w:t>R3 No 2020–2021 cohorts</w:t>
+                <w:color w:val="0000FF"/>
+                <w:sz w:val="18"/>
+              </w:rPr>
+              <w:t>No 2020–2021 cohorts</w:t>
             </w:r>
           </w:p>
         </w:tc>
@@ -7247,9 +7120,10 @@
             <w:r>
               <w:rPr>
                 <w:b/>
-                <w:sz w:val="18"/>
-              </w:rPr>
-              <w:t>R4 Size-trimmed controls</w:t>
+                <w:color w:val="0000FF"/>
+                <w:sz w:val="18"/>
+              </w:rPr>
+              <w:t>Size-trimmed controls</w:t>
             </w:r>
           </w:p>
         </w:tc>
@@ -7403,9 +7277,10 @@
             <w:r>
               <w:rPr>
                 <w:b/>
-                <w:sz w:val="18"/>
-              </w:rPr>
-              <w:t>R5 Placebo, 3 years early</w:t>
+                <w:color w:val="0000FF"/>
+                <w:sz w:val="18"/>
+              </w:rPr>
+              <w:t>Placebo, 3 years early</w:t>
             </w:r>
           </w:p>
         </w:tc>
@@ -7559,9 +7434,10 @@
             <w:r>
               <w:rPr>
                 <w:b/>
-                <w:sz w:val="18"/>
-              </w:rPr>
-              <w:t>R6 Two-way fixed effects</w:t>
+                <w:color w:val="0000FF"/>
+                <w:sz w:val="18"/>
+              </w:rPr>
+              <w:t>Two-way fixed effects</w:t>
             </w:r>
           </w:p>
         </w:tc>
@@ -7725,9 +7601,10 @@
             <w:r>
               <w:rPr>
                 <w:b/>
-                <w:sz w:val="18"/>
-              </w:rPr>
-              <w:t>R7 Pre-trend removed</w:t>
+                <w:color w:val="0000FF"/>
+                <w:sz w:val="18"/>
+              </w:rPr>
+              <w:t>Pre-trend removed</w:t>
             </w:r>
           </w:p>
         </w:tc>
@@ -7881,9 +7758,10 @@
             <w:r>
               <w:rPr>
                 <w:b/>
-                <w:sz w:val="18"/>
-              </w:rPr>
-              <w:t>R8 Pre-coverage growth</w:t>
+                <w:color w:val="0000FF"/>
+                <w:sz w:val="18"/>
+              </w:rPr>
+              <w:t>Pre-coverage growth</w:t>
             </w:r>
           </w:p>
         </w:tc>
@@ -8037,9 +7915,10 @@
             <w:r>
               <w:rPr>
                 <w:b/>
-                <w:sz w:val="18"/>
-              </w:rPr>
-              <w:t>R9 No Malaysia</w:t>
+                <w:color w:val="0000FF"/>
+                <w:sz w:val="18"/>
+              </w:rPr>
+              <w:t>No Malaysia</w:t>
             </w:r>
           </w:p>
         </w:tc>
@@ -8193,9 +8072,10 @@
             <w:r>
               <w:rPr>
                 <w:b/>
-                <w:sz w:val="18"/>
-              </w:rPr>
-              <w:t>R10 Dated 1 year later</w:t>
+                <w:color w:val="0000FF"/>
+                <w:sz w:val="18"/>
+              </w:rPr>
+              <w:t>Dated one year later</w:t>
             </w:r>
           </w:p>
         </w:tc>
@@ -8349,9 +8229,10 @@
             <w:r>
               <w:rPr>
                 <w:b/>
-                <w:sz w:val="18"/>
-              </w:rPr>
-              <w:t>R11 Cohorts to 2021</w:t>
+                <w:color w:val="0000FF"/>
+                <w:sz w:val="18"/>
+              </w:rPr>
+              <w:t>Cohorts to 2021</w:t>
             </w:r>
           </w:p>
         </w:tc>
@@ -8972,24 +8853,7 @@
           <w:color w:val="0000FF"/>
           <w:sz w:val="18"/>
         </w:rPr>
-        <w:t>Note: Outcome regression with firm-bootstrap standard errors (R6: two-way fixed effects, firm-clustered); firm counts for ln(MTB). *, **, ***: 10%, 5%, 1% (unadjusted).</w:t>
-      </w:r>
-    </w:p>
-    <w:p>
-      <w:pPr>
-        <w:pStyle w:val="Heading2"/>
-        <w:keepNext/>
-        <w:spacing w:line="360" w:lineRule="auto" w:after="120" w:before="160"/>
-      </w:pPr>
-      <w:r>
-        <w:rPr>
-          <w:rFonts w:ascii="Times New Roman" w:hAnsi="Times New Roman" w:eastAsia="Times New Roman"/>
-          <w:b/>
-          <w:i w:val="0"/>
-          <w:color w:val="0000FF"/>
-          <w:sz w:val="24"/>
-        </w:rPr>
-        <w:t>5.4 Reconciling the Two Datings</w:t>
+        <w:t>Note: Outcome regression with firm-bootstrap standard errors (firm-clustered for two-way fixed effects); firm counts for ln(MTB). *, **, ***: 10%, 5%, 1% (unadjusted).</w:t>
       </w:r>
     </w:p>
     <w:p>
@@ -10646,7 +10510,7 @@
           <w:color w:val="0000FF"/>
           <w:sz w:val="24"/>
         </w:rPr>
-        <w:t>5.5 Sensitivity to Departures from Parallel Trends</w:t>
+        <w:t>4.3 Sensitivity and Robustness</w:t>
       </w:r>
     </w:p>
     <w:p>
@@ -10659,7 +10523,7 @@
         <w:rPr>
           <w:color w:val="0000FF"/>
         </w:rPr>
-        <w:t>Row R11 keeps the 7 cohorts observed through event year 3 and gives −0.008 (p = 0.806), so changing cohort composition does not explain the headline estimate.</w:t>
+        <w:t>Keeping only the 7 cohorts observed through event year 3 gives −0.008 (p = 0.806), so changing cohort composition does not explain the headline estimate.</w:t>
       </w:r>
       <w:r>
         <w:rPr/>
@@ -10669,7 +10533,7 @@
         <w:rPr>
           <w:color w:val="0000FF"/>
         </w:rPr>
-        <w:t>Removing a linear pre-trend (row R7) gives −0.052, and matching on pre-coverage growth (row R8) gives 0.028; both intervals include zero.</w:t>
+        <w:t>Removing a linear pre-trend gives −0.052, and matching on pre-coverage growth gives 0.028; both intervals include zero.</w:t>
       </w:r>
       <w:r>
         <w:rPr/>
@@ -10700,23 +10564,6 @@
           <w:color w:val="0000FF"/>
         </w:rPr>
         <w:t>Departures from parallel trends smaller than those observed before coverage are therefore enough to change the reading of either dating.</w:t>
-      </w:r>
-    </w:p>
-    <w:p>
-      <w:pPr>
-        <w:pStyle w:val="Heading2"/>
-        <w:keepNext/>
-        <w:spacing w:line="360" w:lineRule="auto" w:after="120" w:before="160"/>
-      </w:pPr>
-      <w:r>
-        <w:rPr>
-          <w:rFonts w:ascii="Times New Roman" w:hAnsi="Times New Roman" w:eastAsia="Times New Roman"/>
-          <w:b/>
-          <w:i w:val="0"/>
-          <w:color w:val="0000FF"/>
-          <w:sz w:val="24"/>
-        </w:rPr>
-        <w:t>5.6 Firm Size and Common Support</w:t>
       </w:r>
     </w:p>
     <w:p>
@@ -13522,23 +13369,6 @@
     </w:p>
     <w:p>
       <w:pPr>
-        <w:pStyle w:val="Heading2"/>
-        <w:keepNext/>
-        <w:spacing w:line="360" w:lineRule="auto" w:after="120" w:before="160"/>
-      </w:pPr>
-      <w:r>
-        <w:rPr>
-          <w:rFonts w:ascii="Times New Roman" w:hAnsi="Times New Roman" w:eastAsia="Times New Roman"/>
-          <w:b/>
-          <w:i w:val="0"/>
-          <w:color w:val="0000FF"/>
-          <w:sz w:val="24"/>
-        </w:rPr>
-        <w:t>5.7 Missing Valuation Data and Recording Errors</w:t>
-      </w:r>
-    </w:p>
-    <w:p>
-      <w:pPr>
         <w:spacing w:line="360" w:lineRule="auto" w:after="120" w:before="0"/>
         <w:ind w:firstLine="720"/>
         <w:jc w:val="both"/>
@@ -14772,6 +14602,49 @@
     </w:p>
     <w:p>
       <w:pPr>
+        <w:spacing w:line="360" w:lineRule="auto" w:after="120" w:before="0"/>
+        <w:ind w:firstLine="720"/>
+        <w:jc w:val="both"/>
+      </w:pPr>
+      <w:r>
+        <w:rPr>
+          <w:color w:val="0000FF"/>
+        </w:rPr>
+        <w:t>None of the four pre-specified robustness checks shows an MTB effect that differs from zero at the 10% level (estimates from −0.001 to 0.031), while the market capitalization and total assets results are less stable.</w:t>
+      </w:r>
+      <w:r>
+        <w:rPr/>
+        <w:t xml:space="preserve"> </w:t>
+      </w:r>
+      <w:r>
+        <w:rPr>
+          <w:color w:val="0000FF"/>
+        </w:rPr>
+        <w:t>Excluding one market at a time (Table S9) gives MTB effects from −0.007 to 0.017.</w:t>
+      </w:r>
+      <w:r>
+        <w:rPr/>
+        <w:t xml:space="preserve"> </w:t>
+      </w:r>
+      <w:r>
+        <w:rPr>
+          <w:color w:val="0000FF"/>
+        </w:rPr>
+        <w:t>The placebo yields 0.059 on log MTB (p = 0.010), restating the pre-coverage growth in Figure 1.</w:t>
+      </w:r>
+      <w:r>
+        <w:rPr/>
+        <w:t xml:space="preserve"> </w:t>
+      </w:r>
+      <w:r>
+        <w:rPr>
+          <w:color w:val="0000FF"/>
+        </w:rPr>
+        <w:t>The static TWFE regression attributes an increase of 0.064 in log MTB (p = 0.014) to coverage; comparing each cohort with its own base year accounts for about half of the gap to the headline estimate, and conditioning on base-year size for most of the rest (Table S5).</w:t>
+      </w:r>
+    </w:p>
+    <w:p>
+      <w:pPr>
         <w:pStyle w:val="Heading2"/>
         <w:keepNext/>
         <w:spacing w:line="360" w:lineRule="auto" w:after="120" w:before="160"/>
@@ -14784,7 +14657,7 @@
           <w:color w:val="0000FF"/>
           <w:sz w:val="24"/>
         </w:rPr>
-        <w:t>5.8 Other Robustness Checks</w:t>
+        <w:t>4.4 Initial Scores and What the Pooled Estimate Represents</w:t>
       </w:r>
     </w:p>
     <w:p>
@@ -14797,7 +14670,7 @@
         <w:rPr>
           <w:color w:val="0000FF"/>
         </w:rPr>
-        <w:t>None of the pre-specified rows R1 to R4 shows an MTB effect that differs from zero at the 10% level (estimates from −0.001 to 0.031), while the market capitalization and total assets results are less stable.</w:t>
+        <w:t>The last three rows of Table 3 divide scored firms at the cohort median of their first recorded ESG score.</w:t>
       </w:r>
       <w:r>
         <w:rPr/>
@@ -14807,7 +14680,7 @@
         <w:rPr>
           <w:color w:val="0000FF"/>
         </w:rPr>
-        <w:t>Excluding one market at a time (row R9 and Table S9) gives MTB effects from −0.007 to 0.017.</w:t>
+        <w:t>The difference between high- and low-score entrants is −0.041 (standard error 0.040, p = 0.307).</w:t>
       </w:r>
       <w:r>
         <w:rPr/>
@@ -14817,7 +14690,7 @@
         <w:rPr>
           <w:color w:val="0000FF"/>
         </w:rPr>
-        <w:t>The placebo in row R5 yields 0.059 on log MTB (p = 0.010), restating the pre-coverage growth in Figure 1.</w:t>
+        <w:t>Because the score rises with firm size (correlation 0.35 with base-year log total assets), Table S4 repeats the split after purging the score of size, country, and cohort; the difference is then −0.027 (p = 0.491).</w:t>
       </w:r>
       <w:r>
         <w:rPr/>
@@ -14827,7 +14700,87 @@
         <w:rPr>
           <w:color w:val="0000FF"/>
         </w:rPr>
-        <w:t>The static TWFE regression in row R6 attributes an increase of 0.064 in log MTB (p = 0.014) to coverage; comparing each cohort with its own base year accounts for about half of the gap to the headline estimate, and conditioning on base-year size for most of the rest (Table S5).</w:t>
+        <w:t>Neither split shows the sign pattern that the preference channel predicts, but with minimum detectable differences of 0.113 and 0.111, about 12% in the MTB ratio, neither can detect a moderate difference, so the result does not show that ESG preferences are unimportant.</w:t>
+      </w:r>
+    </w:p>
+    <w:p>
+      <w:pPr>
+        <w:spacing w:line="360" w:lineRule="auto" w:after="120" w:before="0"/>
+        <w:ind w:firstLine="720"/>
+        <w:jc w:val="both"/>
+      </w:pPr>
+      <w:r>
+        <w:rPr>
+          <w:color w:val="0000FF"/>
+        </w:rPr>
+        <w:t>The pooled estimate weights cohorts and event years by the number of scored firms in each cell.</w:t>
+      </w:r>
+      <w:r>
+        <w:rPr/>
+        <w:t xml:space="preserve"> </w:t>
+      </w:r>
+      <w:r>
+        <w:rPr>
+          <w:color w:val="0000FF"/>
+        </w:rPr>
+        <w:t>Malaysian firms carry 55.2% of the weight in the headline MTB estimate and Thai firms 26.7%, together 81.9%; the Malaysian wave of 2021 and 2022 alone carries 44.1%, and firm-years from 2021 to 2024 carry 87.2% (Table S10).</w:t>
+      </w:r>
+      <w:r>
+        <w:rPr/>
+        <w:t xml:space="preserve"> </w:t>
+      </w:r>
+      <w:r>
+        <w:rPr>
+          <w:color w:val="0000FF"/>
+        </w:rPr>
+        <w:t>The pooled estimate therefore describes mainly the Malaysian expansion and the Thai cohorts after the COVID-19 pandemic, not an average effect for the five markets; the estimates for Indonesia, the Philippines, and Singapore in Table S11 rest on too few scored firms to support conclusions.</w:t>
+      </w:r>
+      <w:r>
+        <w:rPr/>
+        <w:t xml:space="preserve"> </w:t>
+      </w:r>
+      <w:r>
+        <w:rPr>
+          <w:color w:val="0000FF"/>
+        </w:rPr>
+        <w:t>Under the parallel trends assumption, the largest increase compatible with the headline interval is of the same order as the announcement return of 4.86% that Demiroglu and Ryngaert (2010) report for the first analyst coverage of neglected stocks, and because annual ratios miss short-lived price pressure, such as the partly reversed price rise at S&amp;P 500 inclusion (Harris &amp; Gurel, 1986; Shleifer, 1986), our estimates concern lasting revaluation (Chen et al., 2004).</w:t>
+      </w:r>
+      <w:r>
+        <w:rPr/>
+        <w:t xml:space="preserve"> </w:t>
+      </w:r>
+      <w:r>
+        <w:rPr>
+          <w:color w:val="0000FF"/>
+        </w:rPr>
+        <w:t>A first score also differs from the loss of analyst coverage, which lowers prices (Kelly &amp; Ljungqvist, 2012): we find no comparable valuation response to gaining coverage.</w:t>
+      </w:r>
+    </w:p>
+    <w:p>
+      <w:pPr>
+        <w:pStyle w:val="Heading1"/>
+        <w:keepNext/>
+        <w:spacing w:line="360" w:lineRule="auto" w:after="120" w:before="360"/>
+      </w:pPr>
+      <w:r>
+        <w:rPr>
+          <w:rFonts w:ascii="Times New Roman" w:hAnsi="Times New Roman" w:eastAsia="Times New Roman"/>
+          <w:b/>
+          <w:i w:val="0"/>
+          <w:color w:val="000000"/>
+          <w:sz w:val="26"/>
+        </w:rPr>
+        <w:t xml:space="preserve">5. </w:t>
+      </w:r>
+      <w:r>
+        <w:rPr>
+          <w:rFonts w:ascii="Times New Roman" w:hAnsi="Times New Roman" w:eastAsia="Times New Roman"/>
+          <w:b/>
+          <w:i w:val="0"/>
+          <w:color w:val="0000FF"/>
+          <w:sz w:val="26"/>
+        </w:rPr>
+        <w:t>Discussion and Conclusion</w:t>
       </w:r>
     </w:p>
     <w:p>
@@ -14844,7 +14797,7 @@
           <w:color w:val="0000FF"/>
           <w:sz w:val="24"/>
         </w:rPr>
-        <w:t>5.9 Does the Initial Score Matter?</w:t>
+        <w:t>5.1 What the Evidence Shows</w:t>
       </w:r>
     </w:p>
     <w:p>
@@ -14857,7 +14810,7 @@
         <w:rPr>
           <w:color w:val="0000FF"/>
         </w:rPr>
-        <w:t>The last three rows of Table 3 divide scored firms at the cohort median of their first recorded ESG score.</w:t>
+        <w:t>The clearest result is an ordering of events: firms entered the scored universe after their MTB ratio and market capitalization had grown faster than those of never-scored firms, and their MTB ratio stopped gaining afterward.</w:t>
       </w:r>
       <w:r>
         <w:rPr/>
@@ -14867,7 +14820,7 @@
         <w:rPr>
           <w:color w:val="0000FF"/>
         </w:rPr>
-        <w:t>The difference between high- and low-score entrants is −0.041 (standard error 0.040, p = 0.307).</w:t>
+        <w:t>The provider may have added firms once they were large and visible enough to matter to its clients, or firms may have become scoreable by reporting, which mandatory disclosure rules make more likely (Krueger et al., 2024), by joining an index, or by issuing equity; the fall in leverage toward the base year fits equity issuance.</w:t>
       </w:r>
       <w:r>
         <w:rPr/>
@@ -14877,7 +14830,34 @@
         <w:rPr>
           <w:color w:val="0000FF"/>
         </w:rPr>
-        <w:t>Because the score rises with firm size (correlation 0.35 with base-year log total assets), Table S4 repeats the split after purging the score of size, country, and cohort; the difference is then −0.027 (p = 0.491).</w:t>
+        <w:t>Either way, entry marks the end of a period of relative growth, not a random draw, and this finding does not rest on the parallel trends assumption or on the dating of publication.</w:t>
+      </w:r>
+    </w:p>
+    <w:p>
+      <w:pPr>
+        <w:spacing w:line="360" w:lineRule="auto" w:after="120" w:before="0"/>
+        <w:ind w:firstLine="720"/>
+        <w:jc w:val="both"/>
+      </w:pPr>
+      <w:r>
+        <w:rPr/>
+        <w:t xml:space="preserve">The flat post-coverage MTB path admits three readings, depending on the counterfactual trend (Rambachan &amp; Roth, 2023; Roth, 2022). </w:t>
+      </w:r>
+      <w:r>
+        <w:rPr>
+          <w:color w:val="0000FF"/>
+        </w:rPr>
+        <w:t>With parallel paths from the base year, the data show no detected effect of coverage (95% interval −0.046 to 0.048 in log MTB).</w:t>
+      </w:r>
+      <w:r>
+        <w:rPr/>
+        <w:t xml:space="preserve"> With a continued run-up, coverage lowered valuations relative to the trend. With a partly transitory run-up, the flat path is consistent with a positive coverage effect that offset a reversal. </w:t>
+      </w:r>
+      <w:r>
+        <w:rPr>
+          <w:color w:val="0000FF"/>
+        </w:rPr>
+        <w:t>The comparison of datings fits a reversal, but a negative effect confined to the waves with a run-up would look the same.</w:t>
       </w:r>
       <w:r>
         <w:rPr/>
@@ -14887,7 +14867,17 @@
         <w:rPr>
           <w:color w:val="0000FF"/>
         </w:rPr>
-        <w:t>Neither split shows the sign pattern that the preference channel predicts, but with minimum detectable differences of 0.113 and 0.111, about 12% in the MTB ratio, neither can detect a moderate difference, so the result does not show that ESG preferences are unimportant.</w:t>
+        <w:t>With annual data, a provider that chooses whom to score, and recorded scores that may precede publication, a valuation effect of coverage cannot be reliably identified without additional assumptions.</w:t>
+      </w:r>
+      <w:r>
+        <w:rPr/>
+        <w:t xml:space="preserve"> </w:t>
+      </w:r>
+      <w:r>
+        <w:rPr>
+          <w:color w:val="0000FF"/>
+        </w:rPr>
+        <w:t>One of many exploratory subgroups, the 58 firms first scored by 2019, shows 0.094 (p = 0.047), which we do not read as evidence of a gain because it is not adjusted for multiple comparisons.</w:t>
       </w:r>
     </w:p>
     <w:p>
@@ -14904,7 +14894,7 @@
           <w:color w:val="0000FF"/>
           <w:sz w:val="24"/>
         </w:rPr>
-        <w:t>5.10 What the Pooled Estimate Represents</w:t>
+        <w:t>5.2 Mechanisms That the Data Can and Cannot Evaluate</w:t>
       </w:r>
     </w:p>
     <w:p>
@@ -14917,7 +14907,7 @@
         <w:rPr>
           <w:color w:val="0000FF"/>
         </w:rPr>
-        <w:t>The pooled estimate weights cohorts and event years by the number of scored firms in each cell.</w:t>
+        <w:t>Recognition predicts a lasting gain for every newly scored firm; we detect none under parallel trends, but without ownership, trading, or fund-holding data we cannot tell whether recognition did not increase or whether it increased without moving prices.</w:t>
       </w:r>
       <w:r>
         <w:rPr/>
@@ -14927,7 +14917,7 @@
         <w:rPr>
           <w:color w:val="0000FF"/>
         </w:rPr>
-        <w:t>Malaysian firms carry 55.2% of the weight in the headline MTB estimate and Thai firms 26.7%, together 81.9%; the Malaysian wave of 2021 and 2022 alone carries 44.1%, and firm-years from 2021 to 2024 carry 87.2% (Table S10).</w:t>
+        <w:t>Preferences predict opposite signs for high- and low-score entrants, and the split in Section 4.4 cannot detect a moderate difference.</w:t>
       </w:r>
       <w:r>
         <w:rPr/>
@@ -14937,7 +14927,7 @@
         <w:rPr>
           <w:color w:val="0000FF"/>
         </w:rPr>
-        <w:t>The pooled estimate therefore describes mainly the Malaysian expansion and the Thai cohorts after the COVID-19 pandemic, not an average effect for the five markets; the estimates for Indonesia, the Philippines, and Singapore in Table S11 rest on too few scored firms to support conclusions.</w:t>
+        <w:t>The absence of a detected gain fits the evidence on certification by sustainability indices (Durand et al., 2019; Hawn et al., 2018) and contrasts with the price effects of MSCI rating changes (Berg, Heeb, et al., 2022; Shanaev &amp; Ghimire, 2022).</w:t>
       </w:r>
       <w:r>
         <w:rPr/>
@@ -14947,7 +14937,7 @@
         <w:rPr>
           <w:color w:val="0000FF"/>
         </w:rPr>
-        <w:t>Under the parallel trends assumption, the largest increase compatible with the headline interval is of the same order as the announcement return of 4.86% that Demiroglu and Ryngaert (2010) report for the first analyst coverage of neglected stocks, and because annual ratios miss short-lived price pressure, such as the partly reversed price rise at S&amp;P 500 inclusion (Harris &amp; Gurel, 1986; Shleifer, 1986), our estimates concern lasting revaluation (Chen et al., 2004).</w:t>
+        <w:t>Two features of our setting may explain the contrast: U.S.</w:t>
       </w:r>
       <w:r>
         <w:rPr/>
@@ -14957,24 +14947,57 @@
         <w:rPr>
           <w:color w:val="0000FF"/>
         </w:rPr>
-        <w:t>A first score also differs from the loss of analyst coverage, which lowers prices (Kelly &amp; Ljungqvist, 2012): we find no comparable valuation response to gaining coverage.</w:t>
-      </w:r>
-    </w:p>
-    <w:p>
-      <w:pPr>
-        <w:pStyle w:val="Heading1"/>
-        <w:keepNext/>
-        <w:spacing w:line="360" w:lineRule="auto" w:after="120" w:before="360"/>
-      </w:pPr>
-      <w:r>
-        <w:rPr>
-          <w:rFonts w:ascii="Times New Roman" w:hAnsi="Times New Roman" w:eastAsia="Times New Roman"/>
-          <w:b/>
-          <w:i w:val="0"/>
-          <w:color w:val="000000"/>
-          <w:sz w:val="26"/>
-        </w:rPr>
-        <w:t>6. Discussion</w:t>
+        <w:t>ESG fund holdings respond to MSCI ratings, not to those of other providers (Berg, Heeb, et al., 2022), and scored firms were large and visible before coverage, which leaves less room for recognition (Merton, 1987).</w:t>
+      </w:r>
+      <w:r>
+        <w:rPr/>
+        <w:t xml:space="preserve"> </w:t>
+      </w:r>
+      <w:r>
+        <w:rPr>
+          <w:color w:val="0000FF"/>
+        </w:rPr>
+        <w:t>Ratings that investors see directly, such as Morningstar's fund sustainability ratings, redirect flows (Hartzmark &amp; Sussman, 2019), whereas we cannot observe whether investors in these markets see LSEG scores at all.</w:t>
+      </w:r>
+      <w:r>
+        <w:rPr/>
+        <w:t xml:space="preserve"> </w:t>
+      </w:r>
+      <w:r>
+        <w:rPr>
+          <w:color w:val="0000FF"/>
+        </w:rPr>
+        <w:t>Because providers disagree about the same firm and the disagreement is priced (Avramov et al., 2022; Christensen et al., 2022; Gibson Brandon et al., 2021), entry into one provider's coverage need not change how investors who rely on other ratings value a firm.</w:t>
+      </w:r>
+      <w:r>
+        <w:rPr/>
+        <w:t xml:space="preserve"> </w:t>
+      </w:r>
+      <w:r>
+        <w:rPr>
+          <w:color w:val="0000FF"/>
+        </w:rPr>
+        <w:t>Unlike U.S. evidence that coverage changes firm conduct and payout (Bikmetova &amp; Pirinsky, 2026; Tsang et al., 2024, 2025), we find no stable change in leverage or total assets.</w:t>
+      </w:r>
+      <w:r>
+        <w:rPr/>
+        <w:t xml:space="preserve"> </w:t>
+      </w:r>
+      <w:r>
+        <w:rPr>
+          <w:color w:val="0000FF"/>
+        </w:rPr>
+        <w:t>The run-up also fits evidence that realized green returns reflect unexpected shifts in ESG demand (Pástor et al., 2022), but without ownership data we cannot tell whether ESG investors bought these firms before or after coverage.</w:t>
+      </w:r>
+      <w:r>
+        <w:rPr/>
+        <w:t xml:space="preserve"> </w:t>
+      </w:r>
+      <w:r>
+        <w:rPr>
+          <w:color w:val="0000FF"/>
+        </w:rPr>
+        <w:t>Ownership shapes corporate social responsibility performance in the region (Nguyen, 2025), and Thai institutional, foreign, and retail investors adjust their trading on different horizons (Sudsawasd &amp; Sakdapat, 2026), so trading and ownership data by investor group are the natural next step.</w:t>
       </w:r>
     </w:p>
     <w:p>
@@ -14991,7 +15014,7 @@
           <w:color w:val="0000FF"/>
           <w:sz w:val="24"/>
         </w:rPr>
-        <w:t>6.1 What the Ordering of Events Shows</w:t>
+        <w:t>5.3 Implications and Limitations</w:t>
       </w:r>
     </w:p>
     <w:p>
@@ -15004,7 +15027,7 @@
         <w:rPr>
           <w:color w:val="0000FF"/>
         </w:rPr>
-        <w:t>The clearest result is an ordering of events: firms entered the scored universe after their MTB ratio and market capitalization had grown faster than those of never-scored firms, and their MTB ratio stopped gaining afterward.</w:t>
+        <w:t>For researchers, comparisons of scored and unscored firms, static TWFE estimates, and backtests built on the first recorded score can attribute selection to the score (Berg et al., 2020; Sahin et al., 2023); studies of ESG ratings in Southeast Asia should model when firms enter coverage, report pre-entry dynamics, and record the download date of their rating data.</w:t>
       </w:r>
       <w:r>
         <w:rPr/>
@@ -15014,7 +15037,20 @@
         <w:rPr>
           <w:color w:val="0000FF"/>
         </w:rPr>
-        <w:t>The provider may have added firms once they were large and visible enough to matter to its clients, or firms may have become scoreable by reporting, which mandatory disclosure rules make more likely (Krueger et al., 2024), by joining an index, or by issuing equity; the fall in leverage toward the base year fits equity issuance.</w:t>
+        <w:t>For rating providers and data users, the scored universe in these markets tilts toward large firms and toward firms that had outgrown their peers, and publishing the date on which each firm's coverage began, with the vintages of revised scores, would separate what was known from what was filled in later.</w:t>
+      </w:r>
+    </w:p>
+    <w:p>
+      <w:pPr>
+        <w:spacing w:line="360" w:lineRule="auto" w:after="120" w:before="0"/>
+        <w:ind w:firstLine="720"/>
+        <w:jc w:val="both"/>
+      </w:pPr>
+      <w:r>
+        <w:rPr>
+          <w:color w:val="0000FF"/>
+        </w:rPr>
+        <w:t>For investors, a portfolio screened on ESG scores in these markets holds firms that, on average, entered coverage after outgrowing their peers, so the screen tilts toward recent winners and away from smaller firms, and the date a firm became screenable is the publication date, which may follow the recorded year.</w:t>
       </w:r>
       <w:r>
         <w:rPr/>
@@ -15024,7 +15060,104 @@
         <w:rPr>
           <w:color w:val="0000FF"/>
         </w:rPr>
-        <w:t>Either way, entry marks the end of a period of relative growth, not a random draw, and this finding does not rest on the parallel trends assumption or on the dating of publication.</w:t>
+        <w:t>For exchanges, regulators, and listed firms, broad expansions such as the Malaysian wave appear to select less on prior growth, and we detect no MTB gain within it, although its interval (−0.053 to 0.091) admits gains larger than the pooled upper bound.</w:t>
+      </w:r>
+      <w:r>
+        <w:rPr/>
+        <w:t xml:space="preserve"> </w:t>
+      </w:r>
+      <w:r>
+        <w:rPr>
+          <w:color w:val="0000FF"/>
+        </w:rPr>
+        <w:t>Our results do not show that expanding ESG coverage has no valuation benefit; they show that such a benefit cannot be established from these data, so arguments for expanding coverage should rest on grounds other than an expected rise in issuer valuations.</w:t>
+      </w:r>
+    </w:p>
+    <w:p>
+      <w:pPr>
+        <w:spacing w:line="360" w:lineRule="auto" w:after="120" w:before="0"/>
+        <w:ind w:firstLine="720"/>
+        <w:jc w:val="both"/>
+      </w:pPr>
+      <w:r>
+        <w:rPr/>
+        <w:t xml:space="preserve">The study has eight limitations. </w:t>
+      </w:r>
+      <w:r>
+        <w:rPr>
+          <w:color w:val="0000FF"/>
+        </w:rPr>
+        <w:t>First, the provider chooses when to cover a firm, and the post-coverage estimates rest on conditional parallel trends that the pre-coverage estimates question; our sensitivity analysis uses a linear trend and a simplified bound, not the confidence sets of Rambachan and Roth (2023).</w:t>
+      </w:r>
+      <w:r>
+        <w:rPr/>
+        <w:t xml:space="preserve"> </w:t>
+      </w:r>
+      <w:r>
+        <w:rPr>
+          <w:color w:val="0000FF"/>
+        </w:rPr>
+        <w:t>Second, we observe neither publication dates nor announcement returns.</w:t>
+      </w:r>
+      <w:r>
+        <w:rPr/>
+        <w:t xml:space="preserve"> </w:t>
+      </w:r>
+      <w:r>
+        <w:rPr>
+          <w:color w:val="0000FF"/>
+        </w:rPr>
+        <w:t>Third, we observe only LSEG coverage, so for firms with earlier FTSE Russell or other scores the event is an additional score.</w:t>
+      </w:r>
+      <w:r>
+        <w:rPr/>
+        <w:t xml:space="preserve"> </w:t>
+      </w:r>
+      <w:r>
+        <w:rPr>
+          <w:color w:val="0000FF"/>
+        </w:rPr>
+        <w:t>Fourth, the data contain no returns, ownership, or index membership.</w:t>
+      </w:r>
+      <w:r>
+        <w:rPr/>
+        <w:t xml:space="preserve"> </w:t>
+      </w:r>
+      <w:r>
+        <w:rPr>
+          <w:color w:val="0000FF"/>
+        </w:rPr>
+        <w:t>Fifth, MTB ratios are missing for 18.5% of never-scored and 9.0% of scored listed firm-years, more often for distressed and Indonesian firms, and some market capitalization records contain scale errors.</w:t>
+      </w:r>
+      <w:r>
+        <w:rPr/>
+        <w:t xml:space="preserve"> </w:t>
+      </w:r>
+      <w:r>
+        <w:rPr>
+          <w:color w:val="0000FF"/>
+        </w:rPr>
+        <w:t>Sixth, Malaysian and Thai firms make up 84.3% of scored firms.</w:t>
+      </w:r>
+      <w:r>
+        <w:rPr/>
+        <w:t xml:space="preserve"> </w:t>
+      </w:r>
+      <w:r>
+        <w:rPr>
+          <w:color w:val="0000FF"/>
+        </w:rPr>
+        <w:t>Seventh, the sample includes only firms that survived to 2024.</w:t>
+      </w:r>
+      <w:r>
+        <w:rPr/>
+        <w:t xml:space="preserve"> </w:t>
+      </w:r>
+      <w:r>
+        <w:rPr>
+          <w:color w:val="0000FF"/>
+        </w:rPr>
+        <w:t>Eighth, with an MDE of 0.067 on log MTB, smaller effects would be detected with less than 80% probability.</w:t>
       </w:r>
     </w:p>
     <w:p>
@@ -15041,368 +15174,7 @@
           <w:color w:val="0000FF"/>
           <w:sz w:val="24"/>
         </w:rPr>
-        <w:t>6.2 What the Evidence Says About a Valuation Effect of Coverage</w:t>
-      </w:r>
-    </w:p>
-    <w:p>
-      <w:pPr>
-        <w:spacing w:line="360" w:lineRule="auto" w:after="120" w:before="0"/>
-        <w:ind w:firstLine="720"/>
-        <w:jc w:val="both"/>
-      </w:pPr>
-      <w:r>
-        <w:rPr/>
-        <w:t xml:space="preserve">The flat post-coverage MTB path admits three readings, depending on the counterfactual trend (Rambachan &amp; Roth, 2023; Roth, 2022). </w:t>
-      </w:r>
-      <w:r>
-        <w:rPr>
-          <w:color w:val="0000FF"/>
-        </w:rPr>
-        <w:t>With parallel paths from the base year, the data show no detected effect of coverage (95% interval −0.046 to 0.048 in log MTB).</w:t>
-      </w:r>
-      <w:r>
-        <w:rPr/>
-        <w:t xml:space="preserve"> With a continued run-up, coverage lowered valuations relative to the trend. With a partly transitory run-up, the flat path is consistent with a positive coverage effect that offset a reversal. </w:t>
-      </w:r>
-      <w:r>
-        <w:rPr>
-          <w:color w:val="0000FF"/>
-        </w:rPr>
-        <w:t>The comparison of datings fits a reversal, but a negative effect confined to the waves with a run-up would look the same.</w:t>
-      </w:r>
-      <w:r>
-        <w:rPr/>
-        <w:t xml:space="preserve"> </w:t>
-      </w:r>
-      <w:r>
-        <w:rPr>
-          <w:color w:val="0000FF"/>
-        </w:rPr>
-        <w:t>With annual data, a provider that chooses whom to score, and recorded scores that may precede publication, a valuation effect of coverage cannot be reliably identified without additional assumptions.</w:t>
-      </w:r>
-      <w:r>
-        <w:rPr/>
-        <w:t xml:space="preserve"> </w:t>
-      </w:r>
-      <w:r>
-        <w:rPr>
-          <w:color w:val="0000FF"/>
-        </w:rPr>
-        <w:t>One of many exploratory subgroups, the 58 firms first scored by 2019, shows 0.094 (p = 0.047), which we do not read as evidence of a gain because it is not adjusted for multiple comparisons.</w:t>
-      </w:r>
-    </w:p>
-    <w:p>
-      <w:pPr>
-        <w:pStyle w:val="Heading2"/>
-        <w:keepNext/>
-        <w:spacing w:line="360" w:lineRule="auto" w:after="120" w:before="160"/>
-      </w:pPr>
-      <w:r>
-        <w:rPr>
-          <w:rFonts w:ascii="Times New Roman" w:hAnsi="Times New Roman" w:eastAsia="Times New Roman"/>
-          <w:b/>
-          <w:i w:val="0"/>
-          <w:color w:val="0000FF"/>
-          <w:sz w:val="24"/>
-        </w:rPr>
-        <w:t>6.3 Mechanisms That the Data Can and Cannot Evaluate</w:t>
-      </w:r>
-    </w:p>
-    <w:p>
-      <w:pPr>
-        <w:spacing w:line="360" w:lineRule="auto" w:after="120" w:before="0"/>
-        <w:ind w:firstLine="720"/>
-        <w:jc w:val="both"/>
-      </w:pPr>
-      <w:r>
-        <w:rPr>
-          <w:color w:val="0000FF"/>
-        </w:rPr>
-        <w:t>Recognition predicts a lasting gain for every newly scored firm; we detect none under parallel trends, but without ownership, trading, or fund-holding data we cannot tell whether recognition did not increase or whether it increased without moving prices.</w:t>
-      </w:r>
-      <w:r>
-        <w:rPr/>
-        <w:t xml:space="preserve"> </w:t>
-      </w:r>
-      <w:r>
-        <w:rPr>
-          <w:color w:val="0000FF"/>
-        </w:rPr>
-        <w:t>Preferences predict opposite signs for high- and low-score entrants, and the split in Section 5.9 cannot detect a moderate difference.</w:t>
-      </w:r>
-      <w:r>
-        <w:rPr/>
-        <w:t xml:space="preserve"> </w:t>
-      </w:r>
-      <w:r>
-        <w:rPr>
-          <w:color w:val="0000FF"/>
-        </w:rPr>
-        <w:t>The absence of a detected gain fits the evidence on certification by sustainability indices (Durand et al., 2019; Hawn et al., 2018) and contrasts with the price effects of MSCI rating changes (Berg, Heeb, et al., 2022; Shanaev &amp; Ghimire, 2022).</w:t>
-      </w:r>
-      <w:r>
-        <w:rPr/>
-        <w:t xml:space="preserve"> </w:t>
-      </w:r>
-      <w:r>
-        <w:rPr>
-          <w:color w:val="0000FF"/>
-        </w:rPr>
-        <w:t>Two features of our setting may explain the contrast: U.S.</w:t>
-      </w:r>
-      <w:r>
-        <w:rPr/>
-        <w:t xml:space="preserve"> </w:t>
-      </w:r>
-      <w:r>
-        <w:rPr>
-          <w:color w:val="0000FF"/>
-        </w:rPr>
-        <w:t>ESG fund holdings respond to MSCI ratings, not to those of other providers (Berg, Heeb, et al., 2022), and scored firms were large and visible before coverage, which leaves less room for recognition (Merton, 1987).</w:t>
-      </w:r>
-      <w:r>
-        <w:rPr/>
-        <w:t xml:space="preserve"> </w:t>
-      </w:r>
-      <w:r>
-        <w:rPr>
-          <w:color w:val="0000FF"/>
-        </w:rPr>
-        <w:t>Ratings that investors see directly, such as Morningstar's fund sustainability ratings, redirect flows (Hartzmark &amp; Sussman, 2019), whereas we cannot observe whether investors in these markets see LSEG scores at all.</w:t>
-      </w:r>
-      <w:r>
-        <w:rPr/>
-        <w:t xml:space="preserve"> </w:t>
-      </w:r>
-      <w:r>
-        <w:rPr>
-          <w:color w:val="0000FF"/>
-        </w:rPr>
-        <w:t>Because providers disagree about the same firm and the disagreement is priced (Avramov et al., 2022; Christensen et al., 2022; Gibson Brandon et al., 2021), entry into one provider's coverage need not change how investors who rely on other ratings value a firm.</w:t>
-      </w:r>
-      <w:r>
-        <w:rPr/>
-        <w:t xml:space="preserve"> </w:t>
-      </w:r>
-      <w:r>
-        <w:rPr>
-          <w:color w:val="0000FF"/>
-        </w:rPr>
-        <w:t>Unlike U.S. evidence that coverage changes firm conduct and payout (Bikmetova &amp; Pirinsky, 2026; Tsang et al., 2024, 2025), we find no stable change in leverage or total assets.</w:t>
-      </w:r>
-      <w:r>
-        <w:rPr/>
-        <w:t xml:space="preserve"> </w:t>
-      </w:r>
-      <w:r>
-        <w:rPr>
-          <w:color w:val="0000FF"/>
-        </w:rPr>
-        <w:t>The run-up also fits evidence that realized green returns reflect unexpected shifts in ESG demand (Pástor et al., 2022), but without ownership data we cannot tell whether ESG investors bought these firms before or after coverage.</w:t>
-      </w:r>
-      <w:r>
-        <w:rPr/>
-        <w:t xml:space="preserve"> </w:t>
-      </w:r>
-      <w:r>
-        <w:rPr>
-          <w:color w:val="0000FF"/>
-        </w:rPr>
-        <w:t>Ownership shapes corporate social responsibility performance in the region (Nguyen, 2025), and Thai institutional, foreign, and retail investors adjust their trading on different horizons (Sudsawasd &amp; Sakdapat, 2026), so trading and ownership data by investor group are the natural next step.</w:t>
-      </w:r>
-    </w:p>
-    <w:p>
-      <w:pPr>
-        <w:pStyle w:val="Heading2"/>
-        <w:keepNext/>
-        <w:spacing w:line="360" w:lineRule="auto" w:after="120" w:before="160"/>
-      </w:pPr>
-      <w:r>
-        <w:rPr>
-          <w:rFonts w:ascii="Times New Roman" w:hAnsi="Times New Roman" w:eastAsia="Times New Roman"/>
-          <w:b/>
-          <w:i w:val="0"/>
-          <w:color w:val="0000FF"/>
-          <w:sz w:val="24"/>
-        </w:rPr>
-        <w:t>6.4 Implications</w:t>
-      </w:r>
-    </w:p>
-    <w:p>
-      <w:pPr>
-        <w:spacing w:line="360" w:lineRule="auto" w:after="120" w:before="0"/>
-        <w:ind w:firstLine="720"/>
-        <w:jc w:val="both"/>
-      </w:pPr>
-      <w:r>
-        <w:rPr>
-          <w:color w:val="0000FF"/>
-        </w:rPr>
-        <w:t>For researchers, comparisons of scored and unscored firms, static TWFE estimates, and backtests built on the first recorded score can attribute selection to the score (Berg et al., 2020; Sahin et al., 2023); studies of ESG ratings in Southeast Asia should model when firms enter coverage, report pre-entry dynamics, and record the download date of their rating data.</w:t>
-      </w:r>
-      <w:r>
-        <w:rPr/>
-        <w:t xml:space="preserve"> </w:t>
-      </w:r>
-      <w:r>
-        <w:rPr>
-          <w:color w:val="0000FF"/>
-        </w:rPr>
-        <w:t>For rating providers and data users, the scored universe in these markets tilts toward large firms and toward firms that had outgrown their peers, and publishing the date on which each firm's coverage began, with the vintages of revised scores, would separate what was known from what was filled in later.</w:t>
-      </w:r>
-    </w:p>
-    <w:p>
-      <w:pPr>
-        <w:spacing w:line="360" w:lineRule="auto" w:after="120" w:before="0"/>
-        <w:ind w:firstLine="720"/>
-        <w:jc w:val="both"/>
-      </w:pPr>
-      <w:r>
-        <w:rPr>
-          <w:color w:val="0000FF"/>
-        </w:rPr>
-        <w:t>For investors, a portfolio screened on ESG scores in these markets holds firms that, on average, entered coverage after outgrowing their peers, so the screen tilts toward recent winners and away from smaller firms, and the date a firm became screenable is the publication date, which may follow the recorded year.</w:t>
-      </w:r>
-      <w:r>
-        <w:rPr/>
-        <w:t xml:space="preserve"> </w:t>
-      </w:r>
-      <w:r>
-        <w:rPr>
-          <w:color w:val="0000FF"/>
-        </w:rPr>
-        <w:t>For exchanges, regulators, and listed firms, broad expansions such as the Malaysian wave appear to select less on prior growth, and we detect no MTB gain within it, although its interval (−0.053 to 0.091) admits gains larger than the pooled upper bound.</w:t>
-      </w:r>
-      <w:r>
-        <w:rPr/>
-        <w:t xml:space="preserve"> </w:t>
-      </w:r>
-      <w:r>
-        <w:rPr>
-          <w:color w:val="0000FF"/>
-        </w:rPr>
-        <w:t>Our results do not show that expanding ESG coverage has no valuation benefit; they show that such a benefit cannot be established from these data, so arguments for expanding coverage should rest on grounds other than an expected rise in issuer valuations.</w:t>
-      </w:r>
-    </w:p>
-    <w:p>
-      <w:pPr>
-        <w:pStyle w:val="Heading1"/>
-        <w:keepNext/>
-        <w:spacing w:line="360" w:lineRule="auto" w:after="120" w:before="360"/>
-      </w:pPr>
-      <w:r>
-        <w:rPr>
-          <w:rFonts w:ascii="Times New Roman" w:hAnsi="Times New Roman" w:eastAsia="Times New Roman"/>
-          <w:b/>
-          <w:i w:val="0"/>
-          <w:color w:val="000000"/>
-          <w:sz w:val="26"/>
-        </w:rPr>
-        <w:t>7. Limitations</w:t>
-      </w:r>
-    </w:p>
-    <w:p>
-      <w:pPr>
-        <w:spacing w:line="360" w:lineRule="auto" w:after="120" w:before="0"/>
-        <w:ind w:firstLine="720"/>
-        <w:jc w:val="both"/>
-      </w:pPr>
-      <w:r>
-        <w:rPr/>
-        <w:t xml:space="preserve">The study has eight limitations. </w:t>
-      </w:r>
-      <w:r>
-        <w:rPr>
-          <w:color w:val="0000FF"/>
-        </w:rPr>
-        <w:t>First, the provider chooses when to cover a firm, and the post-coverage estimates rest on conditional parallel trends that the pre-coverage estimates question; our sensitivity analysis uses a linear trend and a simplified bound, not the confidence sets of Rambachan and Roth (2023).</w:t>
-      </w:r>
-      <w:r>
-        <w:rPr/>
-        <w:t xml:space="preserve"> </w:t>
-      </w:r>
-      <w:r>
-        <w:rPr>
-          <w:color w:val="0000FF"/>
-        </w:rPr>
-        <w:t>Second, we observe neither publication dates nor announcement returns.</w:t>
-      </w:r>
-      <w:r>
-        <w:rPr/>
-        <w:t xml:space="preserve"> </w:t>
-      </w:r>
-      <w:r>
-        <w:rPr>
-          <w:color w:val="0000FF"/>
-        </w:rPr>
-        <w:t>Third, we observe only LSEG coverage, so for firms with earlier FTSE Russell or other scores the event is an additional score.</w:t>
-      </w:r>
-      <w:r>
-        <w:rPr/>
-        <w:t xml:space="preserve"> </w:t>
-      </w:r>
-      <w:r>
-        <w:rPr>
-          <w:color w:val="0000FF"/>
-        </w:rPr>
-        <w:t>Fourth, the data contain no returns, ownership, or index membership.</w:t>
-      </w:r>
-      <w:r>
-        <w:rPr/>
-        <w:t xml:space="preserve"> </w:t>
-      </w:r>
-      <w:r>
-        <w:rPr>
-          <w:color w:val="0000FF"/>
-        </w:rPr>
-        <w:t>Fifth, MTB ratios are missing for 18.5% of never-scored and 9.0% of scored listed firm-years, more often for distressed and Indonesian firms, and some market capitalization records contain scale errors.</w:t>
-      </w:r>
-      <w:r>
-        <w:rPr/>
-        <w:t xml:space="preserve"> </w:t>
-      </w:r>
-      <w:r>
-        <w:rPr>
-          <w:color w:val="0000FF"/>
-        </w:rPr>
-        <w:t>Sixth, Malaysian and Thai firms make up 84.3% of scored firms.</w:t>
-      </w:r>
-      <w:r>
-        <w:rPr/>
-        <w:t xml:space="preserve"> </w:t>
-      </w:r>
-      <w:r>
-        <w:rPr>
-          <w:color w:val="0000FF"/>
-        </w:rPr>
-        <w:t>Seventh, the sample includes only firms that survived to 2024.</w:t>
-      </w:r>
-      <w:r>
-        <w:rPr/>
-        <w:t xml:space="preserve"> </w:t>
-      </w:r>
-      <w:r>
-        <w:rPr>
-          <w:color w:val="0000FF"/>
-        </w:rPr>
-        <w:t>Eighth, with an MDE of 0.067 on log MTB, smaller effects would be detected with less than 80% probability.</w:t>
-      </w:r>
-    </w:p>
-    <w:p>
-      <w:pPr>
-        <w:pStyle w:val="Heading1"/>
-        <w:keepNext/>
-        <w:spacing w:line="360" w:lineRule="auto" w:after="120" w:before="360"/>
-      </w:pPr>
-      <w:r>
-        <w:rPr>
-          <w:rFonts w:ascii="Times New Roman" w:hAnsi="Times New Roman" w:eastAsia="Times New Roman"/>
-          <w:b/>
-          <w:i w:val="0"/>
-          <w:color w:val="000000"/>
-          <w:sz w:val="26"/>
-        </w:rPr>
-        <w:t>8. Conclusion</w:t>
+        <w:t>5.4 Conclusion</w:t>
       </w:r>
     </w:p>
     <w:p>

</xml_diff>

<commit_message>
Data and Methods cut ~30%; Discussion and Conclusion shortened without subsections; letter quotes and section references updated
Co-Authored-By: Claude Opus 5.5 <noreply@anthropic.com>
Claude-Session: https://claude.ai/code/session_01Ny4MKFPCnQG8RbtvfHQ86Z
</commit_message>
<xml_diff>
--- a/SAJE_292892_revision/build_r4/02_Manuscript_Revised_Marked_blue.docx
+++ b/SAJE_292892_revision/build_r4/02_Manuscript_Revised_Marked_blue.docx
@@ -785,24 +785,20 @@
         <w:jc w:val="both"/>
       </w:pPr>
       <w:r>
-        <w:rPr/>
-        <w:t xml:space="preserve">The five markets introduced sustainability reporting rules for listed firms at different times. </w:t>
-      </w:r>
-      <w:r>
         <w:rPr>
           <w:color w:val="0000FF"/>
         </w:rPr>
-        <w:t>Bursa Malaysia required a sustainability statement in annual reports for financial years ending on or after December 31, 2016, phased in from the largest companies between 2016 and 2018 (Bursa Malaysia, 2015).</w:t>
+        <w:t>The five markets introduced sustainability reporting rules at different times: Bursa Malaysia for financial years ending on or after December 31, 2016, phased in from the largest companies (Bursa Malaysia, 2015); Singapore, on a comply-or-explain basis, from financial years ending on or after December 31, 2017 (Singapore Exchange, 2016); the Philippines from the 2019 annual reports (Securities and Exchange Commission Philippines, 2019); Indonesia, under the original schedule of a 2017 regulation, from 2020 for listed companies other than small- and medium-asset issuers (Otoritas Jasa Keuangan, 2017); and Thailand in the 56-1 One Report from the fiscal year ending in 2021 (Tilleke &amp; Gibbins, 2020).</w:t>
       </w:r>
       <w:r>
         <w:rPr/>
-        <w:t xml:space="preserve"> </w:t>
+        <w:t xml:space="preserve"> In Malaysia, FTSE Russell, another part of LSEG, scored only the constituents of the FTSE Bursa Malaysia EMAS index, about 30% of listed companies, until Bursa Malaysia and LSEG agreed in November 2022 to extend these scores to all Main and ACE Market companies (Bernama, 2022). </w:t>
       </w:r>
       <w:r>
         <w:rPr>
           <w:color w:val="0000FF"/>
         </w:rPr>
-        <w:t>Singapore required listed issuers to publish a sustainability report, on a comply-or-explain basis, for financial years ending on or after December 31, 2017 (Singapore Exchange, 2016).</w:t>
+        <w:t>The LSEG ESG score we study is a separate product, so our event is the initiation of LSEG ESG coverage, not a firm's first ESG rating of any kind.</w:t>
       </w:r>
       <w:r>
         <w:rPr/>
@@ -812,27 +808,7 @@
         <w:rPr>
           <w:color w:val="0000FF"/>
         </w:rPr>
-        <w:t>Philippine listed companies attached a sustainability report, on a comply-or-explain basis for the first three years, from the 2019 annual reports (Securities and Exchange Commission Philippines, 2019).</w:t>
-      </w:r>
-      <w:r>
-        <w:rPr/>
-        <w:t xml:space="preserve"> </w:t>
-      </w:r>
-      <w:r>
-        <w:rPr>
-          <w:color w:val="0000FF"/>
-        </w:rPr>
-        <w:t>Under its original schedule, a 2017 Indonesian regulation applies to listed companies other than small- and medium-asset issuers from 2020 (Otoritas Jasa Keuangan, 2017); the regulator's pandemic relief may have delayed some first reports, a date no variable in our analysis depends on.</w:t>
-      </w:r>
-      <w:r>
-        <w:rPr/>
-        <w:t xml:space="preserve"> </w:t>
-      </w:r>
-      <w:r>
-        <w:rPr>
-          <w:color w:val="0000FF"/>
-        </w:rPr>
-        <w:t>Thai listed companies have reported sustainability information in the 56-1 One Report since the fiscal year ending in 2021 (Tilleke &amp; Gibbins, 2020).</w:t>
+        <w:t>Coverage arrived in waves that follow no single reporting rule: 108 first scores in Thailand and Singapore in 2019 and 2020, and 289 in Malaysia in 2021 and 2022 (Table S1 and Figure S1 of the supplementary material).</w:t>
       </w:r>
     </w:p>
     <w:p>
@@ -842,37 +818,6 @@
         <w:jc w:val="both"/>
       </w:pPr>
       <w:r>
-        <w:rPr/>
-        <w:t xml:space="preserve">In Malaysia, FTSE Russell, another part of LSEG, scored only the constituents of the FTSE Bursa Malaysia EMAS index, about 30% of listed companies, until Bursa Malaysia and LSEG agreed in November 2022 to extend these scores to all Main and ACE Market companies (Bernama, 2022). </w:t>
-      </w:r>
-      <w:r>
-        <w:rPr>
-          <w:color w:val="0000FF"/>
-        </w:rPr>
-        <w:t>The LSEG ESG score we study, formerly Refinitiv ESG, is a separate product, so our event is the initiation of LSEG ESG coverage, not a firm's first ESG rating of any kind.</w:t>
-      </w:r>
-      <w:r>
-        <w:rPr/>
-        <w:t xml:space="preserve"> </w:t>
-      </w:r>
-      <w:r>
-        <w:rPr>
-          <w:color w:val="0000FF"/>
-        </w:rPr>
-        <w:t>Coverage arrived in waves: 108 first scores in Thailand and Singapore in 2019 and 2020, and 289 in Malaysia in 2021 and 2022 (Table S1 and Figure S1 of the supplementary material).</w:t>
-      </w:r>
-      <w:r>
-        <w:rPr/>
-        <w:t xml:space="preserve"> Of the 675 scored firms, 404 (59.9%) are Malaysian, and Malaysian and Thai firms together make up 84.3%. The waves do not follow a single reporting rule: the Thai wave preceded the One Report requirement, and the Malaysian wave came years after Bursa Malaysia's rule.</w:t>
-      </w:r>
-    </w:p>
-    <w:p>
-      <w:pPr>
-        <w:spacing w:line="360" w:lineRule="auto" w:after="120" w:before="0"/>
-        <w:ind w:firstLine="720"/>
-        <w:jc w:val="both"/>
-      </w:pPr>
-      <w:r>
         <w:rPr>
           <w:color w:val="0000FF"/>
         </w:rPr>
@@ -886,30 +831,7 @@
         <w:rPr>
           <w:color w:val="0000FF"/>
         </w:rPr>
-        <w:t>Every firm in the extract has data in 2024, so firms that delisted between 2014 and 2023 are absent from both the scored and the never-scored groups.</w:t>
-      </w:r>
-      <w:r>
-        <w:rPr/>
-        <w:t xml:space="preserve"> </w:t>
-      </w:r>
-      <w:r>
-        <w:rPr>
-          <w:color w:val="0000FF"/>
-        </w:rPr>
-        <w:t>The sample therefore conditions on survival to 2024, and without delisting data we cannot sign the resulting bias.</w:t>
-      </w:r>
-    </w:p>
-    <w:p>
-      <w:pPr>
-        <w:spacing w:line="360" w:lineRule="auto" w:after="120" w:before="0"/>
-        <w:ind w:firstLine="720"/>
-        <w:jc w:val="both"/>
-      </w:pPr>
-      <w:r>
-        <w:rPr>
-          <w:color w:val="0000FF"/>
-        </w:rPr>
-        <w:t>Firms that never receive a score in our sample are never-scored and form the comparison group.</w:t>
+        <w:t>Every firm in the extract has data in 2024, so the sample conditions on survival to 2024, and without delisting data we cannot sign the resulting bias.</w:t>
       </w:r>
       <w:r>
         <w:rPr/>
@@ -929,7 +851,7 @@
         <w:rPr>
           <w:color w:val="0000FF"/>
         </w:rPr>
-        <w:t>Only 17 of the 675 scored firms have a later year without a score, so we treat coverage as permanent, the staggered-adoption setting of Callaway and Sant'Anna (2021).</w:t>
+        <w:t>Only 17 of the 675 scored firms have a later year without a score, so we treat coverage as permanent.</w:t>
       </w:r>
       <w:r>
         <w:rPr/>
@@ -939,7 +861,7 @@
         <w:rPr>
           <w:color w:val="0000FF"/>
         </w:rPr>
-        <w:t>Excluding the 135 firms scored in 2014, which have no pre-coverage year, leaves 3,288 firms with 32,521 listed firm-years: 675 firms first scored between 2015 and 2024 and 2,613 never-scored firms.</w:t>
+        <w:t>Excluding the 135 firms scored in 2014, which have no pre-coverage year, leaves 3,288 firms with 32,521 listed firm-years: 675 firms first scored between 2015 and 2024 (59.9% of them Malaysian) and 2,613 never-scored firms, which form the comparison group.</w:t>
       </w:r>
       <w:r>
         <w:rPr/>
@@ -949,27 +871,7 @@
         <w:rPr>
           <w:color w:val="0000FF"/>
         </w:rPr>
-        <w:t>A firm-year enters an estimate only if its outcome is observed in both the base year and the comparison year (Tables S2 and S3 of the supplementary material).</w:t>
-      </w:r>
-      <w:r>
-        <w:rPr/>
-        <w:t xml:space="preserve"> </w:t>
-      </w:r>
-      <w:r>
-        <w:rPr>
-          <w:color w:val="0000FF"/>
-        </w:rPr>
-        <w:t>The source data contain no MTB ratio at or below zero, so firm-years with negative book equity appear as missing, like firm-years without market or accounting data.</w:t>
-      </w:r>
-      <w:r>
-        <w:rPr/>
-        <w:t xml:space="preserve"> </w:t>
-      </w:r>
-      <w:r>
-        <w:rPr>
-          <w:color w:val="0000FF"/>
-        </w:rPr>
-        <w:t>Log MTB ratios are missing for 18.5% of never-scored and 9.0% of scored listed firm-years.</w:t>
+        <w:t>The source data contain no MTB ratio at or below zero, so firm-years with negative book equity appear as missing; log MTB ratios are missing for 18.5% of never-scored and 9.0% of scored listed firm-years.</w:t>
       </w:r>
     </w:p>
     <w:p>
@@ -999,7 +901,7 @@
         <w:rPr>
           <w:color w:val="0000FF"/>
         </w:rPr>
-        <w:t>The event in this paper is the first recorded score: the first fiscal year for which our extract of the LSEG database holds a score.</w:t>
+        <w:t>The first recorded score may precede the year in which investors first see a score.</w:t>
       </w:r>
       <w:r>
         <w:rPr/>
@@ -1009,37 +911,7 @@
         <w:rPr>
           <w:color w:val="0000FF"/>
         </w:rPr>
-        <w:t>It may precede the year in which investors first see a score for three reasons.</w:t>
-      </w:r>
-      <w:r>
-        <w:rPr/>
-        <w:t xml:space="preserve"> </w:t>
-      </w:r>
-      <w:r>
-        <w:rPr>
-          <w:color w:val="0000FF"/>
-        </w:rPr>
-        <w:t>First, the score for fiscal year g draws on reports published after that fiscal year ends, so it reaches investors in year g + 1 or later.</w:t>
-      </w:r>
-      <w:r>
-        <w:rPr/>
-        <w:t xml:space="preserve"> </w:t>
-      </w:r>
-      <w:r>
-        <w:rPr>
-          <w:color w:val="0000FF"/>
-        </w:rPr>
-        <w:t>Second, the provider has rewritten historical scores on a large scale (Berg et al., 2020), and scores for the five most recent fiscal years can change after publication (Sahin et al., 2023).</w:t>
-      </w:r>
-      <w:r>
-        <w:rPr/>
-        <w:t xml:space="preserve"> </w:t>
-      </w:r>
-      <w:r>
-        <w:rPr>
-          <w:color w:val="0000FF"/>
-        </w:rPr>
-        <w:t>Third, if the provider backfilled a firm's history at entry, the gap exceeds one year.</w:t>
+        <w:t>The score for fiscal year g draws on reports published after that year ends, so it reaches investors in year g + 1 or later; the provider has rewritten historical scores on a large scale (Berg et al., 2020); scores for the five most recent fiscal years can change after publication (Sahin et al., 2023); and backfilling at entry would widen the gap.</w:t>
       </w:r>
       <w:r>
         <w:rPr/>
@@ -1050,6 +922,56 @@
           <w:color w:val="0000FF"/>
         </w:rPr>
         <w:t>The first recorded score can therefore date entry too early but, unless the provider deleted an earlier score, not too late.</w:t>
+      </w:r>
+      <w:r>
+        <w:rPr/>
+        <w:t xml:space="preserve"> </w:t>
+      </w:r>
+      <w:r>
+        <w:rPr>
+          <w:color w:val="0000FF"/>
+        </w:rPr>
+        <w:t>Our extract holds each score by fiscal year, with no publication or update date, as it stood at download; that every scored firm still has a score in 2024 fits a download of the provider's current universe.</w:t>
+      </w:r>
+      <w:r>
+        <w:rPr/>
+        <w:t xml:space="preserve"> </w:t>
+      </w:r>
+      <w:r>
+        <w:rPr>
+          <w:color w:val="0000FF"/>
+        </w:rPr>
+        <w:t>LSEG distributes a point-in-time version of its ESG data that keeps values as they were published (LSEG, 2023), but our extract does not contain it.</w:t>
+      </w:r>
+      <w:r>
+        <w:rPr/>
+        <w:t xml:space="preserve"> </w:t>
+      </w:r>
+      <w:r>
+        <w:rPr>
+          <w:color w:val="0000FF"/>
+        </w:rPr>
+        <w:t>We therefore keep two concepts apart.</w:t>
+      </w:r>
+      <w:r>
+        <w:rPr/>
+        <w:t xml:space="preserve"> </w:t>
+      </w:r>
+      <w:r>
+        <w:rPr>
+          <w:color w:val="0000FF"/>
+        </w:rPr>
+        <w:t>The first recorded score is what we observe; publicly observable coverage begins at an unknown date from g + 1 onward.</w:t>
+      </w:r>
+      <w:r>
+        <w:rPr/>
+        <w:t xml:space="preserve"> </w:t>
+      </w:r>
+      <w:r>
+        <w:rPr>
+          <w:color w:val="0000FF"/>
+        </w:rPr>
+        <w:t>We report the valuation path with coverage dated at g, at g + 1, and at g + 2, and draw conclusions only where they hold across these datings.</w:t>
       </w:r>
     </w:p>
     <w:p>
@@ -1062,7 +984,7 @@
         <w:rPr>
           <w:color w:val="0000FF"/>
         </w:rPr>
-        <w:t>We could not recover the publication dates.</w:t>
+        <w:t>The primary outcome is the natural logarithm of the MTB ratio.</w:t>
       </w:r>
       <w:r>
         <w:rPr/>
@@ -1072,7 +994,7 @@
         <w:rPr>
           <w:color w:val="0000FF"/>
         </w:rPr>
-        <w:t>Our extract contains each score by fiscal year, with no publication or update date, and holds the scores in the database at download, after any revision; that every scored firm still has a score in 2024 fits a download of the provider's current universe.</w:t>
+        <w:t>The secondary outcomes are log market capitalization, log total assets, and book leverage, total debt divided by total assets; without stock returns or shares outstanding, we treat market capitalization and total assets as measures of scale.</w:t>
       </w:r>
       <w:r>
         <w:rPr/>
@@ -1082,82 +1004,12 @@
         <w:rPr>
           <w:color w:val="0000FF"/>
         </w:rPr>
-        <w:t>LSEG distributes a point-in-time version of its ESG data that keeps values as they were published (LSEG, 2023), but our extract does not contain it.</w:t>
+        <w:t>Amounts are in U.S. dollars, winsorized at the 1st and 99th percentiles of the pooled sample.</w:t>
       </w:r>
       <w:r>
         <w:rPr/>
         <w:t xml:space="preserve"> </w:t>
       </w:r>
-      <w:r>
-        <w:rPr>
-          <w:color w:val="0000FF"/>
-        </w:rPr>
-        <w:t>We therefore keep two concepts apart.</w:t>
-      </w:r>
-      <w:r>
-        <w:rPr/>
-        <w:t xml:space="preserve"> </w:t>
-      </w:r>
-      <w:r>
-        <w:rPr>
-          <w:color w:val="0000FF"/>
-        </w:rPr>
-        <w:t>The first recorded score is what we observe; publicly observable coverage begins at an unknown date from g + 1 onward.</w:t>
-      </w:r>
-      <w:r>
-        <w:rPr/>
-        <w:t xml:space="preserve"> </w:t>
-      </w:r>
-      <w:r>
-        <w:rPr>
-          <w:color w:val="0000FF"/>
-        </w:rPr>
-        <w:t>We report the valuation path with coverage dated at g, at g + 1, and at g + 2, and draw conclusions only where they hold across these datings.</w:t>
-      </w:r>
-      <w:r>
-        <w:rPr/>
-        <w:t xml:space="preserve"> </w:t>
-      </w:r>
-      <w:r>
-        <w:rPr>
-          <w:color w:val="0000FF"/>
-        </w:rPr>
-        <w:t>Late dating cannot create the pre-coverage growth we report, because that growth occurs before g, but it can place pre-publication years in the post-coverage window of the baseline estimate.</w:t>
-      </w:r>
-    </w:p>
-    <w:p>
-      <w:pPr>
-        <w:spacing w:line="360" w:lineRule="auto" w:after="120" w:before="0"/>
-        <w:ind w:firstLine="720"/>
-        <w:jc w:val="both"/>
-      </w:pPr>
-      <w:r>
-        <w:rPr/>
-        <w:t xml:space="preserve">The primary outcome is the natural logarithm of the MTB ratio, the market value of equity divided by its book value. The secondary outcomes are log market capitalization, log total assets, and book leverage, total debt divided by total assets. </w:t>
-      </w:r>
-      <w:r>
-        <w:rPr>
-          <w:color w:val="0000FF"/>
-        </w:rPr>
-        <w:t>Without stock returns or shares outstanding, we use MTB for valuation and treat market capitalization and total assets as measures of scale.</w:t>
-      </w:r>
-      <w:r>
-        <w:rPr/>
-        <w:t xml:space="preserve"> </w:t>
-      </w:r>
-      <w:r>
-        <w:rPr>
-          <w:color w:val="0000FF"/>
-        </w:rPr>
-        <w:t>Amounts are in U.S. dollars, and we winsorize all four variables at the 1st and 99th percentiles of the pooled sample before taking logarithms.</w:t>
-      </w:r>
-    </w:p>
-    <w:p>
-      <w:pPr>
-        <w:spacing w:line="360" w:lineRule="auto" w:after="120" w:before="0"/>
-        <w:ind w:firstLine="720"/>
-        <w:jc w:val="both"/>
-      </w:pPr>
       <w:r>
         <w:rPr>
           <w:color w:val="0000FF"/>
@@ -1172,27 +1024,7 @@
         <w:rPr>
           <w:color w:val="0000FF"/>
         </w:rPr>
-        <w:t>Market capitalization divided by the MTB ratio gives the implied book equity, which cannot exceed total assets.</w:t>
-      </w:r>
-      <w:r>
-        <w:rPr/>
-        <w:t xml:space="preserve"> </w:t>
-      </w:r>
-      <w:r>
-        <w:rPr>
-          <w:color w:val="0000FF"/>
-        </w:rPr>
-        <w:t>Of the 27,127 firm-years with all three items, 1,030 have ratios between one and two, which can arise when the items are measured on different dates, and 540 have ratios between two and ten.</w:t>
-      </w:r>
-      <w:r>
-        <w:rPr/>
-        <w:t xml:space="preserve"> </w:t>
-      </w:r>
-      <w:r>
-        <w:rPr>
-          <w:color w:val="0000FF"/>
-        </w:rPr>
-        <w:t>We flag firm-years in which the implied book equity exceeds ten times total assets, an error of an order of magnitude: 209 firm-years (0.77%), 73 of them for scored firms.</w:t>
+        <w:t>Because market capitalization divided by the MTB ratio gives the implied book equity, which cannot exceed total assets, we flag firm-years in which the implied book equity exceeds ten times total assets: 209 of 27,127 firm-years, 73 of them for scored firms.</w:t>
       </w:r>
       <w:r>
         <w:rPr/>
@@ -1850,30 +1682,7 @@
         <w:rPr>
           <w:color w:val="0000FF"/>
         </w:rPr>
-        <w:t>This assumption concerns changes in outcomes, so level differences between scored and never-scored firms do not violate it, but a different growth path before coverage would.</w:t>
-      </w:r>
-    </w:p>
-    <w:p>
-      <w:pPr>
-        <w:spacing w:line="360" w:lineRule="auto" w:after="120" w:before="0"/>
-        <w:ind w:firstLine="720"/>
-        <w:jc w:val="both"/>
-      </w:pPr>
-      <w:r>
-        <w:rPr>
-          <w:color w:val="0000FF"/>
-        </w:rPr>
-        <w:t>In the pooled sample, however, scored firms grew faster than comparable never-scored firms before the base year.</w:t>
-      </w:r>
-      <w:r>
-        <w:rPr/>
-        <w:t xml:space="preserve"> </w:t>
-      </w:r>
-      <w:r>
-        <w:rPr>
-          <w:color w:val="0000FF"/>
-        </w:rPr>
-        <w:t>Two arguments make it plausible in parts of the sample, and one argues against it.</w:t>
+        <w:t>Level differences between scored and never-scored firms do not violate this assumption, but a different growth path before coverage would.</w:t>
       </w:r>
       <w:r>
         <w:rPr/>
@@ -1893,7 +1702,7 @@
         <w:rPr>
           <w:color w:val="0000FF"/>
         </w:rPr>
-        <w:t>If the provider adds firms once they cross a size or visibility threshold, relative growth stops being a reason for selection after the threshold, and conditioning on base-year size compares firms on the same side of it.</w:t>
+        <w:t>If the provider adds firms once they cross a size or visibility threshold, conditioning on base-year size compares firms on the same side of it.</w:t>
       </w:r>
       <w:r>
         <w:rPr/>
@@ -1903,7 +1712,7 @@
         <w:rPr>
           <w:color w:val="0000FF"/>
         </w:rPr>
-        <w:t>Against it, if part of the run-up was transitory, scored firms would have fallen back even without a score, and the estimates would understate any effect of coverage.</w:t>
+        <w:t>Against this, if part of a run-up was transitory, scored firms would have fallen back even without a score, and the estimates would understate any effect of coverage.</w:t>
       </w:r>
       <w:r>
         <w:rPr/>
@@ -1913,7 +1722,7 @@
         <w:rPr>
           <w:color w:val="0000FF"/>
         </w:rPr>
-        <w:t>We therefore treat the post-coverage estimates as conditional on the parallel trends assumption and give most weight to evidence that does not depend on it: the ordering of growth and entry, and the contrast between waves with and without a run-up.</w:t>
+        <w:t>We therefore treat the post-coverage estimates as conditional on parallel trends and give most weight to evidence that does not depend on it: the ordering of growth and entry, and the contrast between waves with and without a run-up.</w:t>
       </w:r>
     </w:p>
     <w:p>
@@ -2141,13 +1950,13 @@
       </w:r>
       <w:r>
         <w:rPr/>
-        <w:t xml:space="preserve"> is the error. We omit the propensity-score model of the doubly robust estimator because total assets overlap poorly: 24.6% of scored firms have larger base-year total assets than the 95th percentile of never-scored firms. </w:t>
+        <w:t xml:space="preserve"> is the error. </w:t>
       </w:r>
       <w:r>
         <w:rPr>
           <w:color w:val="0000FF"/>
         </w:rPr>
-        <w:t>Outcome regression does not remove this support problem; it extrapolates the relation estimated among controls to scored firms larger than most controls, so we also restrict scored firms to the size range of the controls, in the spirit of the overlap trimming of Crump et al. (2009).</w:t>
+        <w:t>Because 24.6% of scored firms have larger base-year total assets than the 95th percentile of never-scored firms, we use outcome regression rather than the doubly robust estimator and also restrict scored firms to the size range of the controls, in the spirit of Crump et al. (2009).</w:t>
       </w:r>
       <w:r>
         <w:rPr/>
@@ -2985,27 +2794,7 @@
         <w:rPr>
           <w:color w:val="0000FF"/>
         </w:rPr>
-        <w:t>Baseline controls are never-scored firms; later-scored firms join them only in one robustness check.</w:t>
-      </w:r>
-      <w:r>
-        <w:rPr/>
-        <w:t xml:space="preserve"> </w:t>
-      </w:r>
-      <w:r>
-        <w:rPr>
-          <w:color w:val="0000FF"/>
-        </w:rPr>
-        <w:t>All comparisons, including pre-coverage ones, are relative to the base year, so a negative θ̂(e) for e ≤ −2 means that scored firms grew faster than comparable never-scored firms from year g + e to the base year.</w:t>
-      </w:r>
-      <w:r>
-        <w:rPr/>
-        <w:t xml:space="preserve"> </w:t>
-      </w:r>
-      <w:r>
-        <w:rPr>
-          <w:color w:val="0000FF"/>
-        </w:rPr>
-        <w:t>Because we measure the covariates in the base year, at the end of any run-up, conditioning on base-year total assets can absorb part of the run-up, so we also measure size three years before the base year.</w:t>
+        <w:t>All comparisons are relative to the base year, so a negative θ̂(e) for e ≤ −2 means that scored firms grew faster than comparable never-scored firms from year g + e to the base year.</w:t>
       </w:r>
     </w:p>
     <w:p>
@@ -3035,17 +2824,17 @@
         <w:rPr>
           <w:color w:val="0000FF"/>
         </w:rPr>
-        <w:t>We bootstrap the aggregated effects by resampling firms with their full time series.</w:t>
+        <w:t>We bootstrap by resampling firms with their full time series; all specifications share the same 999 draws and seed, so differences between specifications have a valid joint distribution.</w:t>
       </w:r>
       <w:r>
         <w:rPr/>
-        <w:t xml:space="preserve"> All specifications share the same 999 draws and fixed seed, so differences between specifications have a valid joint distribution. </w:t>
+        <w:t xml:space="preserve"> </w:t>
       </w:r>
       <w:r>
         <w:rPr>
           <w:color w:val="0000FF"/>
         </w:rPr>
-        <w:t>We report the bootstrap standard error (SE), the percentile 95% confidence interval, a normal-approximation two-sided p-value, and the minimum detectable effect at 80% power in a two-sided 5% test, MDE ≈ 2.8 × SE.</w:t>
+        <w:t>We report the bootstrap standard error (SE), the percentile 95% confidence interval, a normal-approximation p-value, and the minimum detectable effect at 80% power, MDE ≈ 2.8 × SE.</w:t>
       </w:r>
       <w:r>
         <w:rPr/>
@@ -3055,7 +2844,7 @@
         <w:rPr>
           <w:color w:val="0000FF"/>
         </w:rPr>
-        <w:t>We test the primary outcome at the 5% level and Holm-adjust the p-values, but not the intervals, of the three secondary outcomes.</w:t>
+        <w:t>Secondary outcomes carry Holm-adjusted p-values.</w:t>
       </w:r>
       <w:r>
         <w:rPr/>
@@ -3065,17 +2854,7 @@
         <w:rPr>
           <w:color w:val="0000FF"/>
         </w:rPr>
-        <w:t>A Wald test of the four estimates for e = −5 to −2, with their bootstrap covariance matrix, checks parallel pre-coverage trends; because such tests can have low power and conditioning on them distorts inference (Roth, 2022), we report it only as a diagnostic.</w:t>
-      </w:r>
-      <w:r>
-        <w:rPr/>
-        <w:t xml:space="preserve"> </w:t>
-      </w:r>
-      <w:r>
-        <w:rPr>
-          <w:color w:val="0000FF"/>
-        </w:rPr>
-        <w:t>Coverage arrived in market-level waves, so a market or industry shock can affect many scored firms at once, as shifts in political uncertainty do for Thai stock prices (Prukumpai et al., 2022); an exploratory check therefore resamples the 50 market-by-industry clusters instead of firms.</w:t>
+        <w:t>A Wald test of the estimates for e = −5 to −2 serves only as a pre-trend diagnostic, because such tests have low power (Roth, 2022), and an exploratory check resamples the 50 market-by-industry clusters instead of firms.</w:t>
       </w:r>
     </w:p>
     <w:p>
@@ -3088,17 +2867,7 @@
         <w:rPr>
           <w:color w:val="0000FF"/>
         </w:rPr>
-        <w:t>Because the pre-coverage estimates cast doubt on the parallel trends assumption, we add three exploratory checks.</w:t>
-      </w:r>
-      <w:r>
-        <w:rPr/>
-        <w:t xml:space="preserve"> </w:t>
-      </w:r>
-      <w:r>
-        <w:rPr>
-          <w:color w:val="0000FF"/>
-        </w:rPr>
-        <w:t>The first removes a linear pre-coverage trend that passes through zero in the base year ; the second adds the growth of log market capitalization from year g − 3 to the base year to X</w:t>
+        <w:t>Three exploratory checks address departures from parallel trends: removing a linear pre-coverage trend through zero in the base year, adding pre-coverage growth of log market capitalization to X</w:t>
       </w:r>
       <w:r>
         <w:rPr>
@@ -3111,7 +2880,7 @@
         <w:rPr>
           <w:color w:val="0000FF"/>
         </w:rPr>
-        <w:t>.</w:t>
+        <w:t>, and bounding the bias in the spirit of Rambachan and Roth (2023).</w:t>
       </w:r>
       <w:r>
         <w:rPr/>
@@ -3121,17 +2890,7 @@
         <w:rPr>
           <w:color w:val="0000FF"/>
         </w:rPr>
-        <w:t>The third bounds the bias in the spirit of the relative-magnitude restriction of Rambachan and Roth (2023).</w:t>
-      </w:r>
-      <w:r>
-        <w:rPr/>
-        <w:t xml:space="preserve"> </w:t>
-      </w:r>
-      <w:r>
-        <w:rPr>
-          <w:color w:val="0000FF"/>
-        </w:rPr>
-        <w:t>Let δ(e) denote the post-coverage violation of the parallel trends assumption in event year e; we assume</w:t>
+        <w:t>For the bound, let δ(e) denote the post-coverage violation of parallel trends in event year e; we assume</w:t>
       </w:r>
     </w:p>
     <w:p>
@@ -3397,10 +3156,14 @@
         <w:jc w:val="both"/>
       </w:pPr>
       <w:r>
+        <w:rPr/>
+        <w:t xml:space="preserve">where s indexes the pre-coverage event years. </w:t>
+      </w:r>
+      <w:r>
         <w:rPr>
           <w:color w:val="0000FF"/>
         </w:rPr>
-        <w:t>where s indexes the pre-coverage event years and Δ is the largest change between consecutive pre-coverage estimates.</w:t>
+        <w:t>The bias for event year e is then at most M̄Δ(e + 1), and we widen the headline interval by its weighted average; with M̄ = 0.25, the gap may drift each year by a quarter of the largest yearly change before coverage.</w:t>
       </w:r>
       <w:r>
         <w:rPr/>
@@ -3410,22 +3173,7 @@
         <w:rPr>
           <w:color w:val="0000FF"/>
         </w:rPr>
-        <w:t>The bias for event year e is then at most M̄Δ(e + 1), and we widen the headline confidence interval by the weighted average of this bound.</w:t>
-      </w:r>
-      <w:r>
-        <w:rPr/>
-        <w:t xml:space="preserve"> With M̄ = 0.25, the post-coverage gap may drift each year by a quarter of the largest yearly change before coverage.</w:t>
-      </w:r>
-    </w:p>
-    <w:p>
-      <w:pPr>
-        <w:spacing w:line="360" w:lineRule="auto" w:after="120" w:before="0"/>
-        <w:ind w:firstLine="720"/>
-        <w:jc w:val="both"/>
-      </w:pPr>
-      <w:r>
-        <w:rPr/>
-        <w:t>As a benchmark, we estimate on scored and never-scored firms the static two-way fixed effects (TWFE) regression analyzed by Goodman-Bacon (2021) and Baker et al. (2022):</w:t>
+        <w:t>As a benchmark, we estimate the static two-way fixed effects (TWFE) regression analyzed by Goodman-Bacon (2021) and Baker et al. (2022):</w:t>
       </w:r>
     </w:p>
     <w:p>
@@ -3684,43 +3432,17 @@
         <w:rPr>
           <w:color w:val="0000FF"/>
         </w:rPr>
-        <w:t xml:space="preserve"> marks years from the first recorded score onward, and ε</w:t>
-      </w:r>
-      <w:r>
-        <w:rPr>
-          <w:color w:val="0000FF"/>
-          <w:vertAlign w:val="subscript"/>
-        </w:rPr>
-        <w:t>i,t</w:t>
+        <w:t xml:space="preserve"> marks years from the first recorded score onward, and standard errors are clustered by firm; β averages over any run-up and uses already scored firms as controls.</w:t>
+      </w:r>
+      <w:r>
+        <w:rPr/>
+        <w:t xml:space="preserve"> </w:t>
       </w:r>
       <w:r>
         <w:rPr>
           <w:color w:val="0000FF"/>
         </w:rPr>
-        <w:t xml:space="preserve"> is the error term; standard errors are clustered by firm.</w:t>
-      </w:r>
-      <w:r>
-        <w:rPr/>
-        <w:t xml:space="preserve"> </w:t>
-      </w:r>
-      <w:r>
-        <w:rPr>
-          <w:color w:val="0000FF"/>
-        </w:rPr>
-        <w:t>The coefficient β compares all post-coverage with all pre-coverage years, so it averages over any run-up and, with staggered timing, uses already scored firms as controls for later cohorts.</w:t>
-      </w:r>
-    </w:p>
-    <w:p>
-      <w:pPr>
-        <w:spacing w:line="360" w:lineRule="auto" w:after="120" w:before="0"/>
-        <w:ind w:firstLine="720"/>
-        <w:jc w:val="both"/>
-      </w:pPr>
-      <w:r>
-        <w:rPr>
-          <w:color w:val="0000FF"/>
-        </w:rPr>
-        <w:t>The pre-analysis plan fixed six checks: adding not-yet-scored firms to the controls, dropping the covariates, excluding the 2020 and 2021 cohorts, keeping only control firms whose base-year log total assets reach the 10th percentile among scored firms of the same cohort, dating coverage three years early as a placebo, and estimating the TWFE regression.</w:t>
+        <w:t>The pre-analysis plan fixed six checks: adding not-yet-scored firms to the controls, dropping the covariates, excluding the 2020 and 2021 cohorts, keeping only control firms whose base-year log total assets reach the 10th percentile among scored firms of the same cohort, dating coverage three years early as a placebo, and the TWFE regression.</w:t>
       </w:r>
       <w:r>
         <w:rPr/>
@@ -14785,19 +14507,55 @@
     </w:p>
     <w:p>
       <w:pPr>
-        <w:pStyle w:val="Heading2"/>
-        <w:keepNext/>
-        <w:spacing w:line="360" w:lineRule="auto" w:after="120" w:before="160"/>
+        <w:spacing w:line="360" w:lineRule="auto" w:after="120" w:before="0"/>
+        <w:ind w:firstLine="720"/>
+        <w:jc w:val="both"/>
       </w:pPr>
       <w:r>
         <w:rPr>
-          <w:rFonts w:ascii="Times New Roman" w:hAnsi="Times New Roman" w:eastAsia="Times New Roman"/>
-          <w:b/>
-          <w:i w:val="0"/>
           <w:color w:val="0000FF"/>
-          <w:sz w:val="24"/>
         </w:rPr>
-        <w:t>5.1 What the Evidence Shows</w:t>
+        <w:t>The clearest result is an ordering of events: firms entered the scored universe after their MTB ratio and market capitalization had grown faster than those of never-scored firms, and their MTB ratio stopped gaining afterward.</w:t>
+      </w:r>
+      <w:r>
+        <w:rPr/>
+        <w:t xml:space="preserve"> </w:t>
+      </w:r>
+      <w:r>
+        <w:rPr>
+          <w:color w:val="0000FF"/>
+        </w:rPr>
+        <w:t>The provider may have added firms once they were large and visible enough to matter to its clients, or firms may have become scoreable by reporting, which mandatory disclosure rules make more likely (Krueger et al., 2024), by joining an index, or by issuing equity; the fall in leverage toward the base year fits equity issuance.</w:t>
+      </w:r>
+      <w:r>
+        <w:rPr/>
+        <w:t xml:space="preserve"> </w:t>
+      </w:r>
+      <w:r>
+        <w:rPr>
+          <w:color w:val="0000FF"/>
+        </w:rPr>
+        <w:t>This finding does not rest on parallel trends or on the dating of publication.</w:t>
+      </w:r>
+      <w:r>
+        <w:rPr/>
+        <w:t xml:space="preserve"> </w:t>
+      </w:r>
+      <w:r>
+        <w:rPr>
+          <w:color w:val="0000FF"/>
+        </w:rPr>
+        <w:t>Whether coverage then changed valuations depends on the counterfactual trend (Rambachan &amp; Roth, 2023; Roth, 2022): with parallel paths, the data show no detected effect (95% interval −0.046 to 0.048 in log MTB); with a continued run-up, coverage lowered valuations; with a partly transitory run-up, a positive effect could have offset a reversal.</w:t>
+      </w:r>
+      <w:r>
+        <w:rPr/>
+        <w:t xml:space="preserve"> </w:t>
+      </w:r>
+      <w:r>
+        <w:rPr>
+          <w:color w:val="0000FF"/>
+        </w:rPr>
+        <w:t>With annual data, a provider that chooses whom to score, and recorded scores that may precede publication, a valuation effect of coverage cannot be reliably identified without additional assumptions.</w:t>
       </w:r>
     </w:p>
     <w:p>
@@ -14810,7 +14568,7 @@
         <w:rPr>
           <w:color w:val="0000FF"/>
         </w:rPr>
-        <w:t>The clearest result is an ordering of events: firms entered the scored universe after their MTB ratio and market capitalization had grown faster than those of never-scored firms, and their MTB ratio stopped gaining afterward.</w:t>
+        <w:t>The absence of a detected gain fits the evidence on certification by sustainability indices (Durand et al., 2019; Hawn et al., 2018) and contrasts with the price effects of MSCI rating changes (Berg, Heeb, et al., 2022; Shanaev &amp; Ghimire, 2022).</w:t>
       </w:r>
       <w:r>
         <w:rPr/>
@@ -14820,7 +14578,7 @@
         <w:rPr>
           <w:color w:val="0000FF"/>
         </w:rPr>
-        <w:t>The provider may have added firms once they were large and visible enough to matter to its clients, or firms may have become scoreable by reporting, which mandatory disclosure rules make more likely (Krueger et al., 2024), by joining an index, or by issuing equity; the fall in leverage toward the base year fits equity issuance.</w:t>
+        <w:t>U.S.</w:t>
       </w:r>
       <w:r>
         <w:rPr/>
@@ -14830,7 +14588,37 @@
         <w:rPr>
           <w:color w:val="0000FF"/>
         </w:rPr>
-        <w:t>Either way, entry marks the end of a period of relative growth, not a random draw, and this finding does not rest on the parallel trends assumption or on the dating of publication.</w:t>
+        <w:t>ESG fund holdings respond to MSCI ratings, not to those of other providers (Berg, Heeb, et al., 2022); ratings that investors see directly, such as Morningstar's fund sustainability ratings, redirect flows (Hartzmark &amp; Sussman, 2019); and because providers disagree about the same firm and the disagreement is priced (Avramov et al., 2022; Christensen et al., 2022; Gibson Brandon et al., 2021), entry into one provider's coverage need not change how investors who rely on other ratings value a firm.</w:t>
+      </w:r>
+      <w:r>
+        <w:rPr/>
+        <w:t xml:space="preserve"> </w:t>
+      </w:r>
+      <w:r>
+        <w:rPr>
+          <w:color w:val="0000FF"/>
+        </w:rPr>
+        <w:t>Scored firms were also large and visible before coverage, which leaves less room for recognition (Merton, 1987).</w:t>
+      </w:r>
+      <w:r>
+        <w:rPr/>
+        <w:t xml:space="preserve"> </w:t>
+      </w:r>
+      <w:r>
+        <w:rPr>
+          <w:color w:val="0000FF"/>
+        </w:rPr>
+        <w:t>Unlike U.S. evidence that coverage changes firm conduct and payout (Bikmetova &amp; Pirinsky, 2026; Tsang et al., 2024, 2025), we find no stable change in leverage or total assets.</w:t>
+      </w:r>
+      <w:r>
+        <w:rPr/>
+        <w:t xml:space="preserve"> </w:t>
+      </w:r>
+      <w:r>
+        <w:rPr>
+          <w:color w:val="0000FF"/>
+        </w:rPr>
+        <w:t>The run-up fits evidence that realized green returns reflect unexpected shifts in ESG demand (Pástor et al., 2022), but without ownership data we cannot tell whether ESG investors bought these firms before or after coverage; since ownership shapes corporate social responsibility performance in the region (Nguyen, 2025) and Thai institutional, foreign, and retail investors trade on different horizons (Sudsawasd &amp; Sakdapat, 2026), ownership and trading data by investor group are the natural next step.</w:t>
       </w:r>
     </w:p>
     <w:p>
@@ -14840,24 +14628,20 @@
         <w:jc w:val="both"/>
       </w:pPr>
       <w:r>
-        <w:rPr/>
-        <w:t xml:space="preserve">The flat post-coverage MTB path admits three readings, depending on the counterfactual trend (Rambachan &amp; Roth, 2023; Roth, 2022). </w:t>
-      </w:r>
-      <w:r>
         <w:rPr>
           <w:color w:val="0000FF"/>
         </w:rPr>
-        <w:t>With parallel paths from the base year, the data show no detected effect of coverage (95% interval −0.046 to 0.048 in log MTB).</w:t>
+        <w:t>For researchers, comparisons of scored and unscored firms, static TWFE estimates, and backtests built on the first recorded score can attribute selection to the score (Berg et al., 2020; Sahin et al., 2023), so studies of ESG ratings in Southeast Asia should model when firms enter coverage and record the download date of their rating data.</w:t>
       </w:r>
       <w:r>
         <w:rPr/>
-        <w:t xml:space="preserve"> With a continued run-up, coverage lowered valuations relative to the trend. With a partly transitory run-up, the flat path is consistent with a positive coverage effect that offset a reversal. </w:t>
+        <w:t xml:space="preserve"> </w:t>
       </w:r>
       <w:r>
         <w:rPr>
           <w:color w:val="0000FF"/>
         </w:rPr>
-        <w:t>The comparison of datings fits a reversal, but a negative effect confined to the waves with a run-up would look the same.</w:t>
+        <w:t>For providers, publishing the date on which each firm's coverage began, with the vintages of revised scores, would separate what was known from what was filled in later.</w:t>
       </w:r>
       <w:r>
         <w:rPr/>
@@ -14867,7 +14651,7 @@
         <w:rPr>
           <w:color w:val="0000FF"/>
         </w:rPr>
-        <w:t>With annual data, a provider that chooses whom to score, and recorded scores that may precede publication, a valuation effect of coverage cannot be reliably identified without additional assumptions.</w:t>
+        <w:t>For investors, a portfolio screened on ESG scores in these markets holds firms that, on average, entered coverage after outgrowing their peers.</w:t>
       </w:r>
       <w:r>
         <w:rPr/>
@@ -14877,24 +14661,7 @@
         <w:rPr>
           <w:color w:val="0000FF"/>
         </w:rPr>
-        <w:t>One of many exploratory subgroups, the 58 firms first scored by 2019, shows 0.094 (p = 0.047), which we do not read as evidence of a gain because it is not adjusted for multiple comparisons.</w:t>
-      </w:r>
-    </w:p>
-    <w:p>
-      <w:pPr>
-        <w:pStyle w:val="Heading2"/>
-        <w:keepNext/>
-        <w:spacing w:line="360" w:lineRule="auto" w:after="120" w:before="160"/>
-      </w:pPr>
-      <w:r>
-        <w:rPr>
-          <w:rFonts w:ascii="Times New Roman" w:hAnsi="Times New Roman" w:eastAsia="Times New Roman"/>
-          <w:b/>
-          <w:i w:val="0"/>
-          <w:color w:val="0000FF"/>
-          <w:sz w:val="24"/>
-        </w:rPr>
-        <w:t>5.2 Mechanisms That the Data Can and Cannot Evaluate</w:t>
+        <w:t>For exchanges and regulators, broad expansions such as the Malaysian wave appear to select less on prior growth, and we detect no MTB gain within them (95% interval −0.053 to 0.091); arguments for expanding coverage should therefore rest on grounds other than an expected rise in issuer valuations.</w:t>
       </w:r>
     </w:p>
     <w:p>
@@ -14907,7 +14674,7 @@
         <w:rPr>
           <w:color w:val="0000FF"/>
         </w:rPr>
-        <w:t>Recognition predicts a lasting gain for every newly scored firm; we detect none under parallel trends, but without ownership, trading, or fund-holding data we cannot tell whether recognition did not increase or whether it increased without moving prices.</w:t>
+        <w:t>The study has limitations.</w:t>
       </w:r>
       <w:r>
         <w:rPr/>
@@ -14917,7 +14684,7 @@
         <w:rPr>
           <w:color w:val="0000FF"/>
         </w:rPr>
-        <w:t>Preferences predict opposite signs for high- and low-score entrants, and the split in Section 4.4 cannot detect a moderate difference.</w:t>
+        <w:t>The post-coverage estimates rest on conditional parallel trends that the pre-coverage estimates question, and our bound is a simplified version of Rambachan and Roth (2023).</w:t>
       </w:r>
       <w:r>
         <w:rPr/>
@@ -14927,7 +14694,7 @@
         <w:rPr>
           <w:color w:val="0000FF"/>
         </w:rPr>
-        <w:t>The absence of a detected gain fits the evidence on certification by sustainability indices (Durand et al., 2019; Hawn et al., 2018) and contrasts with the price effects of MSCI rating changes (Berg, Heeb, et al., 2022; Shanaev &amp; Ghimire, 2022).</w:t>
+        <w:t>We observe neither publication dates, returns, ownership, nor index membership, and only LSEG coverage.</w:t>
       </w:r>
       <w:r>
         <w:rPr/>
@@ -14937,84 +14704,7 @@
         <w:rPr>
           <w:color w:val="0000FF"/>
         </w:rPr>
-        <w:t>Two features of our setting may explain the contrast: U.S.</w:t>
-      </w:r>
-      <w:r>
-        <w:rPr/>
-        <w:t xml:space="preserve"> </w:t>
-      </w:r>
-      <w:r>
-        <w:rPr>
-          <w:color w:val="0000FF"/>
-        </w:rPr>
-        <w:t>ESG fund holdings respond to MSCI ratings, not to those of other providers (Berg, Heeb, et al., 2022), and scored firms were large and visible before coverage, which leaves less room for recognition (Merton, 1987).</w:t>
-      </w:r>
-      <w:r>
-        <w:rPr/>
-        <w:t xml:space="preserve"> </w:t>
-      </w:r>
-      <w:r>
-        <w:rPr>
-          <w:color w:val="0000FF"/>
-        </w:rPr>
-        <w:t>Ratings that investors see directly, such as Morningstar's fund sustainability ratings, redirect flows (Hartzmark &amp; Sussman, 2019), whereas we cannot observe whether investors in these markets see LSEG scores at all.</w:t>
-      </w:r>
-      <w:r>
-        <w:rPr/>
-        <w:t xml:space="preserve"> </w:t>
-      </w:r>
-      <w:r>
-        <w:rPr>
-          <w:color w:val="0000FF"/>
-        </w:rPr>
-        <w:t>Because providers disagree about the same firm and the disagreement is priced (Avramov et al., 2022; Christensen et al., 2022; Gibson Brandon et al., 2021), entry into one provider's coverage need not change how investors who rely on other ratings value a firm.</w:t>
-      </w:r>
-      <w:r>
-        <w:rPr/>
-        <w:t xml:space="preserve"> </w:t>
-      </w:r>
-      <w:r>
-        <w:rPr>
-          <w:color w:val="0000FF"/>
-        </w:rPr>
-        <w:t>Unlike U.S. evidence that coverage changes firm conduct and payout (Bikmetova &amp; Pirinsky, 2026; Tsang et al., 2024, 2025), we find no stable change in leverage or total assets.</w:t>
-      </w:r>
-      <w:r>
-        <w:rPr/>
-        <w:t xml:space="preserve"> </w:t>
-      </w:r>
-      <w:r>
-        <w:rPr>
-          <w:color w:val="0000FF"/>
-        </w:rPr>
-        <w:t>The run-up also fits evidence that realized green returns reflect unexpected shifts in ESG demand (Pástor et al., 2022), but without ownership data we cannot tell whether ESG investors bought these firms before or after coverage.</w:t>
-      </w:r>
-      <w:r>
-        <w:rPr/>
-        <w:t xml:space="preserve"> </w:t>
-      </w:r>
-      <w:r>
-        <w:rPr>
-          <w:color w:val="0000FF"/>
-        </w:rPr>
-        <w:t>Ownership shapes corporate social responsibility performance in the region (Nguyen, 2025), and Thai institutional, foreign, and retail investors adjust their trading on different horizons (Sudsawasd &amp; Sakdapat, 2026), so trading and ownership data by investor group are the natural next step.</w:t>
-      </w:r>
-    </w:p>
-    <w:p>
-      <w:pPr>
-        <w:pStyle w:val="Heading2"/>
-        <w:keepNext/>
-        <w:spacing w:line="360" w:lineRule="auto" w:after="120" w:before="160"/>
-      </w:pPr>
-      <w:r>
-        <w:rPr>
-          <w:rFonts w:ascii="Times New Roman" w:hAnsi="Times New Roman" w:eastAsia="Times New Roman"/>
-          <w:b/>
-          <w:i w:val="0"/>
-          <w:color w:val="0000FF"/>
-          <w:sz w:val="24"/>
-        </w:rPr>
-        <w:t>5.3 Implications and Limitations</w:t>
+        <w:t>MTB ratios are missing for 18.5% of never-scored and 9.0% of scored listed firm-years, Malaysian and Thai firms make up 84.3% of scored firms, the sample includes only firms that survived to 2024, and effects smaller than the MDE of 0.067 on log MTB would be detected with less than 80% probability.</w:t>
       </w:r>
     </w:p>
     <w:p>
@@ -15027,7 +14717,7 @@
         <w:rPr>
           <w:color w:val="0000FF"/>
         </w:rPr>
-        <w:t>For researchers, comparisons of scored and unscored firms, static TWFE estimates, and backtests built on the first recorded score can attribute selection to the score (Berg et al., 2020; Sahin et al., 2023); studies of ESG ratings in Southeast Asia should model when firms enter coverage, report pre-entry dynamics, and record the download date of their rating data.</w:t>
+        <w:t>In conclusion, entry into LSEG ESG coverage in five Southeast Asian markets was selective.</w:t>
       </w:r>
       <w:r>
         <w:rPr/>
@@ -15037,20 +14727,17 @@
         <w:rPr>
           <w:color w:val="0000FF"/>
         </w:rPr>
-        <w:t>For rating providers and data users, the scored universe in these markets tilts toward large firms and toward firms that had outgrown their peers, and publishing the date on which each firm's coverage began, with the vintages of revised scores, would separate what was known from what was filled in later.</w:t>
-      </w:r>
-    </w:p>
-    <w:p>
-      <w:pPr>
-        <w:spacing w:line="360" w:lineRule="auto" w:after="120" w:before="0"/>
-        <w:ind w:firstLine="720"/>
-        <w:jc w:val="both"/>
-      </w:pPr>
+        <w:t>Scored firms were larger than never-scored firms, and on average their market-to-book ratio had grown 10.0% more than that of similar firms from five years to one year before entry, most in the Thai and Singaporean wave of 2019 and 2020 and not detectably in the broad Malaysian wave of 2021 and 2022 (95% interval −7.4% to 15.2%).</w:t>
+      </w:r>
+      <w:r>
+        <w:rPr/>
+        <w:t xml:space="preserve"> </w:t>
+      </w:r>
       <w:r>
         <w:rPr>
           <w:color w:val="0000FF"/>
         </w:rPr>
-        <w:t>For investors, a portfolio screened on ESG scores in these markets holds firms that, on average, entered coverage after outgrowing their peers, so the screen tilts toward recent winners and away from smaller firms, and the date a firm became screenable is the publication date, which may follow the recorded year.</w:t>
+        <w:t>After entry, the valuation gap stopped widening, but whether coverage itself changed valuations cannot be settled: the answer moves from no detected change to a decline of 6.6% depending on when investors are assumed to have seen the score.</w:t>
       </w:r>
       <w:r>
         <w:rPr/>
@@ -15060,197 +14747,7 @@
         <w:rPr>
           <w:color w:val="0000FF"/>
         </w:rPr>
-        <w:t>For exchanges, regulators, and listed firms, broad expansions such as the Malaysian wave appear to select less on prior growth, and we detect no MTB gain within it, although its interval (−0.053 to 0.091) admits gains larger than the pooled upper bound.</w:t>
-      </w:r>
-      <w:r>
-        <w:rPr/>
-        <w:t xml:space="preserve"> </w:t>
-      </w:r>
-      <w:r>
-        <w:rPr>
-          <w:color w:val="0000FF"/>
-        </w:rPr>
-        <w:t>Our results do not show that expanding ESG coverage has no valuation benefit; they show that such a benefit cannot be established from these data, so arguments for expanding coverage should rest on grounds other than an expected rise in issuer valuations.</w:t>
-      </w:r>
-    </w:p>
-    <w:p>
-      <w:pPr>
-        <w:spacing w:line="360" w:lineRule="auto" w:after="120" w:before="0"/>
-        <w:ind w:firstLine="720"/>
-        <w:jc w:val="both"/>
-      </w:pPr>
-      <w:r>
-        <w:rPr/>
-        <w:t xml:space="preserve">The study has eight limitations. </w:t>
-      </w:r>
-      <w:r>
-        <w:rPr>
-          <w:color w:val="0000FF"/>
-        </w:rPr>
-        <w:t>First, the provider chooses when to cover a firm, and the post-coverage estimates rest on conditional parallel trends that the pre-coverage estimates question; our sensitivity analysis uses a linear trend and a simplified bound, not the confidence sets of Rambachan and Roth (2023).</w:t>
-      </w:r>
-      <w:r>
-        <w:rPr/>
-        <w:t xml:space="preserve"> </w:t>
-      </w:r>
-      <w:r>
-        <w:rPr>
-          <w:color w:val="0000FF"/>
-        </w:rPr>
-        <w:t>Second, we observe neither publication dates nor announcement returns.</w:t>
-      </w:r>
-      <w:r>
-        <w:rPr/>
-        <w:t xml:space="preserve"> </w:t>
-      </w:r>
-      <w:r>
-        <w:rPr>
-          <w:color w:val="0000FF"/>
-        </w:rPr>
-        <w:t>Third, we observe only LSEG coverage, so for firms with earlier FTSE Russell or other scores the event is an additional score.</w:t>
-      </w:r>
-      <w:r>
-        <w:rPr/>
-        <w:t xml:space="preserve"> </w:t>
-      </w:r>
-      <w:r>
-        <w:rPr>
-          <w:color w:val="0000FF"/>
-        </w:rPr>
-        <w:t>Fourth, the data contain no returns, ownership, or index membership.</w:t>
-      </w:r>
-      <w:r>
-        <w:rPr/>
-        <w:t xml:space="preserve"> </w:t>
-      </w:r>
-      <w:r>
-        <w:rPr>
-          <w:color w:val="0000FF"/>
-        </w:rPr>
-        <w:t>Fifth, MTB ratios are missing for 18.5% of never-scored and 9.0% of scored listed firm-years, more often for distressed and Indonesian firms, and some market capitalization records contain scale errors.</w:t>
-      </w:r>
-      <w:r>
-        <w:rPr/>
-        <w:t xml:space="preserve"> </w:t>
-      </w:r>
-      <w:r>
-        <w:rPr>
-          <w:color w:val="0000FF"/>
-        </w:rPr>
-        <w:t>Sixth, Malaysian and Thai firms make up 84.3% of scored firms.</w:t>
-      </w:r>
-      <w:r>
-        <w:rPr/>
-        <w:t xml:space="preserve"> </w:t>
-      </w:r>
-      <w:r>
-        <w:rPr>
-          <w:color w:val="0000FF"/>
-        </w:rPr>
-        <w:t>Seventh, the sample includes only firms that survived to 2024.</w:t>
-      </w:r>
-      <w:r>
-        <w:rPr/>
-        <w:t xml:space="preserve"> </w:t>
-      </w:r>
-      <w:r>
-        <w:rPr>
-          <w:color w:val="0000FF"/>
-        </w:rPr>
-        <w:t>Eighth, with an MDE of 0.067 on log MTB, smaller effects would be detected with less than 80% probability.</w:t>
-      </w:r>
-    </w:p>
-    <w:p>
-      <w:pPr>
-        <w:pStyle w:val="Heading2"/>
-        <w:keepNext/>
-        <w:spacing w:line="360" w:lineRule="auto" w:after="120" w:before="160"/>
-      </w:pPr>
-      <w:r>
-        <w:rPr>
-          <w:rFonts w:ascii="Times New Roman" w:hAnsi="Times New Roman" w:eastAsia="Times New Roman"/>
-          <w:b/>
-          <w:i w:val="0"/>
-          <w:color w:val="0000FF"/>
-          <w:sz w:val="24"/>
-        </w:rPr>
-        <w:t>5.4 Conclusion</w:t>
-      </w:r>
-    </w:p>
-    <w:p>
-      <w:pPr>
-        <w:spacing w:line="360" w:lineRule="auto" w:after="120" w:before="0"/>
-        <w:ind w:firstLine="720"/>
-        <w:jc w:val="both"/>
-      </w:pPr>
-      <w:r>
-        <w:rPr>
-          <w:color w:val="0000FF"/>
-        </w:rPr>
-        <w:t>Entry into LSEG ESG coverage in five Southeast Asian markets was selective.</w:t>
-      </w:r>
-      <w:r>
-        <w:rPr/>
-        <w:t xml:space="preserve"> </w:t>
-      </w:r>
-      <w:r>
-        <w:rPr>
-          <w:color w:val="0000FF"/>
-        </w:rPr>
-        <w:t>The firms that received a first recorded score were larger than never-scored firms, and on average their market-to-book ratio had grown 10.0% more than that of similar firms from five years to one year before entry.</w:t>
-      </w:r>
-      <w:r>
-        <w:rPr/>
-        <w:t xml:space="preserve"> </w:t>
-      </w:r>
-      <w:r>
-        <w:rPr>
-          <w:color w:val="0000FF"/>
-        </w:rPr>
-        <w:t>The run-up was largest in the Thai and Singaporean wave of 2019 and 2020, present in the remaining cohorts, and not detected in the broad Malaysian wave of 2021 and 2022 (95% interval −7.4% to 15.2%).</w:t>
-      </w:r>
-      <w:r>
-        <w:rPr/>
-        <w:t xml:space="preserve"> </w:t>
-      </w:r>
-      <w:r>
-        <w:rPr>
-          <w:color w:val="0000FF"/>
-        </w:rPr>
-        <w:t>After entry, the valuation gap stopped widening.</w:t>
-      </w:r>
-      <w:r>
-        <w:rPr/>
-        <w:t xml:space="preserve"> </w:t>
-      </w:r>
-      <w:r>
-        <w:rPr>
-          <w:color w:val="0000FF"/>
-        </w:rPr>
-        <w:t>Whether coverage itself changed valuations cannot be settled with these data: the answer moves from no detected change (95% interval −0.046 to 0.048 in log MTB) to a decline of 6.6% depending on when investors are assumed to have seen the score, the decline appears only where valuations had run up, and modest departures from parallel trends change either reading.</w:t>
-      </w:r>
-    </w:p>
-    <w:p>
-      <w:pPr>
-        <w:spacing w:line="360" w:lineRule="auto" w:after="120" w:before="0"/>
-        <w:ind w:firstLine="720"/>
-        <w:jc w:val="both"/>
-      </w:pPr>
-      <w:r>
-        <w:rPr>
-          <w:color w:val="0000FF"/>
-        </w:rPr>
-        <w:t>Research and investment screens that start from a provider's universe inherit the provider's selection.</w:t>
-      </w:r>
-      <w:r>
-        <w:rPr/>
-        <w:t xml:space="preserve"> </w:t>
-      </w:r>
-      <w:r>
-        <w:rPr>
-          <w:color w:val="0000FF"/>
-        </w:rPr>
-        <w:t>Point-in-time records of when each firm's score was first published, and ownership and trading data, would allow future work to test whether ESG coverage in Southeast Asian markets changes who holds a firm and at what price.</w:t>
+        <w:t>Research and investment screens that start from a provider's universe inherit the provider's selection, and point-in-time records of first publication, with ownership and trading data, would allow future work to test whether ESG coverage changes who holds a firm and at what price.</w:t>
       </w:r>
     </w:p>
     <w:p>

</xml_diff>